<commit_message>
Revise Lesson 3 per Helen's notes: mixed inversion+RC quiz (5), plain->formal conversion table, word->noun warm-up, sets 1-6 (4-6 harder), fake-news writing task
</commit_message>
<xml_diff>
--- a/Lesson 3 - Nominalisation (Student's).docx
+++ b/Lesson 3 - Nominalisation (Student's).docx
@@ -82,7 +82,7 @@
           <w:sz w:val="22"/>
           <w:szCs w:val="22"/>
         </w:rPr>
-        <w:t xml:space="preserve">Each sentence contains TWO errors. Proofread the sentences.</w:t>
+        <w:t xml:space="preserve">Each sentence contains TWO errors: one in an inversion structure and one in a relative clause. Proofread the sentences.</w:t>
       </w:r>
     </w:p>
     <w:tbl>
@@ -107,7 +107,7 @@
                 <w:sz w:val="22"/>
                 <w:szCs w:val="22"/>
               </w:rPr>
-              <w:t xml:space="preserve">The students which share their notes online usually performs well in group projects.</w:t>
+              <w:t xml:space="preserve">Not only social media connects people instantly, but it also spreads stories which is often false.</w:t>
             </w:r>
           </w:p>
         </w:tc>
@@ -125,7 +125,7 @@
                 <w:sz w:val="22"/>
                 <w:szCs w:val="22"/>
               </w:rPr>
-              <w:t xml:space="preserve">There are dozens of study apps, all of them is designed to keep users engaged.</w:t>
+              <w:t xml:space="preserve">Rarely teenagers check the sources of the news they read online, which make them easy to fool.</w:t>
             </w:r>
           </w:p>
         </w:tc>
@@ -143,7 +143,7 @@
                 <w:sz w:val="22"/>
                 <w:szCs w:val="22"/>
               </w:rPr>
-              <w:t xml:space="preserve">Many employees check work messages at night, that disturb their sleep.</w:t>
+              <w:t xml:space="preserve">Only by setting clear screen-time rules parents can help their children, who often spends hours gaming.</w:t>
             </w:r>
           </w:p>
         </w:tc>
@@ -161,7 +161,7 @@
                 <w:sz w:val="22"/>
                 <w:szCs w:val="22"/>
               </w:rPr>
-              <w:t xml:space="preserve">Not only video games provide entertainment, but they also helps players develop problem-solving skills.</w:t>
+              <w:t xml:space="preserve">Never the school has considered banning phones in class, which is used by nearly every student.</w:t>
             </w:r>
           </w:p>
         </w:tc>
@@ -179,25 +179,7 @@
                 <w:sz w:val="22"/>
                 <w:szCs w:val="22"/>
               </w:rPr>
-              <w:t xml:space="preserve">Rarely teenagers question the accuracy of online news, which make them easy to fool.</w:t>
-            </w:r>
-          </w:p>
-        </w:tc>
-      </w:tr>
-      <w:tr>
-        <w:tc>
-          <w:tcPr>
-            <w:tcW w:w="9350" w:type="dxa"/>
-          </w:tcPr>
-          <w:p>
-            <w:pPr/>
-            <w:r>
-              <w:rPr>
-                <w:rFonts w:ascii="Times New Roman" w:hAnsi="Times New Roman" w:cs="Times New Roman"/>
-                <w:sz w:val="22"/>
-                <w:szCs w:val="22"/>
-              </w:rPr>
-              <w:t xml:space="preserve">The increasing of online scams have made people more cautious about sharing their data.</w:t>
+              <w:t xml:space="preserve">Seldom students will question the news which they read it on social media.</w:t>
             </w:r>
           </w:p>
         </w:tc>
@@ -213,7 +195,7 @@
           <w:rFonts w:ascii="Times New Roman" w:hAnsi="Times New Roman" w:cs="Times New Roman"/>
           <w:b/>
         </w:rPr>
-        <w:t xml:space="preserve">Part 2: Three patterns for formal writing</w:t>
+        <w:t xml:space="preserve">Part 2: Nominalisation in formal writing</w:t>
       </w:r>
     </w:p>
     <w:p>
@@ -226,22 +208,20 @@
           <w:sz w:val="22"/>
           <w:szCs w:val="22"/>
         </w:rPr>
-        <w:t xml:space="preserve">The three patterns in this part all turn actions or qualities into noun phrases — a technique called nominalisation. Nominalisation packs ideas into fewer words, and it can lift a formal paragraph towards a higher band.</w:t>
+        <w:t xml:space="preserve">Nominalisation names an action or a quality as a noun, so that ‘people use phones’ becomes ‘the use of phones’. Naming ideas in this way packs a sentence into fewer words and gives formal writing a more academic tone. It is one of the clearest signs of a higher band in DSE Paper 2.</w:t>
       </w:r>
     </w:p>
     <w:p>
       <w:pPr>
-        <w:pStyle w:val="31"/>
         <w:spacing w:line="360" w:lineRule="auto"/>
       </w:pPr>
       <w:r>
         <w:rPr>
           <w:rFonts w:ascii="Times New Roman" w:hAnsi="Times New Roman" w:cs="Times New Roman"/>
-          <w:b/>
           <w:sz w:val="22"/>
           <w:szCs w:val="22"/>
         </w:rPr>
-        <w:t xml:space="preserve">Pattern 1: Turn verbs into nouns</w:t>
+        <w:t xml:space="preserve">Study how each plain sentence is converted. The new version names the action or quality as a noun and sounds more mature, yet the meaning stays the same.</w:t>
       </w:r>
     </w:p>
     <w:tbl>
@@ -265,10 +245,11 @@
             <w:r>
               <w:rPr>
                 <w:rFonts w:ascii="Times New Roman" w:hAnsi="Times New Roman" w:cs="Times New Roman"/>
+                <w:b/>
                 <w:sz w:val="22"/>
                 <w:szCs w:val="22"/>
               </w:rPr>
-              <w:t xml:space="preserve">Structure:</w:t>
+              <w:t xml:space="preserve">Plain</w:t>
             </w:r>
           </w:p>
         </w:tc>
@@ -282,10 +263,11 @@
             <w:r>
               <w:rPr>
                 <w:rFonts w:ascii="Times New Roman" w:hAnsi="Times New Roman" w:cs="Times New Roman"/>
+                <w:b/>
                 <w:sz w:val="22"/>
                 <w:szCs w:val="22"/>
               </w:rPr>
-              <w:t xml:space="preserve">verb → noun: use → the use of ...; decide → the decision to ...; improve → the improvement of ...</w:t>
+              <w:t xml:space="preserve">More formal</w:t>
             </w:r>
           </w:p>
         </w:tc>
@@ -304,7 +286,7 @@
                 <w:sz w:val="22"/>
                 <w:szCs w:val="22"/>
               </w:rPr>
-              <w:t xml:space="preserve">Use in formal writing:</w:t>
+              <w:t xml:space="preserve">People use their phones all day long.</w:t>
             </w:r>
           </w:p>
         </w:tc>
@@ -321,7 +303,7 @@
                 <w:sz w:val="22"/>
                 <w:szCs w:val="22"/>
               </w:rPr>
-              <w:t xml:space="preserve">Compresses an action into a noun phrase, so one clause does the work of two. Ideal for opening sentences in proposals and reports.</w:t>
+              <w:t xml:space="preserve">The widespread use of smartphones worries teachers and parents.</w:t>
             </w:r>
           </w:p>
         </w:tc>
@@ -340,7 +322,7 @@
                 <w:sz w:val="22"/>
                 <w:szCs w:val="22"/>
               </w:rPr>
-              <w:t xml:space="preserve">Example:</w:t>
+              <w:t xml:space="preserve">The company will improve its online security system.</w:t>
             </w:r>
           </w:p>
         </w:tc>
@@ -357,12 +339,254 @@
                 <w:sz w:val="22"/>
                 <w:szCs w:val="22"/>
               </w:rPr>
-              <w:t xml:space="preserve">The school’s decision to introduce e-textbooks has won widespread support.</w:t>
+              <w:t xml:space="preserve">The improvement of the company’s online security system will begin next month.</w:t>
+            </w:r>
+          </w:p>
+        </w:tc>
+      </w:tr>
+      <w:tr>
+        <w:tc>
+          <w:tcPr>
+            <w:tcW w:w="4675" w:type="dxa"/>
+            <w:shd w:val="clear" w:color="auto" w:fill="DEEBF7"/>
+          </w:tcPr>
+          <w:p>
+            <w:pPr/>
+            <w:r>
+              <w:rPr>
+                <w:rFonts w:ascii="Times New Roman" w:hAnsi="Times New Roman" w:cs="Times New Roman"/>
+                <w:sz w:val="22"/>
+                <w:szCs w:val="22"/>
+              </w:rPr>
+              <w:t xml:space="preserve">Young people depend on their phones too much.</w:t>
+            </w:r>
+          </w:p>
+        </w:tc>
+        <w:tc>
+          <w:tcPr>
+            <w:tcW w:w="4675" w:type="dxa"/>
+            <w:shd w:val="clear" w:color="auto" w:fill="DEEBF7"/>
+          </w:tcPr>
+          <w:p>
+            <w:pPr/>
+            <w:r>
+              <w:rPr>
+                <w:rFonts w:ascii="Times New Roman" w:hAnsi="Times New Roman" w:cs="Times New Roman"/>
+                <w:sz w:val="22"/>
+                <w:szCs w:val="22"/>
+              </w:rPr>
+              <w:t xml:space="preserve">Young people’s heavy dependence on their phones shows no sign of weakening.</w:t>
+            </w:r>
+          </w:p>
+        </w:tc>
+      </w:tr>
+      <w:tr>
+        <w:tc>
+          <w:tcPr>
+            <w:tcW w:w="4675" w:type="dxa"/>
+            <w:shd w:val="clear" w:color="auto" w:fill="DEEBF7"/>
+          </w:tcPr>
+          <w:p>
+            <w:pPr/>
+            <w:r>
+              <w:rPr>
+                <w:rFonts w:ascii="Times New Roman" w:hAnsi="Times New Roman" w:cs="Times New Roman"/>
+                <w:sz w:val="22"/>
+                <w:szCs w:val="22"/>
+              </w:rPr>
+              <w:t xml:space="preserve">Students should be aware of online privacy.</w:t>
+            </w:r>
+          </w:p>
+        </w:tc>
+        <w:tc>
+          <w:tcPr>
+            <w:tcW w:w="4675" w:type="dxa"/>
+            <w:shd w:val="clear" w:color="auto" w:fill="DEEBF7"/>
+          </w:tcPr>
+          <w:p>
+            <w:pPr/>
+            <w:r>
+              <w:rPr>
+                <w:rFonts w:ascii="Times New Roman" w:hAnsi="Times New Roman" w:cs="Times New Roman"/>
+                <w:sz w:val="22"/>
+                <w:szCs w:val="22"/>
+              </w:rPr>
+              <w:t xml:space="preserve">Awareness of online privacy is now taught in many schools.</w:t>
+            </w:r>
+          </w:p>
+        </w:tc>
+      </w:tr>
+      <w:tr>
+        <w:tc>
+          <w:tcPr>
+            <w:tcW w:w="4675" w:type="dxa"/>
+            <w:shd w:val="clear" w:color="auto" w:fill="DEEBF7"/>
+          </w:tcPr>
+          <w:p>
+            <w:pPr/>
+            <w:r>
+              <w:rPr>
+                <w:rFonts w:ascii="Times New Roman" w:hAnsi="Times New Roman" w:cs="Times New Roman"/>
+                <w:sz w:val="22"/>
+                <w:szCs w:val="22"/>
+              </w:rPr>
+              <w:t xml:space="preserve">The government decided to control social media companies more strictly.</w:t>
+            </w:r>
+          </w:p>
+        </w:tc>
+        <w:tc>
+          <w:tcPr>
+            <w:tcW w:w="4675" w:type="dxa"/>
+            <w:shd w:val="clear" w:color="auto" w:fill="DEEBF7"/>
+          </w:tcPr>
+          <w:p>
+            <w:pPr/>
+            <w:r>
+              <w:rPr>
+                <w:rFonts w:ascii="Times New Roman" w:hAnsi="Times New Roman" w:cs="Times New Roman"/>
+                <w:sz w:val="22"/>
+                <w:szCs w:val="22"/>
+              </w:rPr>
+              <w:t xml:space="preserve">The government’s decision to regulate social media companies has won public support.</w:t>
+            </w:r>
+          </w:p>
+        </w:tc>
+      </w:tr>
+      <w:tr>
+        <w:tc>
+          <w:tcPr>
+            <w:tcW w:w="4675" w:type="dxa"/>
+            <w:shd w:val="clear" w:color="auto" w:fill="DEEBF7"/>
+          </w:tcPr>
+          <w:p>
+            <w:pPr/>
+            <w:r>
+              <w:rPr>
+                <w:rFonts w:ascii="Times New Roman" w:hAnsi="Times New Roman" w:cs="Times New Roman"/>
+                <w:sz w:val="22"/>
+                <w:szCs w:val="22"/>
+              </w:rPr>
+              <w:t xml:space="preserve">Tech companies should be responsible for users’ data.</w:t>
+            </w:r>
+          </w:p>
+        </w:tc>
+        <w:tc>
+          <w:tcPr>
+            <w:tcW w:w="4675" w:type="dxa"/>
+            <w:shd w:val="clear" w:color="auto" w:fill="DEEBF7"/>
+          </w:tcPr>
+          <w:p>
+            <w:pPr/>
+            <w:r>
+              <w:rPr>
+                <w:rFonts w:ascii="Times New Roman" w:hAnsi="Times New Roman" w:cs="Times New Roman"/>
+                <w:sz w:val="22"/>
+                <w:szCs w:val="22"/>
+              </w:rPr>
+              <w:t xml:space="preserve">Tech companies must accept responsibility for users’ data.</w:t>
+            </w:r>
+          </w:p>
+        </w:tc>
+      </w:tr>
+      <w:tr>
+        <w:tc>
+          <w:tcPr>
+            <w:tcW w:w="4675" w:type="dxa"/>
+            <w:shd w:val="clear" w:color="auto" w:fill="DEEBF7"/>
+          </w:tcPr>
+          <w:p>
+            <w:pPr/>
+            <w:r>
+              <w:rPr>
+                <w:rFonts w:ascii="Times New Roman" w:hAnsi="Times New Roman" w:cs="Times New Roman"/>
+                <w:sz w:val="22"/>
+                <w:szCs w:val="22"/>
+              </w:rPr>
+              <w:t xml:space="preserve">Because people share news very quickly, rumours spread fast.</w:t>
+            </w:r>
+          </w:p>
+        </w:tc>
+        <w:tc>
+          <w:tcPr>
+            <w:tcW w:w="4675" w:type="dxa"/>
+            <w:shd w:val="clear" w:color="auto" w:fill="DEEBF7"/>
+          </w:tcPr>
+          <w:p>
+            <w:pPr/>
+            <w:r>
+              <w:rPr>
+                <w:rFonts w:ascii="Times New Roman" w:hAnsi="Times New Roman" w:cs="Times New Roman"/>
+                <w:sz w:val="22"/>
+                <w:szCs w:val="22"/>
+              </w:rPr>
+              <w:t xml:space="preserve">The rapid sharing of news allows rumours to spread quickly.</w:t>
+            </w:r>
+          </w:p>
+        </w:tc>
+      </w:tr>
+      <w:tr>
+        <w:tc>
+          <w:tcPr>
+            <w:tcW w:w="4675" w:type="dxa"/>
+            <w:shd w:val="clear" w:color="auto" w:fill="DEEBF7"/>
+          </w:tcPr>
+          <w:p>
+            <w:pPr/>
+            <w:r>
+              <w:rPr>
+                <w:rFonts w:ascii="Times New Roman" w:hAnsi="Times New Roman" w:cs="Times New Roman"/>
+                <w:sz w:val="22"/>
+                <w:szCs w:val="22"/>
+              </w:rPr>
+              <w:t xml:space="preserve">Many people prefer reading news on social media to reading newspapers.</w:t>
+            </w:r>
+          </w:p>
+        </w:tc>
+        <w:tc>
+          <w:tcPr>
+            <w:tcW w:w="4675" w:type="dxa"/>
+            <w:shd w:val="clear" w:color="auto" w:fill="DEEBF7"/>
+          </w:tcPr>
+          <w:p>
+            <w:pPr/>
+            <w:r>
+              <w:rPr>
+                <w:rFonts w:ascii="Times New Roman" w:hAnsi="Times New Roman" w:cs="Times New Roman"/>
+                <w:sz w:val="22"/>
+                <w:szCs w:val="22"/>
+              </w:rPr>
+              <w:t xml:space="preserve">Young people’s preference for social media news over newspapers has reshaped the whole news industry.</w:t>
             </w:r>
           </w:p>
         </w:tc>
       </w:tr>
     </w:tbl>
+    <w:p>
+      <w:pPr>
+        <w:spacing w:line="360" w:lineRule="auto"/>
+      </w:pPr>
+      <w:r>
+        <w:rPr>
+          <w:rFonts w:ascii="Times New Roman" w:hAnsi="Times New Roman" w:cs="Times New Roman"/>
+          <w:sz w:val="22"/>
+          <w:szCs w:val="22"/>
+        </w:rPr>
+        <w:t xml:space="preserve"/>
+      </w:r>
+    </w:p>
+    <w:p>
+      <w:pPr>
+        <w:spacing w:line="360" w:lineRule="auto"/>
+      </w:pPr>
+      <w:r>
+        <w:rPr>
+          <w:rFonts w:ascii="Times New Roman" w:hAnsi="Times New Roman" w:cs="Times New Roman"/>
+          <w:sz w:val="22"/>
+          <w:szCs w:val="22"/>
+        </w:rPr>
+        <w:t xml:space="preserve">The short paragraphs below use the same idea. Notice how the nominalised phrases fit naturally into the sentences — nothing is forced.</w:t>
+      </w:r>
+    </w:p>
     <w:p>
       <w:pPr>
         <w:spacing w:line="360" w:lineRule="auto"/>
@@ -384,140 +608,6 @@
     </w:p>
     <w:p>
       <w:pPr>
-        <w:pStyle w:val="31"/>
-        <w:spacing w:line="360" w:lineRule="auto"/>
-      </w:pPr>
-      <w:r>
-        <w:rPr>
-          <w:rFonts w:ascii="Times New Roman" w:hAnsi="Times New Roman" w:cs="Times New Roman"/>
-          <w:b/>
-          <w:sz w:val="22"/>
-          <w:szCs w:val="22"/>
-        </w:rPr>
-        <w:t xml:space="preserve">Pattern 2: Turn adjectives into nouns</w:t>
-      </w:r>
-    </w:p>
-    <w:tbl>
-      <w:tblPr>
-        <w:tblStyle w:val="aff2"/>
-        <w:tblW w:w="0" w:type="auto"/>
-        <w:tblLook w:val="04A0" w:firstRow="1" w:lastRow="0" w:firstColumn="1" w:lastColumn="0" w:noHBand="0" w:noVBand="1"/>
-      </w:tblPr>
-      <w:tblGrid>
-        <w:gridCol w:w="4675"/>
-        <w:gridCol w:w="4675"/>
-      </w:tblGrid>
-      <w:tr>
-        <w:tc>
-          <w:tcPr>
-            <w:tcW w:w="4675" w:type="dxa"/>
-            <w:shd w:val="clear" w:color="auto" w:fill="DEEBF7"/>
-          </w:tcPr>
-          <w:p>
-            <w:pPr/>
-            <w:r>
-              <w:rPr>
-                <w:rFonts w:ascii="Times New Roman" w:hAnsi="Times New Roman" w:cs="Times New Roman"/>
-                <w:sz w:val="22"/>
-                <w:szCs w:val="22"/>
-              </w:rPr>
-              <w:t xml:space="preserve">Structure:</w:t>
-            </w:r>
-          </w:p>
-        </w:tc>
-        <w:tc>
-          <w:tcPr>
-            <w:tcW w:w="4675" w:type="dxa"/>
-            <w:shd w:val="clear" w:color="auto" w:fill="DEEBF7"/>
-          </w:tcPr>
-          <w:p>
-            <w:pPr/>
-            <w:r>
-              <w:rPr>
-                <w:rFonts w:ascii="Times New Roman" w:hAnsi="Times New Roman" w:cs="Times New Roman"/>
-                <w:sz w:val="22"/>
-                <w:szCs w:val="22"/>
-              </w:rPr>
-              <w:t xml:space="preserve">adjective → noun: important → importance; aware → awareness; dependent → dependence; responsible → responsibility</w:t>
-            </w:r>
-          </w:p>
-        </w:tc>
-      </w:tr>
-      <w:tr>
-        <w:tc>
-          <w:tcPr>
-            <w:tcW w:w="4675" w:type="dxa"/>
-            <w:shd w:val="clear" w:color="auto" w:fill="DEEBF7"/>
-          </w:tcPr>
-          <w:p>
-            <w:pPr/>
-            <w:r>
-              <w:rPr>
-                <w:rFonts w:ascii="Times New Roman" w:hAnsi="Times New Roman" w:cs="Times New Roman"/>
-                <w:sz w:val="22"/>
-                <w:szCs w:val="22"/>
-              </w:rPr>
-              <w:t xml:space="preserve">Use in formal writing:</w:t>
-            </w:r>
-          </w:p>
-        </w:tc>
-        <w:tc>
-          <w:tcPr>
-            <w:tcW w:w="4675" w:type="dxa"/>
-            <w:shd w:val="clear" w:color="auto" w:fill="DEEBF7"/>
-          </w:tcPr>
-          <w:p>
-            <w:pPr/>
-            <w:r>
-              <w:rPr>
-                <w:rFonts w:ascii="Times New Roman" w:hAnsi="Times New Roman" w:cs="Times New Roman"/>
-                <w:sz w:val="22"/>
-                <w:szCs w:val="22"/>
-              </w:rPr>
-              <w:t xml:space="preserve">Turns a quality into something we can discuss and judge. Excellent for topic sentences in argumentative essays.</w:t>
-            </w:r>
-          </w:p>
-        </w:tc>
-      </w:tr>
-      <w:tr>
-        <w:tc>
-          <w:tcPr>
-            <w:tcW w:w="4675" w:type="dxa"/>
-            <w:shd w:val="clear" w:color="auto" w:fill="DEEBF7"/>
-          </w:tcPr>
-          <w:p>
-            <w:pPr/>
-            <w:r>
-              <w:rPr>
-                <w:rFonts w:ascii="Times New Roman" w:hAnsi="Times New Roman" w:cs="Times New Roman"/>
-                <w:sz w:val="22"/>
-                <w:szCs w:val="22"/>
-              </w:rPr>
-              <w:t xml:space="preserve">Example:</w:t>
-            </w:r>
-          </w:p>
-        </w:tc>
-        <w:tc>
-          <w:tcPr>
-            <w:tcW w:w="4675" w:type="dxa"/>
-            <w:shd w:val="clear" w:color="auto" w:fill="DEEBF7"/>
-          </w:tcPr>
-          <w:p>
-            <w:pPr/>
-            <w:r>
-              <w:rPr>
-                <w:rFonts w:ascii="Times New Roman" w:hAnsi="Times New Roman" w:cs="Times New Roman"/>
-                <w:sz w:val="22"/>
-                <w:szCs w:val="22"/>
-              </w:rPr>
-              <w:t xml:space="preserve">Young people’s heavy dependence on smartphones is a growing concern.</w:t>
-            </w:r>
-          </w:p>
-        </w:tc>
-      </w:tr>
-    </w:tbl>
-    <w:p>
-      <w:pPr>
         <w:spacing w:line="360" w:lineRule="auto"/>
         <w:pBdr>
           <w:top w:val="single" w:sz="4" w:space="4" w:color="auto"/>
@@ -537,140 +627,6 @@
     </w:p>
     <w:p>
       <w:pPr>
-        <w:pStyle w:val="31"/>
-        <w:spacing w:line="360" w:lineRule="auto"/>
-      </w:pPr>
-      <w:r>
-        <w:rPr>
-          <w:rFonts w:ascii="Times New Roman" w:hAnsi="Times New Roman" w:cs="Times New Roman"/>
-          <w:b/>
-          <w:sz w:val="22"/>
-          <w:szCs w:val="22"/>
-        </w:rPr>
-        <w:t xml:space="preserve">Pattern 3: Turn because / if clauses into noun phrases</w:t>
-      </w:r>
-    </w:p>
-    <w:tbl>
-      <w:tblPr>
-        <w:tblStyle w:val="aff2"/>
-        <w:tblW w:w="0" w:type="auto"/>
-        <w:tblLook w:val="04A0" w:firstRow="1" w:lastRow="0" w:firstColumn="1" w:lastColumn="0" w:noHBand="0" w:noVBand="1"/>
-      </w:tblPr>
-      <w:tblGrid>
-        <w:gridCol w:w="4675"/>
-        <w:gridCol w:w="4675"/>
-      </w:tblGrid>
-      <w:tr>
-        <w:tc>
-          <w:tcPr>
-            <w:tcW w:w="4675" w:type="dxa"/>
-            <w:shd w:val="clear" w:color="auto" w:fill="DEEBF7"/>
-          </w:tcPr>
-          <w:p>
-            <w:pPr/>
-            <w:r>
-              <w:rPr>
-                <w:rFonts w:ascii="Times New Roman" w:hAnsi="Times New Roman" w:cs="Times New Roman"/>
-                <w:sz w:val="22"/>
-                <w:szCs w:val="22"/>
-              </w:rPr>
-              <w:t xml:space="preserve">Structure:</w:t>
-            </w:r>
-          </w:p>
-        </w:tc>
-        <w:tc>
-          <w:tcPr>
-            <w:tcW w:w="4675" w:type="dxa"/>
-            <w:shd w:val="clear" w:color="auto" w:fill="DEEBF7"/>
-          </w:tcPr>
-          <w:p>
-            <w:pPr/>
-            <w:r>
-              <w:rPr>
-                <w:rFonts w:ascii="Times New Roman" w:hAnsi="Times New Roman" w:cs="Times New Roman"/>
-                <w:sz w:val="22"/>
-                <w:szCs w:val="22"/>
-              </w:rPr>
-              <w:t xml:space="preserve">because + a clause → owing to / because of + a noun phrase; if + a clause → without + a noun phrase</w:t>
-            </w:r>
-          </w:p>
-        </w:tc>
-      </w:tr>
-      <w:tr>
-        <w:tc>
-          <w:tcPr>
-            <w:tcW w:w="4675" w:type="dxa"/>
-            <w:shd w:val="clear" w:color="auto" w:fill="DEEBF7"/>
-          </w:tcPr>
-          <w:p>
-            <w:pPr/>
-            <w:r>
-              <w:rPr>
-                <w:rFonts w:ascii="Times New Roman" w:hAnsi="Times New Roman" w:cs="Times New Roman"/>
-                <w:sz w:val="22"/>
-                <w:szCs w:val="22"/>
-              </w:rPr>
-              <w:t xml:space="preserve">Use in formal writing:</w:t>
-            </w:r>
-          </w:p>
-        </w:tc>
-        <w:tc>
-          <w:tcPr>
-            <w:tcW w:w="4675" w:type="dxa"/>
-            <w:shd w:val="clear" w:color="auto" w:fill="DEEBF7"/>
-          </w:tcPr>
-          <w:p>
-            <w:pPr/>
-            <w:r>
-              <w:rPr>
-                <w:rFonts w:ascii="Times New Roman" w:hAnsi="Times New Roman" w:cs="Times New Roman"/>
-                <w:sz w:val="22"/>
-                <w:szCs w:val="22"/>
-              </w:rPr>
-              <w:t xml:space="preserve">Shortens explanations and states a cause or condition in one breath. Ideal for proposals and conclusions.</w:t>
-            </w:r>
-          </w:p>
-        </w:tc>
-      </w:tr>
-      <w:tr>
-        <w:tc>
-          <w:tcPr>
-            <w:tcW w:w="4675" w:type="dxa"/>
-            <w:shd w:val="clear" w:color="auto" w:fill="DEEBF7"/>
-          </w:tcPr>
-          <w:p>
-            <w:pPr/>
-            <w:r>
-              <w:rPr>
-                <w:rFonts w:ascii="Times New Roman" w:hAnsi="Times New Roman" w:cs="Times New Roman"/>
-                <w:sz w:val="22"/>
-                <w:szCs w:val="22"/>
-              </w:rPr>
-              <w:t xml:space="preserve">Example:</w:t>
-            </w:r>
-          </w:p>
-        </w:tc>
-        <w:tc>
-          <w:tcPr>
-            <w:tcW w:w="4675" w:type="dxa"/>
-            <w:shd w:val="clear" w:color="auto" w:fill="DEEBF7"/>
-          </w:tcPr>
-          <w:p>
-            <w:pPr/>
-            <w:r>
-              <w:rPr>
-                <w:rFonts w:ascii="Times New Roman" w:hAnsi="Times New Roman" w:cs="Times New Roman"/>
-                <w:sz w:val="22"/>
-                <w:szCs w:val="22"/>
-              </w:rPr>
-              <w:t xml:space="preserve">Owing to the widespread use of smartphones, many students struggle to concentrate for long periods.</w:t>
-            </w:r>
-          </w:p>
-        </w:tc>
-      </w:tr>
-    </w:tbl>
-    <w:p>
-      <w:pPr>
         <w:spacing w:line="360" w:lineRule="auto"/>
         <w:pBdr>
           <w:top w:val="single" w:sz="4" w:space="4" w:color="auto"/>
@@ -685,7 +641,20 @@
           <w:sz w:val="22"/>
           <w:szCs w:val="22"/>
         </w:rPr>
-        <w:t xml:space="preserve">Owing to the rise of artificial intelligence, teachers can no longer be sure that homework is entirely a student’s own work. The ease with which students can copy machine-written answers, together with the difficulty of detecting it, forces schools to rethink assessment entirely. The wisest response is not to ban the tools but to teach their responsible use.</w:t>
+        <w:t xml:space="preserve">Owing to the widespread use of smartphones, many students struggle to concentrate for long periods. Revision tasks that once took half an hour now stretch over a whole evening, interrupted by notifications arriving every few minutes. Setting clear screen-time limits at home would benefit both study and sleep.</w:t>
+      </w:r>
+    </w:p>
+    <w:p>
+      <w:pPr>
+        <w:spacing w:line="360" w:lineRule="auto"/>
+      </w:pPr>
+      <w:r>
+        <w:rPr>
+          <w:rFonts w:ascii="Times New Roman" w:hAnsi="Times New Roman" w:cs="Times New Roman"/>
+          <w:sz w:val="22"/>
+          <w:szCs w:val="22"/>
+        </w:rPr>
+        <w:t xml:space="preserve"/>
       </w:r>
     </w:p>
     <w:p>
@@ -711,9 +680,424 @@
           <w:sz w:val="22"/>
           <w:szCs w:val="22"/>
         </w:rPr>
-        <w:t xml:space="preserve">Rewrite each simple sentence using nominalisation. The sentences are all about technology and communication, so keep the register formal. The even-numbered sets (2, 4 and 6) are more challenging.</w:t>
+        <w:t xml:space="preserve">First, warm up by turning words into nouns. Then rewrite each simple sentence using nominalisation. The sentences are about technology and communication, so keep the register formal. The last three sets (4, 5 and 6) are more challenging.</w:t>
       </w:r>
     </w:p>
+    <w:p>
+      <w:pPr>
+        <w:pStyle w:val="31"/>
+        <w:spacing w:line="360" w:lineRule="auto"/>
+      </w:pPr>
+      <w:r>
+        <w:rPr>
+          <w:rFonts w:ascii="Times New Roman" w:hAnsi="Times New Roman" w:cs="Times New Roman"/>
+          <w:b/>
+          <w:sz w:val="22"/>
+          <w:szCs w:val="22"/>
+        </w:rPr>
+        <w:t xml:space="preserve">Warm-up: From words to nouns</w:t>
+      </w:r>
+    </w:p>
+    <w:p>
+      <w:pPr>
+        <w:spacing w:line="360" w:lineRule="auto"/>
+      </w:pPr>
+      <w:r>
+        <w:rPr>
+          <w:rFonts w:ascii="Times New Roman" w:hAnsi="Times New Roman" w:cs="Times New Roman"/>
+          <w:sz w:val="22"/>
+          <w:szCs w:val="22"/>
+        </w:rPr>
+        <w:t xml:space="preserve">Write the noun form of each word.</w:t>
+      </w:r>
+    </w:p>
+    <w:tbl>
+      <w:tblPr>
+        <w:tblStyle w:val="aff2"/>
+        <w:tblW w:w="0" w:type="auto"/>
+        <w:tblLook w:val="04A0" w:firstRow="1" w:lastRow="0" w:firstColumn="1" w:lastColumn="0" w:noHBand="0" w:noVBand="1"/>
+      </w:tblPr>
+      <w:tblGrid>
+        <w:gridCol w:w="2605"/>
+        <w:gridCol w:w="6745"/>
+      </w:tblGrid>
+      <w:tr>
+        <w:tc>
+          <w:tcPr>
+            <w:tcW w:w="2605" w:type="dxa"/>
+          </w:tcPr>
+          <w:p>
+            <w:pPr/>
+            <w:r>
+              <w:rPr>
+                <w:rFonts w:ascii="Times New Roman" w:hAnsi="Times New Roman" w:cs="Times New Roman"/>
+                <w:b/>
+                <w:sz w:val="22"/>
+                <w:szCs w:val="22"/>
+              </w:rPr>
+              <w:t xml:space="preserve">Word</w:t>
+            </w:r>
+          </w:p>
+        </w:tc>
+        <w:tc>
+          <w:tcPr>
+            <w:tcW w:w="6745" w:type="dxa"/>
+          </w:tcPr>
+          <w:p>
+            <w:pPr/>
+            <w:r>
+              <w:rPr>
+                <w:rFonts w:ascii="Times New Roman" w:hAnsi="Times New Roman" w:cs="Times New Roman"/>
+                <w:b/>
+                <w:sz w:val="22"/>
+                <w:szCs w:val="22"/>
+              </w:rPr>
+              <w:t xml:space="preserve">Noun</w:t>
+            </w:r>
+          </w:p>
+        </w:tc>
+      </w:tr>
+      <w:tr>
+        <w:tc>
+          <w:tcPr>
+            <w:tcW w:w="2605" w:type="dxa"/>
+          </w:tcPr>
+          <w:p>
+            <w:pPr/>
+            <w:r>
+              <w:rPr>
+                <w:rFonts w:ascii="Times New Roman" w:hAnsi="Times New Roman" w:cs="Times New Roman"/>
+                <w:sz w:val="22"/>
+                <w:szCs w:val="22"/>
+              </w:rPr>
+              <w:t xml:space="preserve">decide</w:t>
+            </w:r>
+          </w:p>
+        </w:tc>
+        <w:tc>
+          <w:tcPr>
+            <w:tcW w:w="6745" w:type="dxa"/>
+          </w:tcPr>
+          <w:p>
+            <w:pPr/>
+            <w:r>
+              <w:rPr>
+                <w:rFonts w:ascii="Times New Roman" w:hAnsi="Times New Roman" w:cs="Times New Roman"/>
+                <w:sz w:val="22"/>
+                <w:szCs w:val="22"/>
+              </w:rPr>
+              <w:t xml:space="preserve"/>
+            </w:r>
+          </w:p>
+        </w:tc>
+      </w:tr>
+      <w:tr>
+        <w:tc>
+          <w:tcPr>
+            <w:tcW w:w="2605" w:type="dxa"/>
+          </w:tcPr>
+          <w:p>
+            <w:pPr/>
+            <w:r>
+              <w:rPr>
+                <w:rFonts w:ascii="Times New Roman" w:hAnsi="Times New Roman" w:cs="Times New Roman"/>
+                <w:sz w:val="22"/>
+                <w:szCs w:val="22"/>
+              </w:rPr>
+              <w:t xml:space="preserve">introduce</w:t>
+            </w:r>
+          </w:p>
+        </w:tc>
+        <w:tc>
+          <w:tcPr>
+            <w:tcW w:w="6745" w:type="dxa"/>
+          </w:tcPr>
+          <w:p>
+            <w:pPr/>
+            <w:r>
+              <w:rPr>
+                <w:rFonts w:ascii="Times New Roman" w:hAnsi="Times New Roman" w:cs="Times New Roman"/>
+                <w:sz w:val="22"/>
+                <w:szCs w:val="22"/>
+              </w:rPr>
+              <w:t xml:space="preserve"/>
+            </w:r>
+          </w:p>
+        </w:tc>
+      </w:tr>
+      <w:tr>
+        <w:tc>
+          <w:tcPr>
+            <w:tcW w:w="2605" w:type="dxa"/>
+          </w:tcPr>
+          <w:p>
+            <w:pPr/>
+            <w:r>
+              <w:rPr>
+                <w:rFonts w:ascii="Times New Roman" w:hAnsi="Times New Roman" w:cs="Times New Roman"/>
+                <w:sz w:val="22"/>
+                <w:szCs w:val="22"/>
+              </w:rPr>
+              <w:t xml:space="preserve">communicate</w:t>
+            </w:r>
+          </w:p>
+        </w:tc>
+        <w:tc>
+          <w:tcPr>
+            <w:tcW w:w="6745" w:type="dxa"/>
+          </w:tcPr>
+          <w:p>
+            <w:pPr/>
+            <w:r>
+              <w:rPr>
+                <w:rFonts w:ascii="Times New Roman" w:hAnsi="Times New Roman" w:cs="Times New Roman"/>
+                <w:sz w:val="22"/>
+                <w:szCs w:val="22"/>
+              </w:rPr>
+              <w:t xml:space="preserve"/>
+            </w:r>
+          </w:p>
+        </w:tc>
+      </w:tr>
+      <w:tr>
+        <w:tc>
+          <w:tcPr>
+            <w:tcW w:w="2605" w:type="dxa"/>
+          </w:tcPr>
+          <w:p>
+            <w:pPr/>
+            <w:r>
+              <w:rPr>
+                <w:rFonts w:ascii="Times New Roman" w:hAnsi="Times New Roman" w:cs="Times New Roman"/>
+                <w:sz w:val="22"/>
+                <w:szCs w:val="22"/>
+              </w:rPr>
+              <w:t xml:space="preserve">regulate</w:t>
+            </w:r>
+          </w:p>
+        </w:tc>
+        <w:tc>
+          <w:tcPr>
+            <w:tcW w:w="6745" w:type="dxa"/>
+          </w:tcPr>
+          <w:p>
+            <w:pPr/>
+            <w:r>
+              <w:rPr>
+                <w:rFonts w:ascii="Times New Roman" w:hAnsi="Times New Roman" w:cs="Times New Roman"/>
+                <w:sz w:val="22"/>
+                <w:szCs w:val="22"/>
+              </w:rPr>
+              <w:t xml:space="preserve"/>
+            </w:r>
+          </w:p>
+        </w:tc>
+      </w:tr>
+      <w:tr>
+        <w:tc>
+          <w:tcPr>
+            <w:tcW w:w="2605" w:type="dxa"/>
+          </w:tcPr>
+          <w:p>
+            <w:pPr/>
+            <w:r>
+              <w:rPr>
+                <w:rFonts w:ascii="Times New Roman" w:hAnsi="Times New Roman" w:cs="Times New Roman"/>
+                <w:sz w:val="22"/>
+                <w:szCs w:val="22"/>
+              </w:rPr>
+              <w:t xml:space="preserve">improve</w:t>
+            </w:r>
+          </w:p>
+        </w:tc>
+        <w:tc>
+          <w:tcPr>
+            <w:tcW w:w="6745" w:type="dxa"/>
+          </w:tcPr>
+          <w:p>
+            <w:pPr/>
+            <w:r>
+              <w:rPr>
+                <w:rFonts w:ascii="Times New Roman" w:hAnsi="Times New Roman" w:cs="Times New Roman"/>
+                <w:sz w:val="22"/>
+                <w:szCs w:val="22"/>
+              </w:rPr>
+              <w:t xml:space="preserve"/>
+            </w:r>
+          </w:p>
+        </w:tc>
+      </w:tr>
+      <w:tr>
+        <w:tc>
+          <w:tcPr>
+            <w:tcW w:w="2605" w:type="dxa"/>
+          </w:tcPr>
+          <w:p>
+            <w:pPr/>
+            <w:r>
+              <w:rPr>
+                <w:rFonts w:ascii="Times New Roman" w:hAnsi="Times New Roman" w:cs="Times New Roman"/>
+                <w:sz w:val="22"/>
+                <w:szCs w:val="22"/>
+              </w:rPr>
+              <w:t xml:space="preserve">develop</w:t>
+            </w:r>
+          </w:p>
+        </w:tc>
+        <w:tc>
+          <w:tcPr>
+            <w:tcW w:w="6745" w:type="dxa"/>
+          </w:tcPr>
+          <w:p>
+            <w:pPr/>
+            <w:r>
+              <w:rPr>
+                <w:rFonts w:ascii="Times New Roman" w:hAnsi="Times New Roman" w:cs="Times New Roman"/>
+                <w:sz w:val="22"/>
+                <w:szCs w:val="22"/>
+              </w:rPr>
+              <w:t xml:space="preserve"/>
+            </w:r>
+          </w:p>
+        </w:tc>
+      </w:tr>
+      <w:tr>
+        <w:tc>
+          <w:tcPr>
+            <w:tcW w:w="2605" w:type="dxa"/>
+          </w:tcPr>
+          <w:p>
+            <w:pPr/>
+            <w:r>
+              <w:rPr>
+                <w:rFonts w:ascii="Times New Roman" w:hAnsi="Times New Roman" w:cs="Times New Roman"/>
+                <w:sz w:val="22"/>
+                <w:szCs w:val="22"/>
+              </w:rPr>
+              <w:t xml:space="preserve">aware</w:t>
+            </w:r>
+          </w:p>
+        </w:tc>
+        <w:tc>
+          <w:tcPr>
+            <w:tcW w:w="6745" w:type="dxa"/>
+          </w:tcPr>
+          <w:p>
+            <w:pPr/>
+            <w:r>
+              <w:rPr>
+                <w:rFonts w:ascii="Times New Roman" w:hAnsi="Times New Roman" w:cs="Times New Roman"/>
+                <w:sz w:val="22"/>
+                <w:szCs w:val="22"/>
+              </w:rPr>
+              <w:t xml:space="preserve"/>
+            </w:r>
+          </w:p>
+        </w:tc>
+      </w:tr>
+      <w:tr>
+        <w:tc>
+          <w:tcPr>
+            <w:tcW w:w="2605" w:type="dxa"/>
+          </w:tcPr>
+          <w:p>
+            <w:pPr/>
+            <w:r>
+              <w:rPr>
+                <w:rFonts w:ascii="Times New Roman" w:hAnsi="Times New Roman" w:cs="Times New Roman"/>
+                <w:sz w:val="22"/>
+                <w:szCs w:val="22"/>
+              </w:rPr>
+              <w:t xml:space="preserve">important</w:t>
+            </w:r>
+          </w:p>
+        </w:tc>
+        <w:tc>
+          <w:tcPr>
+            <w:tcW w:w="6745" w:type="dxa"/>
+          </w:tcPr>
+          <w:p>
+            <w:pPr/>
+            <w:r>
+              <w:rPr>
+                <w:rFonts w:ascii="Times New Roman" w:hAnsi="Times New Roman" w:cs="Times New Roman"/>
+                <w:sz w:val="22"/>
+                <w:szCs w:val="22"/>
+              </w:rPr>
+              <w:t xml:space="preserve"/>
+            </w:r>
+          </w:p>
+        </w:tc>
+      </w:tr>
+      <w:tr>
+        <w:tc>
+          <w:tcPr>
+            <w:tcW w:w="2605" w:type="dxa"/>
+          </w:tcPr>
+          <w:p>
+            <w:pPr/>
+            <w:r>
+              <w:rPr>
+                <w:rFonts w:ascii="Times New Roman" w:hAnsi="Times New Roman" w:cs="Times New Roman"/>
+                <w:sz w:val="22"/>
+                <w:szCs w:val="22"/>
+              </w:rPr>
+              <w:t xml:space="preserve">depend</w:t>
+            </w:r>
+          </w:p>
+        </w:tc>
+        <w:tc>
+          <w:tcPr>
+            <w:tcW w:w="6745" w:type="dxa"/>
+          </w:tcPr>
+          <w:p>
+            <w:pPr/>
+            <w:r>
+              <w:rPr>
+                <w:rFonts w:ascii="Times New Roman" w:hAnsi="Times New Roman" w:cs="Times New Roman"/>
+                <w:sz w:val="22"/>
+                <w:szCs w:val="22"/>
+              </w:rPr>
+              <w:t xml:space="preserve"/>
+            </w:r>
+          </w:p>
+        </w:tc>
+      </w:tr>
+      <w:tr>
+        <w:tc>
+          <w:tcPr>
+            <w:tcW w:w="2605" w:type="dxa"/>
+          </w:tcPr>
+          <w:p>
+            <w:pPr/>
+            <w:r>
+              <w:rPr>
+                <w:rFonts w:ascii="Times New Roman" w:hAnsi="Times New Roman" w:cs="Times New Roman"/>
+                <w:sz w:val="22"/>
+                <w:szCs w:val="22"/>
+              </w:rPr>
+              <w:t xml:space="preserve">responsible</w:t>
+            </w:r>
+          </w:p>
+        </w:tc>
+        <w:tc>
+          <w:tcPr>
+            <w:tcW w:w="6745" w:type="dxa"/>
+          </w:tcPr>
+          <w:p>
+            <w:pPr/>
+            <w:r>
+              <w:rPr>
+                <w:rFonts w:ascii="Times New Roman" w:hAnsi="Times New Roman" w:cs="Times New Roman"/>
+                <w:sz w:val="22"/>
+                <w:szCs w:val="22"/>
+              </w:rPr>
+              <w:t xml:space="preserve"/>
+            </w:r>
+          </w:p>
+        </w:tc>
+      </w:tr>
+    </w:tbl>
     <w:p>
       <w:pPr>
         <w:pStyle w:val="31"/>
@@ -768,7 +1152,7 @@
                 <w:sz w:val="22"/>
                 <w:szCs w:val="22"/>
               </w:rPr>
-              <w:t xml:space="preserve">People use social media so often that it weakens their face-to-face communication.</w:t>
+              <w:t xml:space="preserve">People use social media all the time, so they cannot concentrate on their studies.</w:t>
             </w:r>
           </w:p>
         </w:tc>
@@ -803,7 +1187,7 @@
                 <w:sz w:val="22"/>
                 <w:szCs w:val="22"/>
               </w:rPr>
-              <w:t xml:space="preserve">Turn ‘use’ into a noun and begin with ‘The frequent use of ...’.</w:t>
+              <w:t xml:space="preserve">Turn the verb ‘use’ into a noun and begin with ‘The constant use of ...’.</w:t>
             </w:r>
           </w:p>
         </w:tc>
@@ -897,7 +1281,7 @@
                 <w:sz w:val="22"/>
                 <w:szCs w:val="22"/>
               </w:rPr>
-              <w:t xml:space="preserve">The government will improve the security of online banking, which will protect customers.</w:t>
+              <w:t xml:space="preserve">The school decided to introduce a new e-learning platform, and many students welcomed the idea.</w:t>
             </w:r>
           </w:p>
         </w:tc>
@@ -932,7 +1316,7 @@
                 <w:sz w:val="22"/>
                 <w:szCs w:val="22"/>
               </w:rPr>
-              <w:t xml:space="preserve">Turn ‘will improve’ into a noun and begin with ‘The improvement of ...’.</w:t>
+              <w:t xml:space="preserve">Turn ‘decided to introduce’ into a noun phrase that opens the sentence.</w:t>
             </w:r>
           </w:p>
         </w:tc>
@@ -1026,7 +1410,7 @@
                 <w:sz w:val="22"/>
                 <w:szCs w:val="22"/>
               </w:rPr>
-              <w:t xml:space="preserve">Many parents worry about how dependent young people are on their smartphones.</w:t>
+              <w:t xml:space="preserve">Parents worry that young people are too dependent on their smartphones.</w:t>
             </w:r>
           </w:p>
         </w:tc>
@@ -1061,7 +1445,7 @@
                 <w:sz w:val="22"/>
                 <w:szCs w:val="22"/>
               </w:rPr>
-              <w:t xml:space="preserve">Turn ‘dependent’ into a noun: rewrite ‘how dependent young people are’ as ‘young people’s strong dependence ...’.</w:t>
+              <w:t xml:space="preserve">Turn ‘dependent’ into a noun: begin with ‘Many parents worry about young people’s ...’.</w:t>
             </w:r>
           </w:p>
         </w:tc>
@@ -1155,7 +1539,7 @@
                 <w:sz w:val="22"/>
                 <w:szCs w:val="22"/>
               </w:rPr>
-              <w:t xml:space="preserve">Students are more aware of online privacy than they used to be.</w:t>
+              <w:t xml:space="preserve">Students are much more aware of online privacy than they were ten years ago.</w:t>
             </w:r>
           </w:p>
         </w:tc>
@@ -1284,7 +1668,7 @@
                 <w:sz w:val="22"/>
                 <w:szCs w:val="22"/>
               </w:rPr>
-              <w:t xml:space="preserve">Because technology develops quickly, schools must update their resources regularly.</w:t>
+              <w:t xml:space="preserve">Because technology is developing very quickly, schools have to keep updating their computers and software.</w:t>
             </w:r>
           </w:p>
         </w:tc>
@@ -1319,7 +1703,7 @@
                 <w:sz w:val="22"/>
                 <w:szCs w:val="22"/>
               </w:rPr>
-              <w:t xml:space="preserve">Replace the ‘because’ clause with a phrase beginning ‘Owing to the rapid development of ...’.</w:t>
+              <w:t xml:space="preserve">Replace the whole ‘Because ...’ clause with a phrase beginning ‘Owing to the rapid ...’.</w:t>
             </w:r>
           </w:p>
         </w:tc>
@@ -1413,7 +1797,7 @@
                 <w:sz w:val="22"/>
                 <w:szCs w:val="22"/>
               </w:rPr>
-              <w:t xml:space="preserve">If the government does not regulate social media companies, online scams will continue to grow.</w:t>
+              <w:t xml:space="preserve">If the government does not control social media companies more strictly, online scams will just keep growing.</w:t>
             </w:r>
           </w:p>
         </w:tc>
@@ -1448,7 +1832,7 @@
                 <w:sz w:val="22"/>
                 <w:szCs w:val="22"/>
               </w:rPr>
-              <w:t xml:space="preserve">Replace the conditional clause with a noun phrase beginning with ‘Without ...’.</w:t>
+              <w:t xml:space="preserve">Replace the ‘If ...’ clause with a noun phrase beginning with ‘Without ...’.</w:t>
             </w:r>
           </w:p>
         </w:tc>
@@ -1539,7 +1923,7 @@
           <w:sz w:val="22"/>
           <w:szCs w:val="22"/>
         </w:rPr>
-        <w:t xml:space="preserve">1. Your school magazine is running a series called ‘Life in the Digital Age’. Write ONE paragraph (about 80 words) giving your opinion on whether students should be allowed to use AI tools such as ChatGPT to help with their schoolwork.</w:t>
+        <w:t xml:space="preserve">1. Your school magazine is running a series called ‘Life in the Digital Age’. Write ONE paragraph (about 80 words) giving your opinion on whether young people today are able to tell real news from fake news, and suggesting ONE thing schools could do to help them.</w:t>
       </w:r>
     </w:p>
     <w:p>

</xml_diff>

<commit_message>
v3: meaningful proofreading (inversion+RC per sentence), same-meaning conversion pairs, online-scams writing task
</commit_message>
<xml_diff>
--- a/Lesson 3 - Nominalisation (Student's).docx
+++ b/Lesson 3 - Nominalisation (Student's).docx
@@ -107,7 +107,7 @@
                 <w:sz w:val="22"/>
                 <w:szCs w:val="22"/>
               </w:rPr>
-              <w:t xml:space="preserve">Not only social media connects people instantly, but it also spreads stories which is often false.</w:t>
+              <w:t xml:space="preserve">Not only social media connects people far apart, but it also spreads rumours which often goes unchecked.</w:t>
             </w:r>
           </w:p>
         </w:tc>
@@ -125,7 +125,7 @@
                 <w:sz w:val="22"/>
                 <w:szCs w:val="22"/>
               </w:rPr>
-              <w:t xml:space="preserve">Rarely teenagers check the sources of the news they read online, which make them easy to fool.</w:t>
+              <w:t xml:space="preserve">Rarely teenagers verify the truth of what they share online, which make them easy targets of scams.</w:t>
             </w:r>
           </w:p>
         </w:tc>
@@ -143,7 +143,7 @@
                 <w:sz w:val="22"/>
                 <w:szCs w:val="22"/>
               </w:rPr>
-              <w:t xml:space="preserve">Only by setting clear screen-time rules parents can help their children, who often spends hours gaming.</w:t>
+              <w:t xml:space="preserve">Only by setting clear screen-time rules parents can protect their children, who often spends hours gaming late into the night.</w:t>
             </w:r>
           </w:p>
         </w:tc>
@@ -161,7 +161,7 @@
                 <w:sz w:val="22"/>
                 <w:szCs w:val="22"/>
               </w:rPr>
-              <w:t xml:space="preserve">Never the school has considered banning phones in class, which is used by nearly every student.</w:t>
+              <w:t xml:space="preserve">Never the school has considered banning phones in class, which distracts students from every lesson.</w:t>
             </w:r>
           </w:p>
         </w:tc>
@@ -179,7 +179,7 @@
                 <w:sz w:val="22"/>
                 <w:szCs w:val="22"/>
               </w:rPr>
-              <w:t xml:space="preserve">Seldom students will question the news which they read it on social media.</w:t>
+              <w:t xml:space="preserve">Seldom victims of online scams report the fraud to the police, which make it harder to catch the criminals.</w:t>
             </w:r>
           </w:p>
         </w:tc>
@@ -286,7 +286,7 @@
                 <w:sz w:val="22"/>
                 <w:szCs w:val="22"/>
               </w:rPr>
-              <w:t xml:space="preserve">People use their phones all day long.</w:t>
+              <w:t xml:space="preserve">People use their phones all the time, and many young people cannot sleep well.</w:t>
             </w:r>
           </w:p>
         </w:tc>
@@ -303,7 +303,7 @@
                 <w:sz w:val="22"/>
                 <w:szCs w:val="22"/>
               </w:rPr>
-              <w:t xml:space="preserve">The widespread use of smartphones worries teachers and parents.</w:t>
+              <w:t xml:space="preserve">The constant use of phones affects many young people’s sleep.</w:t>
             </w:r>
           </w:p>
         </w:tc>
@@ -322,7 +322,7 @@
                 <w:sz w:val="22"/>
                 <w:szCs w:val="22"/>
               </w:rPr>
-              <w:t xml:space="preserve">The company will improve its online security system.</w:t>
+              <w:t xml:space="preserve">The company will improve its online security system, so customers will feel safer.</w:t>
             </w:r>
           </w:p>
         </w:tc>
@@ -339,7 +339,7 @@
                 <w:sz w:val="22"/>
                 <w:szCs w:val="22"/>
               </w:rPr>
-              <w:t xml:space="preserve">The improvement of the company’s online security system will begin next month.</w:t>
+              <w:t xml:space="preserve">The improvement of the company’s online security system will make customers feel safer.</w:t>
             </w:r>
           </w:p>
         </w:tc>
@@ -358,7 +358,7 @@
                 <w:sz w:val="22"/>
                 <w:szCs w:val="22"/>
               </w:rPr>
-              <w:t xml:space="preserve">Young people depend on their phones too much.</w:t>
+              <w:t xml:space="preserve">Young people depend on their phones too much, and their schoolwork suffers.</w:t>
             </w:r>
           </w:p>
         </w:tc>
@@ -375,7 +375,7 @@
                 <w:sz w:val="22"/>
                 <w:szCs w:val="22"/>
               </w:rPr>
-              <w:t xml:space="preserve">Young people’s heavy dependence on their phones shows no sign of weakening.</w:t>
+              <w:t xml:space="preserve">Young people’s heavy dependence on their phones affects their schoolwork.</w:t>
             </w:r>
           </w:p>
         </w:tc>
@@ -394,7 +394,7 @@
                 <w:sz w:val="22"/>
                 <w:szCs w:val="22"/>
               </w:rPr>
-              <w:t xml:space="preserve">Students should be aware of online privacy.</w:t>
+              <w:t xml:space="preserve">Students who share photos online should be aware of online privacy.</w:t>
             </w:r>
           </w:p>
         </w:tc>
@@ -411,7 +411,7 @@
                 <w:sz w:val="22"/>
                 <w:szCs w:val="22"/>
               </w:rPr>
-              <w:t xml:space="preserve">Awareness of online privacy is now taught in many schools.</w:t>
+              <w:t xml:space="preserve">Students who share photos online should show awareness of online privacy.</w:t>
             </w:r>
           </w:p>
         </w:tc>
@@ -430,7 +430,7 @@
                 <w:sz w:val="22"/>
                 <w:szCs w:val="22"/>
               </w:rPr>
-              <w:t xml:space="preserve">The government decided to control social media companies more strictly.</w:t>
+              <w:t xml:space="preserve">The government decided to regulate social media companies, and the public supported this.</w:t>
             </w:r>
           </w:p>
         </w:tc>
@@ -447,7 +447,7 @@
                 <w:sz w:val="22"/>
                 <w:szCs w:val="22"/>
               </w:rPr>
-              <w:t xml:space="preserve">The government’s decision to regulate social media companies has won public support.</w:t>
+              <w:t xml:space="preserve">The government’s decision to regulate social media companies won public support.</w:t>
             </w:r>
           </w:p>
         </w:tc>
@@ -466,7 +466,7 @@
                 <w:sz w:val="22"/>
                 <w:szCs w:val="22"/>
               </w:rPr>
-              <w:t xml:space="preserve">Tech companies should be responsible for users’ data.</w:t>
+              <w:t xml:space="preserve">Tech companies should be responsible for users’ data, but many ignore this duty.</w:t>
             </w:r>
           </w:p>
         </w:tc>
@@ -483,7 +483,7 @@
                 <w:sz w:val="22"/>
                 <w:szCs w:val="22"/>
               </w:rPr>
-              <w:t xml:space="preserve">Tech companies must accept responsibility for users’ data.</w:t>
+              <w:t xml:space="preserve">Many tech companies ignore their responsibility for users’ data.</w:t>
             </w:r>
           </w:p>
         </w:tc>
@@ -519,7 +519,7 @@
                 <w:sz w:val="22"/>
                 <w:szCs w:val="22"/>
               </w:rPr>
-              <w:t xml:space="preserve">The rapid sharing of news allows rumours to spread quickly.</w:t>
+              <w:t xml:space="preserve">The rapid sharing of news makes rumours spread quickly.</w:t>
             </w:r>
           </w:p>
         </w:tc>
@@ -555,7 +555,7 @@
                 <w:sz w:val="22"/>
                 <w:szCs w:val="22"/>
               </w:rPr>
-              <w:t xml:space="preserve">Young people’s preference for social media news over newspapers has reshaped the whole news industry.</w:t>
+              <w:t xml:space="preserve">Many people show a clear preference for social media news over newspapers.</w:t>
             </w:r>
           </w:p>
         </w:tc>
@@ -1187,7 +1187,7 @@
                 <w:sz w:val="22"/>
                 <w:szCs w:val="22"/>
               </w:rPr>
-              <w:t xml:space="preserve">Turn the verb ‘use’ into a noun and begin with ‘The constant use of ...’.</w:t>
+              <w:t xml:space="preserve">Turn the verb ‘use’ into a noun: begin with ‘Students’ constant use of ...’.</w:t>
             </w:r>
           </w:p>
         </w:tc>
@@ -1923,7 +1923,7 @@
           <w:sz w:val="22"/>
           <w:szCs w:val="22"/>
         </w:rPr>
-        <w:t xml:space="preserve">1. Your school magazine is running a series called ‘Life in the Digital Age’. Write ONE paragraph (about 80 words) giving your opinion on whether young people today are able to tell real news from fake news, and suggesting ONE thing schools could do to help them.</w:t>
+        <w:t xml:space="preserve">1. Your school magazine is running a series called ‘Life in the Digital Age’. Write ONE paragraph (about 80 words) explaining why online scams have become a common problem for young people, and suggesting ONE thing schools could do to protect them.</w:t>
       </w:r>
     </w:p>
     <w:p>

</xml_diff>

<commit_message>
v4: two-benefit quiz item 1, 20-item word->noun warm-up after Part 1, 4 easy same-facts examples with paragraphs
</commit_message>
<xml_diff>
--- a/Lesson 3 - Nominalisation (Student's).docx
+++ b/Lesson 3 - Nominalisation (Student's).docx
@@ -107,7 +107,7 @@
                 <w:sz w:val="22"/>
                 <w:szCs w:val="22"/>
               </w:rPr>
-              <w:t xml:space="preserve">Not only social media connects people far apart, but it also spreads rumours which often goes unchecked.</w:t>
+              <w:t xml:space="preserve">Not only online learning saves travelling time, but it also gives students access to courses which is not available in their own schools.</w:t>
             </w:r>
           </w:p>
         </w:tc>
@@ -187,382 +187,6 @@
     </w:tbl>
     <w:p>
       <w:pPr>
-        <w:pStyle w:val="20"/>
-        <w:spacing w:line="360" w:lineRule="auto"/>
-      </w:pPr>
-      <w:r>
-        <w:rPr>
-          <w:rFonts w:ascii="Times New Roman" w:hAnsi="Times New Roman" w:cs="Times New Roman"/>
-          <w:b/>
-        </w:rPr>
-        <w:t xml:space="preserve">Part 2: Nominalisation in formal writing</w:t>
-      </w:r>
-    </w:p>
-    <w:p>
-      <w:pPr>
-        <w:spacing w:line="360" w:lineRule="auto"/>
-      </w:pPr>
-      <w:r>
-        <w:rPr>
-          <w:rFonts w:ascii="Times New Roman" w:hAnsi="Times New Roman" w:cs="Times New Roman"/>
-          <w:sz w:val="22"/>
-          <w:szCs w:val="22"/>
-        </w:rPr>
-        <w:t xml:space="preserve">Nominalisation names an action or a quality as a noun, so that ‘people use phones’ becomes ‘the use of phones’. Naming ideas in this way packs a sentence into fewer words and gives formal writing a more academic tone. It is one of the clearest signs of a higher band in DSE Paper 2.</w:t>
-      </w:r>
-    </w:p>
-    <w:p>
-      <w:pPr>
-        <w:spacing w:line="360" w:lineRule="auto"/>
-      </w:pPr>
-      <w:r>
-        <w:rPr>
-          <w:rFonts w:ascii="Times New Roman" w:hAnsi="Times New Roman" w:cs="Times New Roman"/>
-          <w:sz w:val="22"/>
-          <w:szCs w:val="22"/>
-        </w:rPr>
-        <w:t xml:space="preserve">Study how each plain sentence is converted. The new version names the action or quality as a noun and sounds more mature, yet the meaning stays the same.</w:t>
-      </w:r>
-    </w:p>
-    <w:tbl>
-      <w:tblPr>
-        <w:tblStyle w:val="aff2"/>
-        <w:tblW w:w="0" w:type="auto"/>
-        <w:tblLook w:val="04A0" w:firstRow="1" w:lastRow="0" w:firstColumn="1" w:lastColumn="0" w:noHBand="0" w:noVBand="1"/>
-      </w:tblPr>
-      <w:tblGrid>
-        <w:gridCol w:w="4675"/>
-        <w:gridCol w:w="4675"/>
-      </w:tblGrid>
-      <w:tr>
-        <w:tc>
-          <w:tcPr>
-            <w:tcW w:w="4675" w:type="dxa"/>
-            <w:shd w:val="clear" w:color="auto" w:fill="DEEBF7"/>
-          </w:tcPr>
-          <w:p>
-            <w:pPr/>
-            <w:r>
-              <w:rPr>
-                <w:rFonts w:ascii="Times New Roman" w:hAnsi="Times New Roman" w:cs="Times New Roman"/>
-                <w:b/>
-                <w:sz w:val="22"/>
-                <w:szCs w:val="22"/>
-              </w:rPr>
-              <w:t xml:space="preserve">Plain</w:t>
-            </w:r>
-          </w:p>
-        </w:tc>
-        <w:tc>
-          <w:tcPr>
-            <w:tcW w:w="4675" w:type="dxa"/>
-            <w:shd w:val="clear" w:color="auto" w:fill="DEEBF7"/>
-          </w:tcPr>
-          <w:p>
-            <w:pPr/>
-            <w:r>
-              <w:rPr>
-                <w:rFonts w:ascii="Times New Roman" w:hAnsi="Times New Roman" w:cs="Times New Roman"/>
-                <w:b/>
-                <w:sz w:val="22"/>
-                <w:szCs w:val="22"/>
-              </w:rPr>
-              <w:t xml:space="preserve">More formal</w:t>
-            </w:r>
-          </w:p>
-        </w:tc>
-      </w:tr>
-      <w:tr>
-        <w:tc>
-          <w:tcPr>
-            <w:tcW w:w="4675" w:type="dxa"/>
-            <w:shd w:val="clear" w:color="auto" w:fill="DEEBF7"/>
-          </w:tcPr>
-          <w:p>
-            <w:pPr/>
-            <w:r>
-              <w:rPr>
-                <w:rFonts w:ascii="Times New Roman" w:hAnsi="Times New Roman" w:cs="Times New Roman"/>
-                <w:sz w:val="22"/>
-                <w:szCs w:val="22"/>
-              </w:rPr>
-              <w:t xml:space="preserve">People use their phones all the time, and many young people cannot sleep well.</w:t>
-            </w:r>
-          </w:p>
-        </w:tc>
-        <w:tc>
-          <w:tcPr>
-            <w:tcW w:w="4675" w:type="dxa"/>
-            <w:shd w:val="clear" w:color="auto" w:fill="DEEBF7"/>
-          </w:tcPr>
-          <w:p>
-            <w:pPr/>
-            <w:r>
-              <w:rPr>
-                <w:rFonts w:ascii="Times New Roman" w:hAnsi="Times New Roman" w:cs="Times New Roman"/>
-                <w:sz w:val="22"/>
-                <w:szCs w:val="22"/>
-              </w:rPr>
-              <w:t xml:space="preserve">The constant use of phones affects many young people’s sleep.</w:t>
-            </w:r>
-          </w:p>
-        </w:tc>
-      </w:tr>
-      <w:tr>
-        <w:tc>
-          <w:tcPr>
-            <w:tcW w:w="4675" w:type="dxa"/>
-            <w:shd w:val="clear" w:color="auto" w:fill="DEEBF7"/>
-          </w:tcPr>
-          <w:p>
-            <w:pPr/>
-            <w:r>
-              <w:rPr>
-                <w:rFonts w:ascii="Times New Roman" w:hAnsi="Times New Roman" w:cs="Times New Roman"/>
-                <w:sz w:val="22"/>
-                <w:szCs w:val="22"/>
-              </w:rPr>
-              <w:t xml:space="preserve">The company will improve its online security system, so customers will feel safer.</w:t>
-            </w:r>
-          </w:p>
-        </w:tc>
-        <w:tc>
-          <w:tcPr>
-            <w:tcW w:w="4675" w:type="dxa"/>
-            <w:shd w:val="clear" w:color="auto" w:fill="DEEBF7"/>
-          </w:tcPr>
-          <w:p>
-            <w:pPr/>
-            <w:r>
-              <w:rPr>
-                <w:rFonts w:ascii="Times New Roman" w:hAnsi="Times New Roman" w:cs="Times New Roman"/>
-                <w:sz w:val="22"/>
-                <w:szCs w:val="22"/>
-              </w:rPr>
-              <w:t xml:space="preserve">The improvement of the company’s online security system will make customers feel safer.</w:t>
-            </w:r>
-          </w:p>
-        </w:tc>
-      </w:tr>
-      <w:tr>
-        <w:tc>
-          <w:tcPr>
-            <w:tcW w:w="4675" w:type="dxa"/>
-            <w:shd w:val="clear" w:color="auto" w:fill="DEEBF7"/>
-          </w:tcPr>
-          <w:p>
-            <w:pPr/>
-            <w:r>
-              <w:rPr>
-                <w:rFonts w:ascii="Times New Roman" w:hAnsi="Times New Roman" w:cs="Times New Roman"/>
-                <w:sz w:val="22"/>
-                <w:szCs w:val="22"/>
-              </w:rPr>
-              <w:t xml:space="preserve">Young people depend on their phones too much, and their schoolwork suffers.</w:t>
-            </w:r>
-          </w:p>
-        </w:tc>
-        <w:tc>
-          <w:tcPr>
-            <w:tcW w:w="4675" w:type="dxa"/>
-            <w:shd w:val="clear" w:color="auto" w:fill="DEEBF7"/>
-          </w:tcPr>
-          <w:p>
-            <w:pPr/>
-            <w:r>
-              <w:rPr>
-                <w:rFonts w:ascii="Times New Roman" w:hAnsi="Times New Roman" w:cs="Times New Roman"/>
-                <w:sz w:val="22"/>
-                <w:szCs w:val="22"/>
-              </w:rPr>
-              <w:t xml:space="preserve">Young people’s heavy dependence on their phones affects their schoolwork.</w:t>
-            </w:r>
-          </w:p>
-        </w:tc>
-      </w:tr>
-      <w:tr>
-        <w:tc>
-          <w:tcPr>
-            <w:tcW w:w="4675" w:type="dxa"/>
-            <w:shd w:val="clear" w:color="auto" w:fill="DEEBF7"/>
-          </w:tcPr>
-          <w:p>
-            <w:pPr/>
-            <w:r>
-              <w:rPr>
-                <w:rFonts w:ascii="Times New Roman" w:hAnsi="Times New Roman" w:cs="Times New Roman"/>
-                <w:sz w:val="22"/>
-                <w:szCs w:val="22"/>
-              </w:rPr>
-              <w:t xml:space="preserve">Students who share photos online should be aware of online privacy.</w:t>
-            </w:r>
-          </w:p>
-        </w:tc>
-        <w:tc>
-          <w:tcPr>
-            <w:tcW w:w="4675" w:type="dxa"/>
-            <w:shd w:val="clear" w:color="auto" w:fill="DEEBF7"/>
-          </w:tcPr>
-          <w:p>
-            <w:pPr/>
-            <w:r>
-              <w:rPr>
-                <w:rFonts w:ascii="Times New Roman" w:hAnsi="Times New Roman" w:cs="Times New Roman"/>
-                <w:sz w:val="22"/>
-                <w:szCs w:val="22"/>
-              </w:rPr>
-              <w:t xml:space="preserve">Students who share photos online should show awareness of online privacy.</w:t>
-            </w:r>
-          </w:p>
-        </w:tc>
-      </w:tr>
-      <w:tr>
-        <w:tc>
-          <w:tcPr>
-            <w:tcW w:w="4675" w:type="dxa"/>
-            <w:shd w:val="clear" w:color="auto" w:fill="DEEBF7"/>
-          </w:tcPr>
-          <w:p>
-            <w:pPr/>
-            <w:r>
-              <w:rPr>
-                <w:rFonts w:ascii="Times New Roman" w:hAnsi="Times New Roman" w:cs="Times New Roman"/>
-                <w:sz w:val="22"/>
-                <w:szCs w:val="22"/>
-              </w:rPr>
-              <w:t xml:space="preserve">The government decided to regulate social media companies, and the public supported this.</w:t>
-            </w:r>
-          </w:p>
-        </w:tc>
-        <w:tc>
-          <w:tcPr>
-            <w:tcW w:w="4675" w:type="dxa"/>
-            <w:shd w:val="clear" w:color="auto" w:fill="DEEBF7"/>
-          </w:tcPr>
-          <w:p>
-            <w:pPr/>
-            <w:r>
-              <w:rPr>
-                <w:rFonts w:ascii="Times New Roman" w:hAnsi="Times New Roman" w:cs="Times New Roman"/>
-                <w:sz w:val="22"/>
-                <w:szCs w:val="22"/>
-              </w:rPr>
-              <w:t xml:space="preserve">The government’s decision to regulate social media companies won public support.</w:t>
-            </w:r>
-          </w:p>
-        </w:tc>
-      </w:tr>
-      <w:tr>
-        <w:tc>
-          <w:tcPr>
-            <w:tcW w:w="4675" w:type="dxa"/>
-            <w:shd w:val="clear" w:color="auto" w:fill="DEEBF7"/>
-          </w:tcPr>
-          <w:p>
-            <w:pPr/>
-            <w:r>
-              <w:rPr>
-                <w:rFonts w:ascii="Times New Roman" w:hAnsi="Times New Roman" w:cs="Times New Roman"/>
-                <w:sz w:val="22"/>
-                <w:szCs w:val="22"/>
-              </w:rPr>
-              <w:t xml:space="preserve">Tech companies should be responsible for users’ data, but many ignore this duty.</w:t>
-            </w:r>
-          </w:p>
-        </w:tc>
-        <w:tc>
-          <w:tcPr>
-            <w:tcW w:w="4675" w:type="dxa"/>
-            <w:shd w:val="clear" w:color="auto" w:fill="DEEBF7"/>
-          </w:tcPr>
-          <w:p>
-            <w:pPr/>
-            <w:r>
-              <w:rPr>
-                <w:rFonts w:ascii="Times New Roman" w:hAnsi="Times New Roman" w:cs="Times New Roman"/>
-                <w:sz w:val="22"/>
-                <w:szCs w:val="22"/>
-              </w:rPr>
-              <w:t xml:space="preserve">Many tech companies ignore their responsibility for users’ data.</w:t>
-            </w:r>
-          </w:p>
-        </w:tc>
-      </w:tr>
-      <w:tr>
-        <w:tc>
-          <w:tcPr>
-            <w:tcW w:w="4675" w:type="dxa"/>
-            <w:shd w:val="clear" w:color="auto" w:fill="DEEBF7"/>
-          </w:tcPr>
-          <w:p>
-            <w:pPr/>
-            <w:r>
-              <w:rPr>
-                <w:rFonts w:ascii="Times New Roman" w:hAnsi="Times New Roman" w:cs="Times New Roman"/>
-                <w:sz w:val="22"/>
-                <w:szCs w:val="22"/>
-              </w:rPr>
-              <w:t xml:space="preserve">Because people share news very quickly, rumours spread fast.</w:t>
-            </w:r>
-          </w:p>
-        </w:tc>
-        <w:tc>
-          <w:tcPr>
-            <w:tcW w:w="4675" w:type="dxa"/>
-            <w:shd w:val="clear" w:color="auto" w:fill="DEEBF7"/>
-          </w:tcPr>
-          <w:p>
-            <w:pPr/>
-            <w:r>
-              <w:rPr>
-                <w:rFonts w:ascii="Times New Roman" w:hAnsi="Times New Roman" w:cs="Times New Roman"/>
-                <w:sz w:val="22"/>
-                <w:szCs w:val="22"/>
-              </w:rPr>
-              <w:t xml:space="preserve">The rapid sharing of news makes rumours spread quickly.</w:t>
-            </w:r>
-          </w:p>
-        </w:tc>
-      </w:tr>
-      <w:tr>
-        <w:tc>
-          <w:tcPr>
-            <w:tcW w:w="4675" w:type="dxa"/>
-            <w:shd w:val="clear" w:color="auto" w:fill="DEEBF7"/>
-          </w:tcPr>
-          <w:p>
-            <w:pPr/>
-            <w:r>
-              <w:rPr>
-                <w:rFonts w:ascii="Times New Roman" w:hAnsi="Times New Roman" w:cs="Times New Roman"/>
-                <w:sz w:val="22"/>
-                <w:szCs w:val="22"/>
-              </w:rPr>
-              <w:t xml:space="preserve">Many people prefer reading news on social media to reading newspapers.</w:t>
-            </w:r>
-          </w:p>
-        </w:tc>
-        <w:tc>
-          <w:tcPr>
-            <w:tcW w:w="4675" w:type="dxa"/>
-            <w:shd w:val="clear" w:color="auto" w:fill="DEEBF7"/>
-          </w:tcPr>
-          <w:p>
-            <w:pPr/>
-            <w:r>
-              <w:rPr>
-                <w:rFonts w:ascii="Times New Roman" w:hAnsi="Times New Roman" w:cs="Times New Roman"/>
-                <w:sz w:val="22"/>
-                <w:szCs w:val="22"/>
-              </w:rPr>
-              <w:t xml:space="preserve">Many people show a clear preference for social media news over newspapers.</w:t>
-            </w:r>
-          </w:p>
-        </w:tc>
-      </w:tr>
-    </w:tbl>
-    <w:p>
-      <w:pPr>
         <w:spacing w:line="360" w:lineRule="auto"/>
       </w:pPr>
       <w:r>
@@ -572,115 +196,6 @@
           <w:szCs w:val="22"/>
         </w:rPr>
         <w:t xml:space="preserve"/>
-      </w:r>
-    </w:p>
-    <w:p>
-      <w:pPr>
-        <w:spacing w:line="360" w:lineRule="auto"/>
-      </w:pPr>
-      <w:r>
-        <w:rPr>
-          <w:rFonts w:ascii="Times New Roman" w:hAnsi="Times New Roman" w:cs="Times New Roman"/>
-          <w:sz w:val="22"/>
-          <w:szCs w:val="22"/>
-        </w:rPr>
-        <w:t xml:space="preserve">The short paragraphs below use the same idea. Notice how the nominalised phrases fit naturally into the sentences — nothing is forced.</w:t>
-      </w:r>
-    </w:p>
-    <w:p>
-      <w:pPr>
-        <w:spacing w:line="360" w:lineRule="auto"/>
-        <w:pBdr>
-          <w:top w:val="single" w:sz="4" w:space="4" w:color="auto"/>
-          <w:left w:val="single" w:sz="4" w:space="4" w:color="auto"/>
-          <w:bottom w:val="single" w:sz="4" w:space="4" w:color="auto"/>
-          <w:right w:val="single" w:sz="4" w:space="4" w:color="auto"/>
-        </w:pBdr>
-      </w:pPr>
-      <w:r>
-        <w:rPr>
-          <w:rFonts w:ascii="Times New Roman" w:hAnsi="Times New Roman" w:cs="Times New Roman"/>
-          <w:sz w:val="22"/>
-          <w:szCs w:val="22"/>
-        </w:rPr>
-        <w:t xml:space="preserve">The introduction of a school digital-literacy programme deserves serious consideration. It would give students the skills to manage their screen time and to judge online information for themselves, reducing the risk of cyberbullying and online scams. Parents and teachers alike would welcome such a step.</w:t>
-      </w:r>
-    </w:p>
-    <w:p>
-      <w:pPr>
-        <w:spacing w:line="360" w:lineRule="auto"/>
-        <w:pBdr>
-          <w:top w:val="single" w:sz="4" w:space="4" w:color="auto"/>
-          <w:left w:val="single" w:sz="4" w:space="4" w:color="auto"/>
-          <w:bottom w:val="single" w:sz="4" w:space="4" w:color="auto"/>
-          <w:right w:val="single" w:sz="4" w:space="4" w:color="auto"/>
-        </w:pBdr>
-      </w:pPr>
-      <w:r>
-        <w:rPr>
-          <w:rFonts w:ascii="Times New Roman" w:hAnsi="Times New Roman" w:cs="Times New Roman"/>
-          <w:sz w:val="22"/>
-          <w:szCs w:val="22"/>
-        </w:rPr>
-        <w:t xml:space="preserve">The importance of digital skills in the modern workplace can hardly be overstated. Students who master online tools at school gain a clear advantage when they graduate, while those who ignore them risk falling further behind. Schools, therefore, should treat digital literacy as a core subject rather than an option.</w:t>
-      </w:r>
-    </w:p>
-    <w:p>
-      <w:pPr>
-        <w:spacing w:line="360" w:lineRule="auto"/>
-        <w:pBdr>
-          <w:top w:val="single" w:sz="4" w:space="4" w:color="auto"/>
-          <w:left w:val="single" w:sz="4" w:space="4" w:color="auto"/>
-          <w:bottom w:val="single" w:sz="4" w:space="4" w:color="auto"/>
-          <w:right w:val="single" w:sz="4" w:space="4" w:color="auto"/>
-        </w:pBdr>
-      </w:pPr>
-      <w:r>
-        <w:rPr>
-          <w:rFonts w:ascii="Times New Roman" w:hAnsi="Times New Roman" w:cs="Times New Roman"/>
-          <w:sz w:val="22"/>
-          <w:szCs w:val="22"/>
-        </w:rPr>
-        <w:t xml:space="preserve">Owing to the widespread use of smartphones, many students struggle to concentrate for long periods. Revision tasks that once took half an hour now stretch over a whole evening, interrupted by notifications arriving every few minutes. Setting clear screen-time limits at home would benefit both study and sleep.</w:t>
-      </w:r>
-    </w:p>
-    <w:p>
-      <w:pPr>
-        <w:spacing w:line="360" w:lineRule="auto"/>
-      </w:pPr>
-      <w:r>
-        <w:rPr>
-          <w:rFonts w:ascii="Times New Roman" w:hAnsi="Times New Roman" w:cs="Times New Roman"/>
-          <w:sz w:val="22"/>
-          <w:szCs w:val="22"/>
-        </w:rPr>
-        <w:t xml:space="preserve"/>
-      </w:r>
-    </w:p>
-    <w:p>
-      <w:pPr>
-        <w:pStyle w:val="1"/>
-        <w:spacing w:line="360" w:lineRule="auto"/>
-      </w:pPr>
-      <w:r>
-        <w:rPr>
-          <w:rFonts w:ascii="Times New Roman" w:hAnsi="Times New Roman" w:cs="Times New Roman"/>
-          <w:b/>
-        </w:rPr>
-        <w:t xml:space="preserve">Part 3: Practice sets</w:t>
-      </w:r>
-    </w:p>
-    <w:p>
-      <w:pPr>
-        <w:spacing w:line="360" w:lineRule="auto"/>
-      </w:pPr>
-      <w:r>
-        <w:rPr>
-          <w:rFonts w:ascii="Times New Roman" w:hAnsi="Times New Roman" w:cs="Times New Roman"/>
-          <w:sz w:val="22"/>
-          <w:szCs w:val="22"/>
-        </w:rPr>
-        <w:t xml:space="preserve">First, warm up by turning words into nouns. Then rewrite each simple sentence using nominalisation. The sentences are about technology and communication, so keep the register formal. The last three sets (4, 5 and 6) are more challenging.</w:t>
       </w:r>
     </w:p>
     <w:p>
@@ -708,7 +223,7 @@
           <w:sz w:val="22"/>
           <w:szCs w:val="22"/>
         </w:rPr>
-        <w:t xml:space="preserve">Write the noun form of each word.</w:t>
+        <w:t xml:space="preserve">Write the noun form of each word. The last six words are more challenging.</w:t>
       </w:r>
     </w:p>
     <w:tbl>
@@ -804,7 +319,7 @@
                 <w:sz w:val="22"/>
                 <w:szCs w:val="22"/>
               </w:rPr>
-              <w:t xml:space="preserve">introduce</w:t>
+              <w:t xml:space="preserve">improve</w:t>
             </w:r>
           </w:p>
         </w:tc>
@@ -872,6 +387,40 @@
                 <w:sz w:val="22"/>
                 <w:szCs w:val="22"/>
               </w:rPr>
+              <w:t xml:space="preserve">introduce</w:t>
+            </w:r>
+          </w:p>
+        </w:tc>
+        <w:tc>
+          <w:tcPr>
+            <w:tcW w:w="6745" w:type="dxa"/>
+          </w:tcPr>
+          <w:p>
+            <w:pPr/>
+            <w:r>
+              <w:rPr>
+                <w:rFonts w:ascii="Times New Roman" w:hAnsi="Times New Roman" w:cs="Times New Roman"/>
+                <w:sz w:val="22"/>
+                <w:szCs w:val="22"/>
+              </w:rPr>
+              <w:t xml:space="preserve"/>
+            </w:r>
+          </w:p>
+        </w:tc>
+      </w:tr>
+      <w:tr>
+        <w:tc>
+          <w:tcPr>
+            <w:tcW w:w="2605" w:type="dxa"/>
+          </w:tcPr>
+          <w:p>
+            <w:pPr/>
+            <w:r>
+              <w:rPr>
+                <w:rFonts w:ascii="Times New Roman" w:hAnsi="Times New Roman" w:cs="Times New Roman"/>
+                <w:sz w:val="22"/>
+                <w:szCs w:val="22"/>
+              </w:rPr>
               <w:t xml:space="preserve">regulate</w:t>
             </w:r>
           </w:p>
@@ -906,7 +455,109 @@
                 <w:sz w:val="22"/>
                 <w:szCs w:val="22"/>
               </w:rPr>
-              <w:t xml:space="preserve">improve</w:t>
+              <w:t xml:space="preserve">protect</w:t>
+            </w:r>
+          </w:p>
+        </w:tc>
+        <w:tc>
+          <w:tcPr>
+            <w:tcW w:w="6745" w:type="dxa"/>
+          </w:tcPr>
+          <w:p>
+            <w:pPr/>
+            <w:r>
+              <w:rPr>
+                <w:rFonts w:ascii="Times New Roman" w:hAnsi="Times New Roman" w:cs="Times New Roman"/>
+                <w:sz w:val="22"/>
+                <w:szCs w:val="22"/>
+              </w:rPr>
+              <w:t xml:space="preserve"/>
+            </w:r>
+          </w:p>
+        </w:tc>
+      </w:tr>
+      <w:tr>
+        <w:tc>
+          <w:tcPr>
+            <w:tcW w:w="2605" w:type="dxa"/>
+          </w:tcPr>
+          <w:p>
+            <w:pPr/>
+            <w:r>
+              <w:rPr>
+                <w:rFonts w:ascii="Times New Roman" w:hAnsi="Times New Roman" w:cs="Times New Roman"/>
+                <w:sz w:val="22"/>
+                <w:szCs w:val="22"/>
+              </w:rPr>
+              <w:t xml:space="preserve">explain</w:t>
+            </w:r>
+          </w:p>
+        </w:tc>
+        <w:tc>
+          <w:tcPr>
+            <w:tcW w:w="6745" w:type="dxa"/>
+          </w:tcPr>
+          <w:p>
+            <w:pPr/>
+            <w:r>
+              <w:rPr>
+                <w:rFonts w:ascii="Times New Roman" w:hAnsi="Times New Roman" w:cs="Times New Roman"/>
+                <w:sz w:val="22"/>
+                <w:szCs w:val="22"/>
+              </w:rPr>
+              <w:t xml:space="preserve"/>
+            </w:r>
+          </w:p>
+        </w:tc>
+      </w:tr>
+      <w:tr>
+        <w:tc>
+          <w:tcPr>
+            <w:tcW w:w="2605" w:type="dxa"/>
+          </w:tcPr>
+          <w:p>
+            <w:pPr/>
+            <w:r>
+              <w:rPr>
+                <w:rFonts w:ascii="Times New Roman" w:hAnsi="Times New Roman" w:cs="Times New Roman"/>
+                <w:sz w:val="22"/>
+                <w:szCs w:val="22"/>
+              </w:rPr>
+              <w:t xml:space="preserve">solve</w:t>
+            </w:r>
+          </w:p>
+        </w:tc>
+        <w:tc>
+          <w:tcPr>
+            <w:tcW w:w="6745" w:type="dxa"/>
+          </w:tcPr>
+          <w:p>
+            <w:pPr/>
+            <w:r>
+              <w:rPr>
+                <w:rFonts w:ascii="Times New Roman" w:hAnsi="Times New Roman" w:cs="Times New Roman"/>
+                <w:sz w:val="22"/>
+                <w:szCs w:val="22"/>
+              </w:rPr>
+              <w:t xml:space="preserve"/>
+            </w:r>
+          </w:p>
+        </w:tc>
+      </w:tr>
+      <w:tr>
+        <w:tc>
+          <w:tcPr>
+            <w:tcW w:w="2605" w:type="dxa"/>
+          </w:tcPr>
+          <w:p>
+            <w:pPr/>
+            <w:r>
+              <w:rPr>
+                <w:rFonts w:ascii="Times New Roman" w:hAnsi="Times New Roman" w:cs="Times New Roman"/>
+                <w:sz w:val="22"/>
+                <w:szCs w:val="22"/>
+              </w:rPr>
+              <w:t xml:space="preserve">use</w:t>
             </w:r>
           </w:p>
         </w:tc>
@@ -1097,7 +748,757 @@
           </w:p>
         </w:tc>
       </w:tr>
+      <w:tr>
+        <w:tc>
+          <w:tcPr>
+            <w:tcW w:w="2605" w:type="dxa"/>
+          </w:tcPr>
+          <w:p>
+            <w:pPr/>
+            <w:r>
+              <w:rPr>
+                <w:rFonts w:ascii="Times New Roman" w:hAnsi="Times New Roman" w:cs="Times New Roman"/>
+                <w:sz w:val="22"/>
+                <w:szCs w:val="22"/>
+              </w:rPr>
+              <w:t xml:space="preserve">choose</w:t>
+            </w:r>
+          </w:p>
+        </w:tc>
+        <w:tc>
+          <w:tcPr>
+            <w:tcW w:w="6745" w:type="dxa"/>
+          </w:tcPr>
+          <w:p>
+            <w:pPr/>
+            <w:r>
+              <w:rPr>
+                <w:rFonts w:ascii="Times New Roman" w:hAnsi="Times New Roman" w:cs="Times New Roman"/>
+                <w:sz w:val="22"/>
+                <w:szCs w:val="22"/>
+              </w:rPr>
+              <w:t xml:space="preserve"/>
+            </w:r>
+          </w:p>
+        </w:tc>
+      </w:tr>
+      <w:tr>
+        <w:tc>
+          <w:tcPr>
+            <w:tcW w:w="2605" w:type="dxa"/>
+          </w:tcPr>
+          <w:p>
+            <w:pPr/>
+            <w:r>
+              <w:rPr>
+                <w:rFonts w:ascii="Times New Roman" w:hAnsi="Times New Roman" w:cs="Times New Roman"/>
+                <w:sz w:val="22"/>
+                <w:szCs w:val="22"/>
+              </w:rPr>
+              <w:t xml:space="preserve">know</w:t>
+            </w:r>
+          </w:p>
+        </w:tc>
+        <w:tc>
+          <w:tcPr>
+            <w:tcW w:w="6745" w:type="dxa"/>
+          </w:tcPr>
+          <w:p>
+            <w:pPr/>
+            <w:r>
+              <w:rPr>
+                <w:rFonts w:ascii="Times New Roman" w:hAnsi="Times New Roman" w:cs="Times New Roman"/>
+                <w:sz w:val="22"/>
+                <w:szCs w:val="22"/>
+              </w:rPr>
+              <w:t xml:space="preserve"/>
+            </w:r>
+          </w:p>
+        </w:tc>
+      </w:tr>
+      <w:tr>
+        <w:tc>
+          <w:tcPr>
+            <w:tcW w:w="2605" w:type="dxa"/>
+          </w:tcPr>
+          <w:p>
+            <w:pPr/>
+            <w:r>
+              <w:rPr>
+                <w:rFonts w:ascii="Times New Roman" w:hAnsi="Times New Roman" w:cs="Times New Roman"/>
+                <w:sz w:val="22"/>
+                <w:szCs w:val="22"/>
+              </w:rPr>
+              <w:t xml:space="preserve">lose</w:t>
+            </w:r>
+          </w:p>
+        </w:tc>
+        <w:tc>
+          <w:tcPr>
+            <w:tcW w:w="6745" w:type="dxa"/>
+          </w:tcPr>
+          <w:p>
+            <w:pPr/>
+            <w:r>
+              <w:rPr>
+                <w:rFonts w:ascii="Times New Roman" w:hAnsi="Times New Roman" w:cs="Times New Roman"/>
+                <w:sz w:val="22"/>
+                <w:szCs w:val="22"/>
+              </w:rPr>
+              <w:t xml:space="preserve"/>
+            </w:r>
+          </w:p>
+        </w:tc>
+      </w:tr>
+      <w:tr>
+        <w:tc>
+          <w:tcPr>
+            <w:tcW w:w="2605" w:type="dxa"/>
+          </w:tcPr>
+          <w:p>
+            <w:pPr/>
+            <w:r>
+              <w:rPr>
+                <w:rFonts w:ascii="Times New Roman" w:hAnsi="Times New Roman" w:cs="Times New Roman"/>
+                <w:sz w:val="22"/>
+                <w:szCs w:val="22"/>
+              </w:rPr>
+              <w:t xml:space="preserve">prove</w:t>
+            </w:r>
+          </w:p>
+        </w:tc>
+        <w:tc>
+          <w:tcPr>
+            <w:tcW w:w="6745" w:type="dxa"/>
+          </w:tcPr>
+          <w:p>
+            <w:pPr/>
+            <w:r>
+              <w:rPr>
+                <w:rFonts w:ascii="Times New Roman" w:hAnsi="Times New Roman" w:cs="Times New Roman"/>
+                <w:sz w:val="22"/>
+                <w:szCs w:val="22"/>
+              </w:rPr>
+              <w:t xml:space="preserve"/>
+            </w:r>
+          </w:p>
+        </w:tc>
+      </w:tr>
+      <w:tr>
+        <w:tc>
+          <w:tcPr>
+            <w:tcW w:w="2605" w:type="dxa"/>
+          </w:tcPr>
+          <w:p>
+            <w:pPr/>
+            <w:r>
+              <w:rPr>
+                <w:rFonts w:ascii="Times New Roman" w:hAnsi="Times New Roman" w:cs="Times New Roman"/>
+                <w:sz w:val="22"/>
+                <w:szCs w:val="22"/>
+              </w:rPr>
+              <w:t xml:space="preserve">believe</w:t>
+            </w:r>
+          </w:p>
+        </w:tc>
+        <w:tc>
+          <w:tcPr>
+            <w:tcW w:w="6745" w:type="dxa"/>
+          </w:tcPr>
+          <w:p>
+            <w:pPr/>
+            <w:r>
+              <w:rPr>
+                <w:rFonts w:ascii="Times New Roman" w:hAnsi="Times New Roman" w:cs="Times New Roman"/>
+                <w:sz w:val="22"/>
+                <w:szCs w:val="22"/>
+              </w:rPr>
+              <w:t xml:space="preserve"/>
+            </w:r>
+          </w:p>
+        </w:tc>
+      </w:tr>
+      <w:tr>
+        <w:tc>
+          <w:tcPr>
+            <w:tcW w:w="2605" w:type="dxa"/>
+          </w:tcPr>
+          <w:p>
+            <w:pPr/>
+            <w:r>
+              <w:rPr>
+                <w:rFonts w:ascii="Times New Roman" w:hAnsi="Times New Roman" w:cs="Times New Roman"/>
+                <w:sz w:val="22"/>
+                <w:szCs w:val="22"/>
+              </w:rPr>
+              <w:t xml:space="preserve">strong</w:t>
+            </w:r>
+          </w:p>
+        </w:tc>
+        <w:tc>
+          <w:tcPr>
+            <w:tcW w:w="6745" w:type="dxa"/>
+          </w:tcPr>
+          <w:p>
+            <w:pPr/>
+            <w:r>
+              <w:rPr>
+                <w:rFonts w:ascii="Times New Roman" w:hAnsi="Times New Roman" w:cs="Times New Roman"/>
+                <w:sz w:val="22"/>
+                <w:szCs w:val="22"/>
+              </w:rPr>
+              <w:t xml:space="preserve"/>
+            </w:r>
+          </w:p>
+        </w:tc>
+      </w:tr>
     </w:tbl>
+    <w:p>
+      <w:pPr>
+        <w:spacing w:line="360" w:lineRule="auto"/>
+      </w:pPr>
+      <w:r>
+        <w:rPr>
+          <w:rFonts w:ascii="Times New Roman" w:hAnsi="Times New Roman" w:cs="Times New Roman"/>
+          <w:sz w:val="22"/>
+          <w:szCs w:val="22"/>
+        </w:rPr>
+        <w:t xml:space="preserve"/>
+      </w:r>
+    </w:p>
+    <w:p>
+      <w:pPr>
+        <w:pStyle w:val="20"/>
+        <w:spacing w:line="360" w:lineRule="auto"/>
+      </w:pPr>
+      <w:r>
+        <w:rPr>
+          <w:rFonts w:ascii="Times New Roman" w:hAnsi="Times New Roman" w:cs="Times New Roman"/>
+          <w:b/>
+        </w:rPr>
+        <w:t xml:space="preserve">Part 2: Nominalisation in formal writing</w:t>
+      </w:r>
+    </w:p>
+    <w:p>
+      <w:pPr>
+        <w:spacing w:line="360" w:lineRule="auto"/>
+      </w:pPr>
+      <w:r>
+        <w:rPr>
+          <w:rFonts w:ascii="Times New Roman" w:hAnsi="Times New Roman" w:cs="Times New Roman"/>
+          <w:sz w:val="22"/>
+          <w:szCs w:val="22"/>
+        </w:rPr>
+        <w:t xml:space="preserve">Nominalisation names an action or a quality as a noun, so that ‘people use phones’ becomes ‘the use of phones’. It packs ideas into fewer words and gives formal writing a more academic tone, and it is one of the clearest signs of a higher band in DSE Paper 2.</w:t>
+      </w:r>
+    </w:p>
+    <w:p>
+      <w:pPr>
+        <w:pStyle w:val="31"/>
+        <w:spacing w:line="360" w:lineRule="auto"/>
+      </w:pPr>
+      <w:r>
+        <w:rPr>
+          <w:rFonts w:ascii="Times New Roman" w:hAnsi="Times New Roman" w:cs="Times New Roman"/>
+          <w:b/>
+          <w:sz w:val="22"/>
+          <w:szCs w:val="22"/>
+        </w:rPr>
+        <w:t xml:space="preserve">Example 1: Verb → noun</w:t>
+      </w:r>
+    </w:p>
+    <w:tbl>
+      <w:tblPr>
+        <w:tblStyle w:val="aff2"/>
+        <w:tblW w:w="0" w:type="auto"/>
+        <w:tblLook w:val="04A0" w:firstRow="1" w:lastRow="0" w:firstColumn="1" w:lastColumn="0" w:noHBand="0" w:noVBand="1"/>
+      </w:tblPr>
+      <w:tblGrid>
+        <w:gridCol w:w="2605"/>
+        <w:gridCol w:w="6745"/>
+      </w:tblGrid>
+      <w:tr>
+        <w:tc>
+          <w:tcPr>
+            <w:tcW w:w="2605" w:type="dxa"/>
+            <w:shd w:val="clear" w:color="auto" w:fill="DEEBF7"/>
+          </w:tcPr>
+          <w:p>
+            <w:pPr/>
+            <w:r>
+              <w:rPr>
+                <w:rFonts w:ascii="Times New Roman" w:hAnsi="Times New Roman" w:cs="Times New Roman"/>
+                <w:sz w:val="22"/>
+                <w:szCs w:val="22"/>
+              </w:rPr>
+              <w:t xml:space="preserve">Plain:</w:t>
+            </w:r>
+          </w:p>
+        </w:tc>
+        <w:tc>
+          <w:tcPr>
+            <w:tcW w:w="6745" w:type="dxa"/>
+            <w:shd w:val="clear" w:color="auto" w:fill="DEEBF7"/>
+          </w:tcPr>
+          <w:p>
+            <w:pPr/>
+            <w:r>
+              <w:rPr>
+                <w:rFonts w:ascii="Times New Roman" w:hAnsi="Times New Roman" w:cs="Times New Roman"/>
+                <w:sz w:val="22"/>
+                <w:szCs w:val="22"/>
+              </w:rPr>
+              <w:t xml:space="preserve">The school decided to introduce e-books, and students supported this.</w:t>
+            </w:r>
+          </w:p>
+        </w:tc>
+      </w:tr>
+      <w:tr>
+        <w:tc>
+          <w:tcPr>
+            <w:tcW w:w="2605" w:type="dxa"/>
+            <w:shd w:val="clear" w:color="auto" w:fill="DEEBF7"/>
+          </w:tcPr>
+          <w:p>
+            <w:pPr/>
+            <w:r>
+              <w:rPr>
+                <w:rFonts w:ascii="Times New Roman" w:hAnsi="Times New Roman" w:cs="Times New Roman"/>
+                <w:sz w:val="22"/>
+                <w:szCs w:val="22"/>
+              </w:rPr>
+              <w:t xml:space="preserve">More formal:</w:t>
+            </w:r>
+          </w:p>
+        </w:tc>
+        <w:tc>
+          <w:tcPr>
+            <w:tcW w:w="6745" w:type="dxa"/>
+            <w:shd w:val="clear" w:color="auto" w:fill="DEEBF7"/>
+          </w:tcPr>
+          <w:p>
+            <w:pPr/>
+            <w:r>
+              <w:rPr>
+                <w:rFonts w:ascii="Times New Roman" w:hAnsi="Times New Roman" w:cs="Times New Roman"/>
+                <w:sz w:val="22"/>
+                <w:szCs w:val="22"/>
+              </w:rPr>
+              <w:t xml:space="preserve">The school’s decision to introduce e-books won students’ support.</w:t>
+            </w:r>
+          </w:p>
+        </w:tc>
+      </w:tr>
+    </w:tbl>
+    <w:p>
+      <w:pPr>
+        <w:spacing w:line="360" w:lineRule="auto"/>
+        <w:pBdr>
+          <w:top w:val="single" w:sz="4" w:space="4" w:color="auto"/>
+          <w:left w:val="single" w:sz="4" w:space="4" w:color="auto"/>
+          <w:bottom w:val="single" w:sz="4" w:space="4" w:color="auto"/>
+          <w:right w:val="single" w:sz="4" w:space="4" w:color="auto"/>
+        </w:pBdr>
+      </w:pPr>
+      <w:r>
+        <w:rPr>
+          <w:rFonts w:ascii="Times New Roman" w:hAnsi="Times New Roman" w:cs="Times New Roman"/>
+          <w:sz w:val="22"/>
+          <w:szCs w:val="22"/>
+        </w:rPr>
+        <w:t xml:space="preserve">The school’s decision to introduce e-books won students’ support. The introduction of the new system also saved paper and lightened schoolbags, and teachers soon noticed a rise in reading time. Other schools could follow this example with little extra cost.</w:t>
+      </w:r>
+    </w:p>
+    <w:p>
+      <w:pPr>
+        <w:pStyle w:val="31"/>
+        <w:spacing w:line="360" w:lineRule="auto"/>
+      </w:pPr>
+      <w:r>
+        <w:rPr>
+          <w:rFonts w:ascii="Times New Roman" w:hAnsi="Times New Roman" w:cs="Times New Roman"/>
+          <w:b/>
+          <w:sz w:val="22"/>
+          <w:szCs w:val="22"/>
+        </w:rPr>
+        <w:t xml:space="preserve">Example 2: Adjective → noun</w:t>
+      </w:r>
+    </w:p>
+    <w:tbl>
+      <w:tblPr>
+        <w:tblStyle w:val="aff2"/>
+        <w:tblW w:w="0" w:type="auto"/>
+        <w:tblLook w:val="04A0" w:firstRow="1" w:lastRow="0" w:firstColumn="1" w:lastColumn="0" w:noHBand="0" w:noVBand="1"/>
+      </w:tblPr>
+      <w:tblGrid>
+        <w:gridCol w:w="2605"/>
+        <w:gridCol w:w="6745"/>
+      </w:tblGrid>
+      <w:tr>
+        <w:tc>
+          <w:tcPr>
+            <w:tcW w:w="2605" w:type="dxa"/>
+            <w:shd w:val="clear" w:color="auto" w:fill="DEEBF7"/>
+          </w:tcPr>
+          <w:p>
+            <w:pPr/>
+            <w:r>
+              <w:rPr>
+                <w:rFonts w:ascii="Times New Roman" w:hAnsi="Times New Roman" w:cs="Times New Roman"/>
+                <w:sz w:val="22"/>
+                <w:szCs w:val="22"/>
+              </w:rPr>
+              <w:t xml:space="preserve">Plain:</w:t>
+            </w:r>
+          </w:p>
+        </w:tc>
+        <w:tc>
+          <w:tcPr>
+            <w:tcW w:w="6745" w:type="dxa"/>
+            <w:shd w:val="clear" w:color="auto" w:fill="DEEBF7"/>
+          </w:tcPr>
+          <w:p>
+            <w:pPr/>
+            <w:r>
+              <w:rPr>
+                <w:rFonts w:ascii="Times New Roman" w:hAnsi="Times New Roman" w:cs="Times New Roman"/>
+                <w:sz w:val="22"/>
+                <w:szCs w:val="22"/>
+              </w:rPr>
+              <w:t xml:space="preserve">Students should be aware of online scams.</w:t>
+            </w:r>
+          </w:p>
+        </w:tc>
+      </w:tr>
+      <w:tr>
+        <w:tc>
+          <w:tcPr>
+            <w:tcW w:w="2605" w:type="dxa"/>
+            <w:shd w:val="clear" w:color="auto" w:fill="DEEBF7"/>
+          </w:tcPr>
+          <w:p>
+            <w:pPr/>
+            <w:r>
+              <w:rPr>
+                <w:rFonts w:ascii="Times New Roman" w:hAnsi="Times New Roman" w:cs="Times New Roman"/>
+                <w:sz w:val="22"/>
+                <w:szCs w:val="22"/>
+              </w:rPr>
+              <w:t xml:space="preserve">More formal:</w:t>
+            </w:r>
+          </w:p>
+        </w:tc>
+        <w:tc>
+          <w:tcPr>
+            <w:tcW w:w="6745" w:type="dxa"/>
+            <w:shd w:val="clear" w:color="auto" w:fill="DEEBF7"/>
+          </w:tcPr>
+          <w:p>
+            <w:pPr/>
+            <w:r>
+              <w:rPr>
+                <w:rFonts w:ascii="Times New Roman" w:hAnsi="Times New Roman" w:cs="Times New Roman"/>
+                <w:sz w:val="22"/>
+                <w:szCs w:val="22"/>
+              </w:rPr>
+              <w:t xml:space="preserve">Students should show awareness of online scams.</w:t>
+            </w:r>
+          </w:p>
+        </w:tc>
+      </w:tr>
+    </w:tbl>
+    <w:p>
+      <w:pPr>
+        <w:spacing w:line="360" w:lineRule="auto"/>
+        <w:pBdr>
+          <w:top w:val="single" w:sz="4" w:space="4" w:color="auto"/>
+          <w:left w:val="single" w:sz="4" w:space="4" w:color="auto"/>
+          <w:bottom w:val="single" w:sz="4" w:space="4" w:color="auto"/>
+          <w:right w:val="single" w:sz="4" w:space="4" w:color="auto"/>
+        </w:pBdr>
+      </w:pPr>
+      <w:r>
+        <w:rPr>
+          <w:rFonts w:ascii="Times New Roman" w:hAnsi="Times New Roman" w:cs="Times New Roman"/>
+          <w:sz w:val="22"/>
+          <w:szCs w:val="22"/>
+        </w:rPr>
+        <w:t xml:space="preserve">Students should show awareness of online scams. The danger is real and growing, yet many victims discover the fraud only after money has already been lost, which means the damage is done. A short lesson on spotting false messages would build this awareness early.</w:t>
+      </w:r>
+    </w:p>
+    <w:p>
+      <w:pPr>
+        <w:pStyle w:val="31"/>
+        <w:spacing w:line="360" w:lineRule="auto"/>
+      </w:pPr>
+      <w:r>
+        <w:rPr>
+          <w:rFonts w:ascii="Times New Roman" w:hAnsi="Times New Roman" w:cs="Times New Roman"/>
+          <w:b/>
+          <w:sz w:val="22"/>
+          <w:szCs w:val="22"/>
+        </w:rPr>
+        <w:t xml:space="preserve">Example 3: Because-clause → noun phrase</w:t>
+      </w:r>
+    </w:p>
+    <w:tbl>
+      <w:tblPr>
+        <w:tblStyle w:val="aff2"/>
+        <w:tblW w:w="0" w:type="auto"/>
+        <w:tblLook w:val="04A0" w:firstRow="1" w:lastRow="0" w:firstColumn="1" w:lastColumn="0" w:noHBand="0" w:noVBand="1"/>
+      </w:tblPr>
+      <w:tblGrid>
+        <w:gridCol w:w="2605"/>
+        <w:gridCol w:w="6745"/>
+      </w:tblGrid>
+      <w:tr>
+        <w:tc>
+          <w:tcPr>
+            <w:tcW w:w="2605" w:type="dxa"/>
+            <w:shd w:val="clear" w:color="auto" w:fill="DEEBF7"/>
+          </w:tcPr>
+          <w:p>
+            <w:pPr/>
+            <w:r>
+              <w:rPr>
+                <w:rFonts w:ascii="Times New Roman" w:hAnsi="Times New Roman" w:cs="Times New Roman"/>
+                <w:sz w:val="22"/>
+                <w:szCs w:val="22"/>
+              </w:rPr>
+              <w:t xml:space="preserve">Plain:</w:t>
+            </w:r>
+          </w:p>
+        </w:tc>
+        <w:tc>
+          <w:tcPr>
+            <w:tcW w:w="6745" w:type="dxa"/>
+            <w:shd w:val="clear" w:color="auto" w:fill="DEEBF7"/>
+          </w:tcPr>
+          <w:p>
+            <w:pPr/>
+            <w:r>
+              <w:rPr>
+                <w:rFonts w:ascii="Times New Roman" w:hAnsi="Times New Roman" w:cs="Times New Roman"/>
+                <w:sz w:val="22"/>
+                <w:szCs w:val="22"/>
+              </w:rPr>
+              <w:t xml:space="preserve">Because people share news very quickly, rumours spread fast.</w:t>
+            </w:r>
+          </w:p>
+        </w:tc>
+      </w:tr>
+      <w:tr>
+        <w:tc>
+          <w:tcPr>
+            <w:tcW w:w="2605" w:type="dxa"/>
+            <w:shd w:val="clear" w:color="auto" w:fill="DEEBF7"/>
+          </w:tcPr>
+          <w:p>
+            <w:pPr/>
+            <w:r>
+              <w:rPr>
+                <w:rFonts w:ascii="Times New Roman" w:hAnsi="Times New Roman" w:cs="Times New Roman"/>
+                <w:sz w:val="22"/>
+                <w:szCs w:val="22"/>
+              </w:rPr>
+              <w:t xml:space="preserve">More formal:</w:t>
+            </w:r>
+          </w:p>
+        </w:tc>
+        <w:tc>
+          <w:tcPr>
+            <w:tcW w:w="6745" w:type="dxa"/>
+            <w:shd w:val="clear" w:color="auto" w:fill="DEEBF7"/>
+          </w:tcPr>
+          <w:p>
+            <w:pPr/>
+            <w:r>
+              <w:rPr>
+                <w:rFonts w:ascii="Times New Roman" w:hAnsi="Times New Roman" w:cs="Times New Roman"/>
+                <w:sz w:val="22"/>
+                <w:szCs w:val="22"/>
+              </w:rPr>
+              <w:t xml:space="preserve">Owing to the rapid sharing of news, rumours spread quickly.</w:t>
+            </w:r>
+          </w:p>
+        </w:tc>
+      </w:tr>
+    </w:tbl>
+    <w:p>
+      <w:pPr>
+        <w:spacing w:line="360" w:lineRule="auto"/>
+        <w:pBdr>
+          <w:top w:val="single" w:sz="4" w:space="4" w:color="auto"/>
+          <w:left w:val="single" w:sz="4" w:space="4" w:color="auto"/>
+          <w:bottom w:val="single" w:sz="4" w:space="4" w:color="auto"/>
+          <w:right w:val="single" w:sz="4" w:space="4" w:color="auto"/>
+        </w:pBdr>
+      </w:pPr>
+      <w:r>
+        <w:rPr>
+          <w:rFonts w:ascii="Times New Roman" w:hAnsi="Times New Roman" w:cs="Times New Roman"/>
+          <w:sz w:val="22"/>
+          <w:szCs w:val="22"/>
+        </w:rPr>
+        <w:t xml:space="preserve">Owing to the rapid sharing of news, rumours spread quickly. A false story can reach thousands of people within minutes, and the difficulty of checking every update means that some readers forward it before anyone notices. Careful readers, therefore, pause and verify before sharing anything.</w:t>
+      </w:r>
+    </w:p>
+    <w:p>
+      <w:pPr>
+        <w:pStyle w:val="31"/>
+        <w:spacing w:line="360" w:lineRule="auto"/>
+      </w:pPr>
+      <w:r>
+        <w:rPr>
+          <w:rFonts w:ascii="Times New Roman" w:hAnsi="Times New Roman" w:cs="Times New Roman"/>
+          <w:b/>
+          <w:sz w:val="22"/>
+          <w:szCs w:val="22"/>
+        </w:rPr>
+        <w:t xml:space="preserve">Example 4: If-clause → noun phrase</w:t>
+      </w:r>
+    </w:p>
+    <w:tbl>
+      <w:tblPr>
+        <w:tblStyle w:val="aff2"/>
+        <w:tblW w:w="0" w:type="auto"/>
+        <w:tblLook w:val="04A0" w:firstRow="1" w:lastRow="0" w:firstColumn="1" w:lastColumn="0" w:noHBand="0" w:noVBand="1"/>
+      </w:tblPr>
+      <w:tblGrid>
+        <w:gridCol w:w="2605"/>
+        <w:gridCol w:w="6745"/>
+      </w:tblGrid>
+      <w:tr>
+        <w:tc>
+          <w:tcPr>
+            <w:tcW w:w="2605" w:type="dxa"/>
+            <w:shd w:val="clear" w:color="auto" w:fill="DEEBF7"/>
+          </w:tcPr>
+          <w:p>
+            <w:pPr/>
+            <w:r>
+              <w:rPr>
+                <w:rFonts w:ascii="Times New Roman" w:hAnsi="Times New Roman" w:cs="Times New Roman"/>
+                <w:sz w:val="22"/>
+                <w:szCs w:val="22"/>
+              </w:rPr>
+              <w:t xml:space="preserve">Plain:</w:t>
+            </w:r>
+          </w:p>
+        </w:tc>
+        <w:tc>
+          <w:tcPr>
+            <w:tcW w:w="6745" w:type="dxa"/>
+            <w:shd w:val="clear" w:color="auto" w:fill="DEEBF7"/>
+          </w:tcPr>
+          <w:p>
+            <w:pPr/>
+            <w:r>
+              <w:rPr>
+                <w:rFonts w:ascii="Times New Roman" w:hAnsi="Times New Roman" w:cs="Times New Roman"/>
+                <w:sz w:val="22"/>
+                <w:szCs w:val="22"/>
+              </w:rPr>
+              <w:t xml:space="preserve">If the school does not update its computers, online lessons will fail.</w:t>
+            </w:r>
+          </w:p>
+        </w:tc>
+      </w:tr>
+      <w:tr>
+        <w:tc>
+          <w:tcPr>
+            <w:tcW w:w="2605" w:type="dxa"/>
+            <w:shd w:val="clear" w:color="auto" w:fill="DEEBF7"/>
+          </w:tcPr>
+          <w:p>
+            <w:pPr/>
+            <w:r>
+              <w:rPr>
+                <w:rFonts w:ascii="Times New Roman" w:hAnsi="Times New Roman" w:cs="Times New Roman"/>
+                <w:sz w:val="22"/>
+                <w:szCs w:val="22"/>
+              </w:rPr>
+              <w:t xml:space="preserve">More formal:</w:t>
+            </w:r>
+          </w:p>
+        </w:tc>
+        <w:tc>
+          <w:tcPr>
+            <w:tcW w:w="6745" w:type="dxa"/>
+            <w:shd w:val="clear" w:color="auto" w:fill="DEEBF7"/>
+          </w:tcPr>
+          <w:p>
+            <w:pPr/>
+            <w:r>
+              <w:rPr>
+                <w:rFonts w:ascii="Times New Roman" w:hAnsi="Times New Roman" w:cs="Times New Roman"/>
+                <w:sz w:val="22"/>
+                <w:szCs w:val="22"/>
+              </w:rPr>
+              <w:t xml:space="preserve">Without updated computers, online lessons will fail.</w:t>
+            </w:r>
+          </w:p>
+        </w:tc>
+      </w:tr>
+    </w:tbl>
+    <w:p>
+      <w:pPr>
+        <w:spacing w:line="360" w:lineRule="auto"/>
+        <w:pBdr>
+          <w:top w:val="single" w:sz="4" w:space="4" w:color="auto"/>
+          <w:left w:val="single" w:sz="4" w:space="4" w:color="auto"/>
+          <w:bottom w:val="single" w:sz="4" w:space="4" w:color="auto"/>
+          <w:right w:val="single" w:sz="4" w:space="4" w:color="auto"/>
+        </w:pBdr>
+      </w:pPr>
+      <w:r>
+        <w:rPr>
+          <w:rFonts w:ascii="Times New Roman" w:hAnsi="Times New Roman" w:cs="Times New Roman"/>
+          <w:sz w:val="22"/>
+          <w:szCs w:val="22"/>
+        </w:rPr>
+        <w:t xml:space="preserve">Without updated computers, online lessons will fail. The school’s plan to renew its equipment, however, has already won support from the Parent-Teacher Association, and teachers have promised to test the new system before the start of term.</w:t>
+      </w:r>
+    </w:p>
+    <w:p>
+      <w:pPr>
+        <w:spacing w:line="360" w:lineRule="auto"/>
+      </w:pPr>
+      <w:r>
+        <w:rPr>
+          <w:rFonts w:ascii="Times New Roman" w:hAnsi="Times New Roman" w:cs="Times New Roman"/>
+          <w:sz w:val="22"/>
+          <w:szCs w:val="22"/>
+        </w:rPr>
+        <w:t xml:space="preserve"/>
+      </w:r>
+    </w:p>
+    <w:p>
+      <w:pPr>
+        <w:pStyle w:val="1"/>
+        <w:spacing w:line="360" w:lineRule="auto"/>
+      </w:pPr>
+      <w:r>
+        <w:rPr>
+          <w:rFonts w:ascii="Times New Roman" w:hAnsi="Times New Roman" w:cs="Times New Roman"/>
+          <w:b/>
+        </w:rPr>
+        <w:t xml:space="preserve">Part 3: Practice sets</w:t>
+      </w:r>
+    </w:p>
+    <w:p>
+      <w:pPr>
+        <w:spacing w:line="360" w:lineRule="auto"/>
+      </w:pPr>
+      <w:r>
+        <w:rPr>
+          <w:rFonts w:ascii="Times New Roman" w:hAnsi="Times New Roman" w:cs="Times New Roman"/>
+          <w:sz w:val="22"/>
+          <w:szCs w:val="22"/>
+        </w:rPr>
+        <w:t xml:space="preserve">Rewrite each simple sentence using nominalisation. The sentences are about technology and communication, so keep the register formal. The last three sets (4, 5 and 6) are more challenging.</w:t>
+      </w:r>
+    </w:p>
     <w:p>
       <w:pPr>
         <w:pStyle w:val="31"/>

</xml_diff>

<commit_message>
v5: practice sets mirror the 4 example moves (1-3 easy with different nouns, 4-6 harder)
</commit_message>
<xml_diff>
--- a/Lesson 3 - Nominalisation (Student's).docx
+++ b/Lesson 3 - Nominalisation (Student's).docx
@@ -1511,7 +1511,7 @@
           <w:sz w:val="22"/>
           <w:szCs w:val="22"/>
         </w:rPr>
-        <w:t xml:space="preserve">Example Set 1 (Turn verbs into nouns)</w:t>
+        <w:t xml:space="preserve">Example Set 1 (Verb → noun)</w:t>
       </w:r>
     </w:p>
     <w:tbl>
@@ -1640,136 +1640,7 @@
           <w:sz w:val="22"/>
           <w:szCs w:val="22"/>
         </w:rPr>
-        <w:t xml:space="preserve">Example Set 2 (Turn verbs into nouns)</w:t>
-      </w:r>
-    </w:p>
-    <w:tbl>
-      <w:tblPr>
-        <w:tblStyle w:val="aff2"/>
-        <w:tblW w:w="0" w:type="auto"/>
-        <w:tblLook w:val="04A0" w:firstRow="1" w:lastRow="0" w:firstColumn="1" w:lastColumn="0" w:noHBand="0" w:noVBand="1"/>
-      </w:tblPr>
-      <w:tblGrid>
-        <w:gridCol w:w="2605"/>
-        <w:gridCol w:w="6745"/>
-      </w:tblGrid>
-      <w:tr>
-        <w:tc>
-          <w:tcPr>
-            <w:tcW w:w="2605" w:type="dxa"/>
-          </w:tcPr>
-          <w:p>
-            <w:pPr/>
-            <w:r>
-              <w:rPr>
-                <w:rFonts w:ascii="Times New Roman" w:hAnsi="Times New Roman" w:cs="Times New Roman"/>
-                <w:sz w:val="22"/>
-                <w:szCs w:val="22"/>
-              </w:rPr>
-              <w:t xml:space="preserve">Simple sentence:</w:t>
-            </w:r>
-          </w:p>
-        </w:tc>
-        <w:tc>
-          <w:tcPr>
-            <w:tcW w:w="6745" w:type="dxa"/>
-          </w:tcPr>
-          <w:p>
-            <w:pPr/>
-            <w:r>
-              <w:rPr>
-                <w:rFonts w:ascii="Times New Roman" w:hAnsi="Times New Roman" w:cs="Times New Roman"/>
-                <w:sz w:val="22"/>
-                <w:szCs w:val="22"/>
-              </w:rPr>
-              <w:t xml:space="preserve">The school decided to introduce a new e-learning platform, and many students welcomed the idea.</w:t>
-            </w:r>
-          </w:p>
-        </w:tc>
-      </w:tr>
-      <w:tr>
-        <w:tc>
-          <w:tcPr>
-            <w:tcW w:w="2605" w:type="dxa"/>
-          </w:tcPr>
-          <w:p>
-            <w:pPr/>
-            <w:r>
-              <w:rPr>
-                <w:rFonts w:ascii="Times New Roman" w:hAnsi="Times New Roman" w:cs="Times New Roman"/>
-                <w:sz w:val="22"/>
-                <w:szCs w:val="22"/>
-              </w:rPr>
-              <w:t xml:space="preserve">Prompt:</w:t>
-            </w:r>
-          </w:p>
-        </w:tc>
-        <w:tc>
-          <w:tcPr>
-            <w:tcW w:w="6745" w:type="dxa"/>
-          </w:tcPr>
-          <w:p>
-            <w:pPr/>
-            <w:r>
-              <w:rPr>
-                <w:rFonts w:ascii="Times New Roman" w:hAnsi="Times New Roman" w:cs="Times New Roman"/>
-                <w:i/>
-                <w:sz w:val="22"/>
-                <w:szCs w:val="22"/>
-              </w:rPr>
-              <w:t xml:space="preserve">Turn ‘decided to introduce’ into a noun phrase that opens the sentence.</w:t>
-            </w:r>
-          </w:p>
-        </w:tc>
-      </w:tr>
-      <w:tr>
-        <w:tc>
-          <w:tcPr>
-            <w:tcW w:w="2605" w:type="dxa"/>
-          </w:tcPr>
-          <w:p>
-            <w:pPr/>
-            <w:r>
-              <w:rPr>
-                <w:rFonts w:ascii="Times New Roman" w:hAnsi="Times New Roman" w:cs="Times New Roman"/>
-                <w:sz w:val="22"/>
-                <w:szCs w:val="22"/>
-              </w:rPr>
-              <w:t xml:space="preserve"/>
-            </w:r>
-          </w:p>
-        </w:tc>
-        <w:tc>
-          <w:tcPr>
-            <w:tcW w:w="6745" w:type="dxa"/>
-          </w:tcPr>
-          <w:p>
-            <w:pPr/>
-            <w:r>
-              <w:rPr>
-                <w:rFonts w:ascii="Times New Roman" w:hAnsi="Times New Roman" w:cs="Times New Roman"/>
-                <w:sz w:val="22"/>
-                <w:szCs w:val="22"/>
-              </w:rPr>
-              <w:t xml:space="preserve"/>
-            </w:r>
-          </w:p>
-        </w:tc>
-      </w:tr>
-    </w:tbl>
-    <w:p>
-      <w:pPr>
-        <w:pStyle w:val="31"/>
-        <w:spacing w:line="360" w:lineRule="auto"/>
-      </w:pPr>
-      <w:r>
-        <w:rPr>
-          <w:rFonts w:ascii="Times New Roman" w:hAnsi="Times New Roman" w:cs="Times New Roman"/>
-          <w:b/>
-          <w:sz w:val="22"/>
-          <w:szCs w:val="22"/>
-        </w:rPr>
-        <w:t xml:space="preserve">Example Set 3 (Turn adjectives into nouns)</w:t>
+        <w:t xml:space="preserve">Example Set 2 (Adjective → noun)</w:t>
       </w:r>
     </w:p>
     <w:tbl>
@@ -1898,7 +1769,265 @@
           <w:sz w:val="22"/>
           <w:szCs w:val="22"/>
         </w:rPr>
-        <w:t xml:space="preserve">Example Set 4 (Turn adjectives into nouns)</w:t>
+        <w:t xml:space="preserve">Example Set 3 (Because-clause → noun phrase)</w:t>
+      </w:r>
+    </w:p>
+    <w:tbl>
+      <w:tblPr>
+        <w:tblStyle w:val="aff2"/>
+        <w:tblW w:w="0" w:type="auto"/>
+        <w:tblLook w:val="04A0" w:firstRow="1" w:lastRow="0" w:firstColumn="1" w:lastColumn="0" w:noHBand="0" w:noVBand="1"/>
+      </w:tblPr>
+      <w:tblGrid>
+        <w:gridCol w:w="2605"/>
+        <w:gridCol w:w="6745"/>
+      </w:tblGrid>
+      <w:tr>
+        <w:tc>
+          <w:tcPr>
+            <w:tcW w:w="2605" w:type="dxa"/>
+          </w:tcPr>
+          <w:p>
+            <w:pPr/>
+            <w:r>
+              <w:rPr>
+                <w:rFonts w:ascii="Times New Roman" w:hAnsi="Times New Roman" w:cs="Times New Roman"/>
+                <w:sz w:val="22"/>
+                <w:szCs w:val="22"/>
+              </w:rPr>
+              <w:t xml:space="preserve">Simple sentence:</w:t>
+            </w:r>
+          </w:p>
+        </w:tc>
+        <w:tc>
+          <w:tcPr>
+            <w:tcW w:w="6745" w:type="dxa"/>
+          </w:tcPr>
+          <w:p>
+            <w:pPr/>
+            <w:r>
+              <w:rPr>
+                <w:rFonts w:ascii="Times New Roman" w:hAnsi="Times New Roman" w:cs="Times New Roman"/>
+                <w:sz w:val="22"/>
+                <w:szCs w:val="22"/>
+              </w:rPr>
+              <w:t xml:space="preserve">Because online games are so attractive, many teenagers neglect their homework.</w:t>
+            </w:r>
+          </w:p>
+        </w:tc>
+      </w:tr>
+      <w:tr>
+        <w:tc>
+          <w:tcPr>
+            <w:tcW w:w="2605" w:type="dxa"/>
+          </w:tcPr>
+          <w:p>
+            <w:pPr/>
+            <w:r>
+              <w:rPr>
+                <w:rFonts w:ascii="Times New Roman" w:hAnsi="Times New Roman" w:cs="Times New Roman"/>
+                <w:sz w:val="22"/>
+                <w:szCs w:val="22"/>
+              </w:rPr>
+              <w:t xml:space="preserve">Prompt:</w:t>
+            </w:r>
+          </w:p>
+        </w:tc>
+        <w:tc>
+          <w:tcPr>
+            <w:tcW w:w="6745" w:type="dxa"/>
+          </w:tcPr>
+          <w:p>
+            <w:pPr/>
+            <w:r>
+              <w:rPr>
+                <w:rFonts w:ascii="Times New Roman" w:hAnsi="Times New Roman" w:cs="Times New Roman"/>
+                <w:i/>
+                <w:sz w:val="22"/>
+                <w:szCs w:val="22"/>
+              </w:rPr>
+              <w:t xml:space="preserve">Replace the ‘Because ...’ clause with a phrase beginning ‘Owing to the ...’.</w:t>
+            </w:r>
+          </w:p>
+        </w:tc>
+      </w:tr>
+      <w:tr>
+        <w:tc>
+          <w:tcPr>
+            <w:tcW w:w="2605" w:type="dxa"/>
+          </w:tcPr>
+          <w:p>
+            <w:pPr/>
+            <w:r>
+              <w:rPr>
+                <w:rFonts w:ascii="Times New Roman" w:hAnsi="Times New Roman" w:cs="Times New Roman"/>
+                <w:sz w:val="22"/>
+                <w:szCs w:val="22"/>
+              </w:rPr>
+              <w:t xml:space="preserve"/>
+            </w:r>
+          </w:p>
+        </w:tc>
+        <w:tc>
+          <w:tcPr>
+            <w:tcW w:w="6745" w:type="dxa"/>
+          </w:tcPr>
+          <w:p>
+            <w:pPr/>
+            <w:r>
+              <w:rPr>
+                <w:rFonts w:ascii="Times New Roman" w:hAnsi="Times New Roman" w:cs="Times New Roman"/>
+                <w:sz w:val="22"/>
+                <w:szCs w:val="22"/>
+              </w:rPr>
+              <w:t xml:space="preserve"/>
+            </w:r>
+          </w:p>
+        </w:tc>
+      </w:tr>
+    </w:tbl>
+    <w:p>
+      <w:pPr>
+        <w:pStyle w:val="31"/>
+        <w:spacing w:line="360" w:lineRule="auto"/>
+      </w:pPr>
+      <w:r>
+        <w:rPr>
+          <w:rFonts w:ascii="Times New Roman" w:hAnsi="Times New Roman" w:cs="Times New Roman"/>
+          <w:b/>
+          <w:sz w:val="22"/>
+          <w:szCs w:val="22"/>
+        </w:rPr>
+        <w:t xml:space="preserve">Example Set 4 (Verb → noun)</w:t>
+      </w:r>
+    </w:p>
+    <w:tbl>
+      <w:tblPr>
+        <w:tblStyle w:val="aff2"/>
+        <w:tblW w:w="0" w:type="auto"/>
+        <w:tblLook w:val="04A0" w:firstRow="1" w:lastRow="0" w:firstColumn="1" w:lastColumn="0" w:noHBand="0" w:noVBand="1"/>
+      </w:tblPr>
+      <w:tblGrid>
+        <w:gridCol w:w="2605"/>
+        <w:gridCol w:w="6745"/>
+      </w:tblGrid>
+      <w:tr>
+        <w:tc>
+          <w:tcPr>
+            <w:tcW w:w="2605" w:type="dxa"/>
+          </w:tcPr>
+          <w:p>
+            <w:pPr/>
+            <w:r>
+              <w:rPr>
+                <w:rFonts w:ascii="Times New Roman" w:hAnsi="Times New Roman" w:cs="Times New Roman"/>
+                <w:sz w:val="22"/>
+                <w:szCs w:val="22"/>
+              </w:rPr>
+              <w:t xml:space="preserve">Simple sentence:</w:t>
+            </w:r>
+          </w:p>
+        </w:tc>
+        <w:tc>
+          <w:tcPr>
+            <w:tcW w:w="6745" w:type="dxa"/>
+          </w:tcPr>
+          <w:p>
+            <w:pPr/>
+            <w:r>
+              <w:rPr>
+                <w:rFonts w:ascii="Times New Roman" w:hAnsi="Times New Roman" w:cs="Times New Roman"/>
+                <w:sz w:val="22"/>
+                <w:szCs w:val="22"/>
+              </w:rPr>
+              <w:t xml:space="preserve">The government will improve the security of online banking, which will protect customers.</w:t>
+            </w:r>
+          </w:p>
+        </w:tc>
+      </w:tr>
+      <w:tr>
+        <w:tc>
+          <w:tcPr>
+            <w:tcW w:w="2605" w:type="dxa"/>
+          </w:tcPr>
+          <w:p>
+            <w:pPr/>
+            <w:r>
+              <w:rPr>
+                <w:rFonts w:ascii="Times New Roman" w:hAnsi="Times New Roman" w:cs="Times New Roman"/>
+                <w:sz w:val="22"/>
+                <w:szCs w:val="22"/>
+              </w:rPr>
+              <w:t xml:space="preserve">Prompt:</w:t>
+            </w:r>
+          </w:p>
+        </w:tc>
+        <w:tc>
+          <w:tcPr>
+            <w:tcW w:w="6745" w:type="dxa"/>
+          </w:tcPr>
+          <w:p>
+            <w:pPr/>
+            <w:r>
+              <w:rPr>
+                <w:rFonts w:ascii="Times New Roman" w:hAnsi="Times New Roman" w:cs="Times New Roman"/>
+                <w:i/>
+                <w:sz w:val="22"/>
+                <w:szCs w:val="22"/>
+              </w:rPr>
+              <w:t xml:space="preserve">Turn ‘will improve’ into a noun and begin with ‘The improvement of ...’.</w:t>
+            </w:r>
+          </w:p>
+        </w:tc>
+      </w:tr>
+      <w:tr>
+        <w:tc>
+          <w:tcPr>
+            <w:tcW w:w="2605" w:type="dxa"/>
+          </w:tcPr>
+          <w:p>
+            <w:pPr/>
+            <w:r>
+              <w:rPr>
+                <w:rFonts w:ascii="Times New Roman" w:hAnsi="Times New Roman" w:cs="Times New Roman"/>
+                <w:sz w:val="22"/>
+                <w:szCs w:val="22"/>
+              </w:rPr>
+              <w:t xml:space="preserve"/>
+            </w:r>
+          </w:p>
+        </w:tc>
+        <w:tc>
+          <w:tcPr>
+            <w:tcW w:w="6745" w:type="dxa"/>
+          </w:tcPr>
+          <w:p>
+            <w:pPr/>
+            <w:r>
+              <w:rPr>
+                <w:rFonts w:ascii="Times New Roman" w:hAnsi="Times New Roman" w:cs="Times New Roman"/>
+                <w:sz w:val="22"/>
+                <w:szCs w:val="22"/>
+              </w:rPr>
+              <w:t xml:space="preserve"/>
+            </w:r>
+          </w:p>
+        </w:tc>
+      </w:tr>
+    </w:tbl>
+    <w:p>
+      <w:pPr>
+        <w:pStyle w:val="31"/>
+        <w:spacing w:line="360" w:lineRule="auto"/>
+      </w:pPr>
+      <w:r>
+        <w:rPr>
+          <w:rFonts w:ascii="Times New Roman" w:hAnsi="Times New Roman" w:cs="Times New Roman"/>
+          <w:b/>
+          <w:sz w:val="22"/>
+          <w:szCs w:val="22"/>
+        </w:rPr>
+        <w:t xml:space="preserve">Example Set 5 (Adjective → noun)</w:t>
       </w:r>
     </w:p>
     <w:tbl>
@@ -2027,136 +2156,7 @@
           <w:sz w:val="22"/>
           <w:szCs w:val="22"/>
         </w:rPr>
-        <w:t xml:space="preserve">Example Set 5 (Turn because / if clauses into noun phrases)</w:t>
-      </w:r>
-    </w:p>
-    <w:tbl>
-      <w:tblPr>
-        <w:tblStyle w:val="aff2"/>
-        <w:tblW w:w="0" w:type="auto"/>
-        <w:tblLook w:val="04A0" w:firstRow="1" w:lastRow="0" w:firstColumn="1" w:lastColumn="0" w:noHBand="0" w:noVBand="1"/>
-      </w:tblPr>
-      <w:tblGrid>
-        <w:gridCol w:w="2605"/>
-        <w:gridCol w:w="6745"/>
-      </w:tblGrid>
-      <w:tr>
-        <w:tc>
-          <w:tcPr>
-            <w:tcW w:w="2605" w:type="dxa"/>
-          </w:tcPr>
-          <w:p>
-            <w:pPr/>
-            <w:r>
-              <w:rPr>
-                <w:rFonts w:ascii="Times New Roman" w:hAnsi="Times New Roman" w:cs="Times New Roman"/>
-                <w:sz w:val="22"/>
-                <w:szCs w:val="22"/>
-              </w:rPr>
-              <w:t xml:space="preserve">Simple sentence:</w:t>
-            </w:r>
-          </w:p>
-        </w:tc>
-        <w:tc>
-          <w:tcPr>
-            <w:tcW w:w="6745" w:type="dxa"/>
-          </w:tcPr>
-          <w:p>
-            <w:pPr/>
-            <w:r>
-              <w:rPr>
-                <w:rFonts w:ascii="Times New Roman" w:hAnsi="Times New Roman" w:cs="Times New Roman"/>
-                <w:sz w:val="22"/>
-                <w:szCs w:val="22"/>
-              </w:rPr>
-              <w:t xml:space="preserve">Because technology is developing very quickly, schools have to keep updating their computers and software.</w:t>
-            </w:r>
-          </w:p>
-        </w:tc>
-      </w:tr>
-      <w:tr>
-        <w:tc>
-          <w:tcPr>
-            <w:tcW w:w="2605" w:type="dxa"/>
-          </w:tcPr>
-          <w:p>
-            <w:pPr/>
-            <w:r>
-              <w:rPr>
-                <w:rFonts w:ascii="Times New Roman" w:hAnsi="Times New Roman" w:cs="Times New Roman"/>
-                <w:sz w:val="22"/>
-                <w:szCs w:val="22"/>
-              </w:rPr>
-              <w:t xml:space="preserve">Prompt:</w:t>
-            </w:r>
-          </w:p>
-        </w:tc>
-        <w:tc>
-          <w:tcPr>
-            <w:tcW w:w="6745" w:type="dxa"/>
-          </w:tcPr>
-          <w:p>
-            <w:pPr/>
-            <w:r>
-              <w:rPr>
-                <w:rFonts w:ascii="Times New Roman" w:hAnsi="Times New Roman" w:cs="Times New Roman"/>
-                <w:i/>
-                <w:sz w:val="22"/>
-                <w:szCs w:val="22"/>
-              </w:rPr>
-              <w:t xml:space="preserve">Replace the whole ‘Because ...’ clause with a phrase beginning ‘Owing to the rapid ...’.</w:t>
-            </w:r>
-          </w:p>
-        </w:tc>
-      </w:tr>
-      <w:tr>
-        <w:tc>
-          <w:tcPr>
-            <w:tcW w:w="2605" w:type="dxa"/>
-          </w:tcPr>
-          <w:p>
-            <w:pPr/>
-            <w:r>
-              <w:rPr>
-                <w:rFonts w:ascii="Times New Roman" w:hAnsi="Times New Roman" w:cs="Times New Roman"/>
-                <w:sz w:val="22"/>
-                <w:szCs w:val="22"/>
-              </w:rPr>
-              <w:t xml:space="preserve"/>
-            </w:r>
-          </w:p>
-        </w:tc>
-        <w:tc>
-          <w:tcPr>
-            <w:tcW w:w="6745" w:type="dxa"/>
-          </w:tcPr>
-          <w:p>
-            <w:pPr/>
-            <w:r>
-              <w:rPr>
-                <w:rFonts w:ascii="Times New Roman" w:hAnsi="Times New Roman" w:cs="Times New Roman"/>
-                <w:sz w:val="22"/>
-                <w:szCs w:val="22"/>
-              </w:rPr>
-              <w:t xml:space="preserve"/>
-            </w:r>
-          </w:p>
-        </w:tc>
-      </w:tr>
-    </w:tbl>
-    <w:p>
-      <w:pPr>
-        <w:pStyle w:val="31"/>
-        <w:spacing w:line="360" w:lineRule="auto"/>
-      </w:pPr>
-      <w:r>
-        <w:rPr>
-          <w:rFonts w:ascii="Times New Roman" w:hAnsi="Times New Roman" w:cs="Times New Roman"/>
-          <w:b/>
-          <w:sz w:val="22"/>
-          <w:szCs w:val="22"/>
-        </w:rPr>
-        <w:t xml:space="preserve">Example Set 6 (Turn because / if clauses into noun phrases)</w:t>
+        <w:t xml:space="preserve">Example Set 6 (If-clause → noun phrase)</w:t>
       </w:r>
     </w:p>
     <w:tbl>

</xml_diff>

<commit_message>
Round 6: writing task word bank (nominalise ONE of five verbs/adjectives)
- Instruction 2 now asks students to nominalise ONE word bank item + add
  ONE relative clause or inverted pattern (was: two noun phrases + RC)
- Student copy: lavender word bank box (protect/aware/educate/responsible/believe)
- Teacher copy: grey answers box (arrow forms) + note on sample modelling
</commit_message>
<xml_diff>
--- a/Lesson 3 - Nominalisation (Student's).docx
+++ b/Lesson 3 - Nominalisation (Student's).docx
@@ -2344,7 +2344,47 @@
           <w:sz w:val="22"/>
           <w:szCs w:val="22"/>
         </w:rPr>
-        <w:t xml:space="preserve">2. Use TWO noun phrases formed by nominalisation and ONE relative clause.</w:t>
+        <w:t xml:space="preserve">2. Nominalise ONE of the words in the word bank below and use the noun in your paragraph. Also add ONE relative clause or ONE inverted pattern (e.g. Not only … but also …; Never …; Rarely …).</w:t>
+      </w:r>
+    </w:p>
+    <w:p>
+      <w:pPr>
+        <w:spacing w:line="360" w:lineRule="auto"/>
+        <w:pBdr>
+          <w:top w:val="single" w:sz="4" w:space="4" w:color="auto"/>
+          <w:left w:val="single" w:sz="4" w:space="4" w:color="auto"/>
+          <w:bottom w:val="single" w:sz="4" w:space="4" w:color="auto"/>
+          <w:right w:val="single" w:sz="4" w:space="4" w:color="auto"/>
+        </w:pBdr>
+        <w:shd w:val="clear" w:color="auto" w:fill="E4DFEC"/>
+      </w:pPr>
+      <w:r>
+        <w:rPr>
+          <w:rFonts w:ascii="Times New Roman" w:hAnsi="Times New Roman" w:cs="Times New Roman"/>
+          <w:sz w:val="22"/>
+          <w:szCs w:val="22"/>
+        </w:rPr>
+        <w:t xml:space="preserve">Word bank — turn ONE of these five into a noun, then use it in your paragraph:</w:t>
+      </w:r>
+    </w:p>
+    <w:p>
+      <w:pPr>
+        <w:spacing w:line="360" w:lineRule="auto"/>
+        <w:pBdr>
+          <w:top w:val="single" w:sz="4" w:space="4" w:color="auto"/>
+          <w:left w:val="single" w:sz="4" w:space="4" w:color="auto"/>
+          <w:bottom w:val="single" w:sz="4" w:space="4" w:color="auto"/>
+          <w:right w:val="single" w:sz="4" w:space="4" w:color="auto"/>
+        </w:pBdr>
+        <w:shd w:val="clear" w:color="auto" w:fill="E4DFEC"/>
+      </w:pPr>
+      <w:r>
+        <w:rPr>
+          <w:rFonts w:ascii="Times New Roman" w:hAnsi="Times New Roman" w:cs="Times New Roman"/>
+          <w:sz w:val="22"/>
+          <w:szCs w:val="22"/>
+        </w:rPr>
+        <w:t xml:space="preserve">protect   ·   aware   ·   educate   ·   responsible   ·   believe</w:t>
       </w:r>
     </w:p>
     <w:p>

</xml_diff>

<commit_message>
Round 7: nominalisation as a linking device (cohesion)
- Part 2: new sub-section with 3 linked-sentence pairs (This/Such/The-of
  bridges, italic bridge nouns), demonstration paragraph, watch-out box
- Part 4: instruction 3 (open one sentence with a nominalised bridge) +
  all three samples reworked to carry one visible This+noun bridge
- Part 2 intro mentions the linking function
</commit_message>
<xml_diff>
--- a/Lesson 3 - Nominalisation (Student's).docx
+++ b/Lesson 3 - Nominalisation (Student's).docx
@@ -989,7 +989,7 @@
           <w:sz w:val="22"/>
           <w:szCs w:val="22"/>
         </w:rPr>
-        <w:t xml:space="preserve">Nominalisation names an action or a quality as a noun, so that ‘people use phones’ becomes ‘the use of phones’. It packs ideas into fewer words and gives formal writing a more academic tone, and it is one of the clearest signs of a higher band in DSE Paper 2.</w:t>
+        <w:t xml:space="preserve">Nominalisation names an action or a quality as a noun, so that ‘people use phones’ becomes ‘the use of phones’. It packs ideas into fewer words and gives formal writing a more academic tone, and it can also carry an idea from one sentence into the next. Together they are among the clearest signs of a higher band in DSE Paper 2.</w:t>
       </w:r>
     </w:p>
     <w:p>
@@ -1458,6 +1458,372 @@
           <w:szCs w:val="22"/>
         </w:rPr>
         <w:t xml:space="preserve">Without updated computers, online lessons will fail. The school’s plan to renew its equipment, however, has already won support from the Parent-Teacher Association, and teachers have promised to test the new system before the start of term.</w:t>
+      </w:r>
+    </w:p>
+    <w:p>
+      <w:pPr>
+        <w:pStyle w:val="31"/>
+        <w:spacing w:line="360" w:lineRule="auto"/>
+      </w:pPr>
+      <w:r>
+        <w:rPr>
+          <w:rFonts w:ascii="Times New Roman" w:hAnsi="Times New Roman" w:cs="Times New Roman"/>
+          <w:b/>
+          <w:sz w:val="22"/>
+          <w:szCs w:val="22"/>
+        </w:rPr>
+        <w:t xml:space="preserve">Nominalisation as a linking device</w:t>
+      </w:r>
+    </w:p>
+    <w:p>
+      <w:pPr>
+        <w:spacing w:line="360" w:lineRule="auto"/>
+      </w:pPr>
+      <w:r>
+        <w:rPr>
+          <w:rFonts w:ascii="Times New Roman" w:hAnsi="Times New Roman" w:cs="Times New Roman"/>
+          <w:sz w:val="22"/>
+          <w:szCs w:val="22"/>
+        </w:rPr>
+        <w:t xml:space="preserve">Nominalisation does more than tighten one sentence — it can carry an idea from the previous sentence into the next. Turn a verb or adjective into a noun, and open the new sentence with it (usually after ‘This’, ‘Such’ or ‘The … of’). The reader moves from an idea already met to a new one, and the paragraph flows more smoothly.</w:t>
+      </w:r>
+    </w:p>
+    <w:tbl>
+      <w:tblPr>
+        <w:tblStyle w:val="aff2"/>
+        <w:tblW w:w="0" w:type="auto"/>
+        <w:tblLook w:val="04A0" w:firstRow="1" w:lastRow="0" w:firstColumn="1" w:lastColumn="0" w:noHBand="0" w:noVBand="1"/>
+      </w:tblPr>
+      <w:tblGrid>
+        <w:gridCol w:w="2605"/>
+        <w:gridCol w:w="6745"/>
+      </w:tblGrid>
+      <w:tr>
+        <w:tc>
+          <w:tcPr>
+            <w:tcW w:w="2605" w:type="dxa"/>
+            <w:shd w:val="clear" w:color="auto" w:fill="DEEBF7"/>
+          </w:tcPr>
+          <w:p>
+            <w:pPr/>
+            <w:r>
+              <w:rPr>
+                <w:rFonts w:ascii="Times New Roman" w:hAnsi="Times New Roman" w:cs="Times New Roman"/>
+                <w:sz w:val="22"/>
+                <w:szCs w:val="22"/>
+              </w:rPr>
+              <w:t xml:space="preserve">Sentence 1:</w:t>
+            </w:r>
+          </w:p>
+        </w:tc>
+        <w:tc>
+          <w:tcPr>
+            <w:tcW w:w="6745" w:type="dxa"/>
+            <w:shd w:val="clear" w:color="auto" w:fill="DEEBF7"/>
+          </w:tcPr>
+          <w:p>
+            <w:pPr/>
+            <w:r>
+              <w:rPr>
+                <w:rFonts w:ascii="Times New Roman" w:hAnsi="Times New Roman" w:cs="Times New Roman"/>
+                <w:sz w:val="22"/>
+                <w:szCs w:val="22"/>
+              </w:rPr>
+              <w:t xml:space="preserve">Scammers play on panic and speed, so victims act before they think.</w:t>
+            </w:r>
+          </w:p>
+        </w:tc>
+      </w:tr>
+      <w:tr>
+        <w:tc>
+          <w:tcPr>
+            <w:tcW w:w="2605" w:type="dxa"/>
+            <w:shd w:val="clear" w:color="auto" w:fill="DEEBF7"/>
+          </w:tcPr>
+          <w:p>
+            <w:pPr/>
+            <w:r>
+              <w:rPr>
+                <w:rFonts w:ascii="Times New Roman" w:hAnsi="Times New Roman" w:cs="Times New Roman"/>
+                <w:sz w:val="22"/>
+                <w:szCs w:val="22"/>
+              </w:rPr>
+              <w:t xml:space="preserve">Linked sentence:</w:t>
+            </w:r>
+          </w:p>
+        </w:tc>
+        <w:tc>
+          <w:tcPr>
+            <w:tcW w:w="6745" w:type="dxa"/>
+            <w:shd w:val="clear" w:color="auto" w:fill="DEEBF7"/>
+          </w:tcPr>
+          <w:p>
+            <w:pPr/>
+            <w:r>
+              <w:rPr>
+                <w:rFonts w:ascii="Times New Roman" w:hAnsi="Times New Roman" w:cs="Times New Roman"/>
+                <w:sz w:val="22"/>
+                <w:szCs w:val="22"/>
+              </w:rPr>
+              <w:t xml:space="preserve">This </w:t>
+            </w:r>
+            <w:r>
+              <w:rPr>
+                <w:rFonts w:ascii="Times New Roman" w:hAnsi="Times New Roman" w:cs="Times New Roman"/>
+                <w:i/>
+                <w:sz w:val="22"/>
+                <w:szCs w:val="22"/>
+              </w:rPr>
+              <w:t xml:space="preserve">reliance</w:t>
+            </w:r>
+            <w:r>
+              <w:rPr>
+                <w:rFonts w:ascii="Times New Roman" w:hAnsi="Times New Roman" w:cs="Times New Roman"/>
+                <w:sz w:val="22"/>
+                <w:szCs w:val="22"/>
+              </w:rPr>
+              <w:t xml:space="preserve"> on emotion is exactly what the fraudsters count on.</w:t>
+            </w:r>
+          </w:p>
+        </w:tc>
+      </w:tr>
+    </w:tbl>
+    <w:tbl>
+      <w:tblPr>
+        <w:tblStyle w:val="aff2"/>
+        <w:tblW w:w="0" w:type="auto"/>
+        <w:tblLook w:val="04A0" w:firstRow="1" w:lastRow="0" w:firstColumn="1" w:lastColumn="0" w:noHBand="0" w:noVBand="1"/>
+      </w:tblPr>
+      <w:tblGrid>
+        <w:gridCol w:w="2605"/>
+        <w:gridCol w:w="6745"/>
+      </w:tblGrid>
+      <w:tr>
+        <w:tc>
+          <w:tcPr>
+            <w:tcW w:w="2605" w:type="dxa"/>
+            <w:shd w:val="clear" w:color="auto" w:fill="DEEBF7"/>
+          </w:tcPr>
+          <w:p>
+            <w:pPr/>
+            <w:r>
+              <w:rPr>
+                <w:rFonts w:ascii="Times New Roman" w:hAnsi="Times New Roman" w:cs="Times New Roman"/>
+                <w:sz w:val="22"/>
+                <w:szCs w:val="22"/>
+              </w:rPr>
+              <w:t xml:space="preserve">Sentence 1:</w:t>
+            </w:r>
+          </w:p>
+        </w:tc>
+        <w:tc>
+          <w:tcPr>
+            <w:tcW w:w="6745" w:type="dxa"/>
+            <w:shd w:val="clear" w:color="auto" w:fill="DEEBF7"/>
+          </w:tcPr>
+          <w:p>
+            <w:pPr/>
+            <w:r>
+              <w:rPr>
+                <w:rFonts w:ascii="Times New Roman" w:hAnsi="Times New Roman" w:cs="Times New Roman"/>
+                <w:sz w:val="22"/>
+                <w:szCs w:val="22"/>
+              </w:rPr>
+              <w:t xml:space="preserve">Most students are far more aware of online privacy than their parents were.</w:t>
+            </w:r>
+          </w:p>
+        </w:tc>
+      </w:tr>
+      <w:tr>
+        <w:tc>
+          <w:tcPr>
+            <w:tcW w:w="2605" w:type="dxa"/>
+            <w:shd w:val="clear" w:color="auto" w:fill="DEEBF7"/>
+          </w:tcPr>
+          <w:p>
+            <w:pPr/>
+            <w:r>
+              <w:rPr>
+                <w:rFonts w:ascii="Times New Roman" w:hAnsi="Times New Roman" w:cs="Times New Roman"/>
+                <w:sz w:val="22"/>
+                <w:szCs w:val="22"/>
+              </w:rPr>
+              <w:t xml:space="preserve">Linked sentence:</w:t>
+            </w:r>
+          </w:p>
+        </w:tc>
+        <w:tc>
+          <w:tcPr>
+            <w:tcW w:w="6745" w:type="dxa"/>
+            <w:shd w:val="clear" w:color="auto" w:fill="DEEBF7"/>
+          </w:tcPr>
+          <w:p>
+            <w:pPr/>
+            <w:r>
+              <w:rPr>
+                <w:rFonts w:ascii="Times New Roman" w:hAnsi="Times New Roman" w:cs="Times New Roman"/>
+                <w:sz w:val="22"/>
+                <w:szCs w:val="22"/>
+              </w:rPr>
+              <w:t xml:space="preserve">This growing </w:t>
+            </w:r>
+            <w:r>
+              <w:rPr>
+                <w:rFonts w:ascii="Times New Roman" w:hAnsi="Times New Roman" w:cs="Times New Roman"/>
+                <w:i/>
+                <w:sz w:val="22"/>
+                <w:szCs w:val="22"/>
+              </w:rPr>
+              <w:t xml:space="preserve">awareness</w:t>
+            </w:r>
+            <w:r>
+              <w:rPr>
+                <w:rFonts w:ascii="Times New Roman" w:hAnsi="Times New Roman" w:cs="Times New Roman"/>
+                <w:sz w:val="22"/>
+                <w:szCs w:val="22"/>
+              </w:rPr>
+              <w:t xml:space="preserve">, however, does not always protect them from clever scams.</w:t>
+            </w:r>
+          </w:p>
+        </w:tc>
+      </w:tr>
+    </w:tbl>
+    <w:tbl>
+      <w:tblPr>
+        <w:tblStyle w:val="aff2"/>
+        <w:tblW w:w="0" w:type="auto"/>
+        <w:tblLook w:val="04A0" w:firstRow="1" w:lastRow="0" w:firstColumn="1" w:lastColumn="0" w:noHBand="0" w:noVBand="1"/>
+      </w:tblPr>
+      <w:tblGrid>
+        <w:gridCol w:w="2605"/>
+        <w:gridCol w:w="6745"/>
+      </w:tblGrid>
+      <w:tr>
+        <w:tc>
+          <w:tcPr>
+            <w:tcW w:w="2605" w:type="dxa"/>
+            <w:shd w:val="clear" w:color="auto" w:fill="DEEBF7"/>
+          </w:tcPr>
+          <w:p>
+            <w:pPr/>
+            <w:r>
+              <w:rPr>
+                <w:rFonts w:ascii="Times New Roman" w:hAnsi="Times New Roman" w:cs="Times New Roman"/>
+                <w:sz w:val="22"/>
+                <w:szCs w:val="22"/>
+              </w:rPr>
+              <w:t xml:space="preserve">Sentence 1:</w:t>
+            </w:r>
+          </w:p>
+        </w:tc>
+        <w:tc>
+          <w:tcPr>
+            <w:tcW w:w="6745" w:type="dxa"/>
+            <w:shd w:val="clear" w:color="auto" w:fill="DEEBF7"/>
+          </w:tcPr>
+          <w:p>
+            <w:pPr/>
+            <w:r>
+              <w:rPr>
+                <w:rFonts w:ascii="Times New Roman" w:hAnsi="Times New Roman" w:cs="Times New Roman"/>
+                <w:sz w:val="22"/>
+                <w:szCs w:val="22"/>
+              </w:rPr>
+              <w:t xml:space="preserve">Schools can protect students by teaching online safety early.</w:t>
+            </w:r>
+          </w:p>
+        </w:tc>
+      </w:tr>
+      <w:tr>
+        <w:tc>
+          <w:tcPr>
+            <w:tcW w:w="2605" w:type="dxa"/>
+            <w:shd w:val="clear" w:color="auto" w:fill="DEEBF7"/>
+          </w:tcPr>
+          <w:p>
+            <w:pPr/>
+            <w:r>
+              <w:rPr>
+                <w:rFonts w:ascii="Times New Roman" w:hAnsi="Times New Roman" w:cs="Times New Roman"/>
+                <w:sz w:val="22"/>
+                <w:szCs w:val="22"/>
+              </w:rPr>
+              <w:t xml:space="preserve">Linked sentence:</w:t>
+            </w:r>
+          </w:p>
+        </w:tc>
+        <w:tc>
+          <w:tcPr>
+            <w:tcW w:w="6745" w:type="dxa"/>
+            <w:shd w:val="clear" w:color="auto" w:fill="DEEBF7"/>
+          </w:tcPr>
+          <w:p>
+            <w:pPr/>
+            <w:r>
+              <w:rPr>
+                <w:rFonts w:ascii="Times New Roman" w:hAnsi="Times New Roman" w:cs="Times New Roman"/>
+                <w:sz w:val="22"/>
+                <w:szCs w:val="22"/>
+              </w:rPr>
+              <w:t xml:space="preserve">This </w:t>
+            </w:r>
+            <w:r>
+              <w:rPr>
+                <w:rFonts w:ascii="Times New Roman" w:hAnsi="Times New Roman" w:cs="Times New Roman"/>
+                <w:i/>
+                <w:sz w:val="22"/>
+                <w:szCs w:val="22"/>
+              </w:rPr>
+              <w:t xml:space="preserve">education</w:t>
+            </w:r>
+            <w:r>
+              <w:rPr>
+                <w:rFonts w:ascii="Times New Roman" w:hAnsi="Times New Roman" w:cs="Times New Roman"/>
+                <w:sz w:val="22"/>
+                <w:szCs w:val="22"/>
+              </w:rPr>
+              <w:t xml:space="preserve"> should begin long before students own a phone.</w:t>
+            </w:r>
+          </w:p>
+        </w:tc>
+      </w:tr>
+    </w:tbl>
+    <w:p>
+      <w:pPr>
+        <w:spacing w:line="360" w:lineRule="auto"/>
+        <w:pBdr>
+          <w:top w:val="single" w:sz="4" w:space="4" w:color="auto"/>
+          <w:left w:val="single" w:sz="4" w:space="4" w:color="auto"/>
+          <w:bottom w:val="single" w:sz="4" w:space="4" w:color="auto"/>
+          <w:right w:val="single" w:sz="4" w:space="4" w:color="auto"/>
+        </w:pBdr>
+      </w:pPr>
+      <w:r>
+        <w:rPr>
+          <w:rFonts w:ascii="Times New Roman" w:hAnsi="Times New Roman" w:cs="Times New Roman"/>
+          <w:sz w:val="22"/>
+          <w:szCs w:val="22"/>
+        </w:rPr>
+        <w:t xml:space="preserve">Young people often trust official-looking messages without a second thought, and they seldom check who really sent them. Such misplaced trust is easily exploited: a credible-looking link is all a scammer needs. Such carelessness, in turn, keeps the fraud industry alive.</w:t>
+      </w:r>
+    </w:p>
+    <w:p>
+      <w:pPr>
+        <w:spacing w:line="360" w:lineRule="auto"/>
+        <w:pBdr>
+          <w:top w:val="single" w:sz="4" w:space="4" w:color="auto"/>
+          <w:left w:val="single" w:sz="4" w:space="4" w:color="auto"/>
+          <w:bottom w:val="single" w:sz="4" w:space="4" w:color="auto"/>
+          <w:right w:val="single" w:sz="4" w:space="4" w:color="auto"/>
+        </w:pBdr>
+      </w:pPr>
+      <w:r>
+        <w:rPr>
+          <w:rFonts w:ascii="Times New Roman" w:hAnsi="Times New Roman" w:cs="Times New Roman"/>
+          <w:sz w:val="22"/>
+          <w:szCs w:val="22"/>
+        </w:rPr>
+        <w:t xml:space="preserve">Watch out: avoid the over-used ‘This is because…’ and ‘This shows that…’. A noun bridge (“This reliance on emotion…”) says the same thing in fewer words and earns a higher band.</w:t>
       </w:r>
     </w:p>
     <w:p>
@@ -2364,6 +2730,26 @@
           <w:sz w:val="22"/>
           <w:szCs w:val="22"/>
         </w:rPr>
+        <w:t xml:space="preserve">3. Link your ideas: open at least ONE sentence with a nominalised noun phrase that refers back to the previous sentence (e.g. ‘This + noun’).</w:t>
+      </w:r>
+    </w:p>
+    <w:p>
+      <w:pPr>
+        <w:spacing w:line="360" w:lineRule="auto"/>
+        <w:pBdr>
+          <w:top w:val="single" w:sz="4" w:space="4" w:color="auto"/>
+          <w:left w:val="single" w:sz="4" w:space="4" w:color="auto"/>
+          <w:bottom w:val="single" w:sz="4" w:space="4" w:color="auto"/>
+          <w:right w:val="single" w:sz="4" w:space="4" w:color="auto"/>
+        </w:pBdr>
+        <w:shd w:val="clear" w:color="auto" w:fill="E4DFEC"/>
+      </w:pPr>
+      <w:r>
+        <w:rPr>
+          <w:rFonts w:ascii="Times New Roman" w:hAnsi="Times New Roman" w:cs="Times New Roman"/>
+          <w:sz w:val="22"/>
+          <w:szCs w:val="22"/>
+        </w:rPr>
         <w:t xml:space="preserve">Word bank — turn ONE of these five into a noun, then use it in your paragraph:</w:t>
       </w:r>
     </w:p>

</xml_diff>

<commit_message>
Round 8: trim linking section to one example; add consolidation set
- Linking sub-section: ONE plain-vs-nominalised example (This is because...
  vs Such misplaced trust), watch-out folded into the intro, no demo
  paragraph or extra pairs
- Part 3: new Example Set 7 (Linking) to consolidate the bridge move
- Part 3 intro now says sets 4-7 are more challenging
</commit_message>
<xml_diff>
--- a/Lesson 3 - Nominalisation (Student's).docx
+++ b/Lesson 3 - Nominalisation (Student's).docx
@@ -1485,7 +1485,7 @@
           <w:sz w:val="22"/>
           <w:szCs w:val="22"/>
         </w:rPr>
-        <w:t xml:space="preserve">Nominalisation does more than tighten one sentence — it can carry an idea from the previous sentence into the next. Turn a verb or adjective into a noun, and open the new sentence with it (usually after ‘This’, ‘Such’ or ‘The … of’). The reader moves from an idea already met to a new one, and the paragraph flows more smoothly.</w:t>
+        <w:t xml:space="preserve">Nominalisation can also link one sentence to the next: turn a verb or adjective into a noun and open the new sentence with it. Instead of the vague ‘This is because… / This shows that…’, use ‘This…’, ‘Such…’ or ‘The … of…’ — the noun bridge says the same thing in fewer words and earns a higher band.</w:t>
       </w:r>
     </w:p>
     <w:tbl>
@@ -1512,7 +1512,7 @@
                 <w:sz w:val="22"/>
                 <w:szCs w:val="22"/>
               </w:rPr>
-              <w:t xml:space="preserve">Sentence 1:</w:t>
+              <w:t xml:space="preserve">Plain (weak link):</w:t>
             </w:r>
           </w:p>
         </w:tc>
@@ -1529,7 +1529,7 @@
                 <w:sz w:val="22"/>
                 <w:szCs w:val="22"/>
               </w:rPr>
-              <w:t xml:space="preserve">Scammers play on panic and speed, so victims act before they think.</w:t>
+              <w:t xml:space="preserve">Many young people click on links without checking where they lead. This is because they trust whatever looks official.</w:t>
             </w:r>
           </w:p>
         </w:tc>
@@ -1548,7 +1548,7 @@
                 <w:sz w:val="22"/>
                 <w:szCs w:val="22"/>
               </w:rPr>
-              <w:t xml:space="preserve">Linked sentence:</w:t>
+              <w:t xml:space="preserve">Nominalised (This / Such + noun):</w:t>
             </w:r>
           </w:p>
         </w:tc>
@@ -1565,7 +1565,7 @@
                 <w:sz w:val="22"/>
                 <w:szCs w:val="22"/>
               </w:rPr>
-              <w:t xml:space="preserve">This </w:t>
+              <w:t xml:space="preserve">Many young people click on links without checking where they lead. </w:t>
             </w:r>
             <w:r>
               <w:rPr>
@@ -1574,7 +1574,7 @@
                 <w:sz w:val="22"/>
                 <w:szCs w:val="22"/>
               </w:rPr>
-              <w:t xml:space="preserve">reliance</w:t>
+              <w:t xml:space="preserve">Such misplaced trust</w:t>
             </w:r>
             <w:r>
               <w:rPr>
@@ -1582,250 +1582,12 @@
                 <w:sz w:val="22"/>
                 <w:szCs w:val="22"/>
               </w:rPr>
-              <w:t xml:space="preserve"> on emotion is exactly what the fraudsters count on.</w:t>
+              <w:t xml:space="preserve"> is exactly what scammers exploit.</w:t>
             </w:r>
           </w:p>
         </w:tc>
       </w:tr>
     </w:tbl>
-    <w:tbl>
-      <w:tblPr>
-        <w:tblStyle w:val="aff2"/>
-        <w:tblW w:w="0" w:type="auto"/>
-        <w:tblLook w:val="04A0" w:firstRow="1" w:lastRow="0" w:firstColumn="1" w:lastColumn="0" w:noHBand="0" w:noVBand="1"/>
-      </w:tblPr>
-      <w:tblGrid>
-        <w:gridCol w:w="2605"/>
-        <w:gridCol w:w="6745"/>
-      </w:tblGrid>
-      <w:tr>
-        <w:tc>
-          <w:tcPr>
-            <w:tcW w:w="2605" w:type="dxa"/>
-            <w:shd w:val="clear" w:color="auto" w:fill="DEEBF7"/>
-          </w:tcPr>
-          <w:p>
-            <w:pPr/>
-            <w:r>
-              <w:rPr>
-                <w:rFonts w:ascii="Times New Roman" w:hAnsi="Times New Roman" w:cs="Times New Roman"/>
-                <w:sz w:val="22"/>
-                <w:szCs w:val="22"/>
-              </w:rPr>
-              <w:t xml:space="preserve">Sentence 1:</w:t>
-            </w:r>
-          </w:p>
-        </w:tc>
-        <w:tc>
-          <w:tcPr>
-            <w:tcW w:w="6745" w:type="dxa"/>
-            <w:shd w:val="clear" w:color="auto" w:fill="DEEBF7"/>
-          </w:tcPr>
-          <w:p>
-            <w:pPr/>
-            <w:r>
-              <w:rPr>
-                <w:rFonts w:ascii="Times New Roman" w:hAnsi="Times New Roman" w:cs="Times New Roman"/>
-                <w:sz w:val="22"/>
-                <w:szCs w:val="22"/>
-              </w:rPr>
-              <w:t xml:space="preserve">Most students are far more aware of online privacy than their parents were.</w:t>
-            </w:r>
-          </w:p>
-        </w:tc>
-      </w:tr>
-      <w:tr>
-        <w:tc>
-          <w:tcPr>
-            <w:tcW w:w="2605" w:type="dxa"/>
-            <w:shd w:val="clear" w:color="auto" w:fill="DEEBF7"/>
-          </w:tcPr>
-          <w:p>
-            <w:pPr/>
-            <w:r>
-              <w:rPr>
-                <w:rFonts w:ascii="Times New Roman" w:hAnsi="Times New Roman" w:cs="Times New Roman"/>
-                <w:sz w:val="22"/>
-                <w:szCs w:val="22"/>
-              </w:rPr>
-              <w:t xml:space="preserve">Linked sentence:</w:t>
-            </w:r>
-          </w:p>
-        </w:tc>
-        <w:tc>
-          <w:tcPr>
-            <w:tcW w:w="6745" w:type="dxa"/>
-            <w:shd w:val="clear" w:color="auto" w:fill="DEEBF7"/>
-          </w:tcPr>
-          <w:p>
-            <w:pPr/>
-            <w:r>
-              <w:rPr>
-                <w:rFonts w:ascii="Times New Roman" w:hAnsi="Times New Roman" w:cs="Times New Roman"/>
-                <w:sz w:val="22"/>
-                <w:szCs w:val="22"/>
-              </w:rPr>
-              <w:t xml:space="preserve">This growing </w:t>
-            </w:r>
-            <w:r>
-              <w:rPr>
-                <w:rFonts w:ascii="Times New Roman" w:hAnsi="Times New Roman" w:cs="Times New Roman"/>
-                <w:i/>
-                <w:sz w:val="22"/>
-                <w:szCs w:val="22"/>
-              </w:rPr>
-              <w:t xml:space="preserve">awareness</w:t>
-            </w:r>
-            <w:r>
-              <w:rPr>
-                <w:rFonts w:ascii="Times New Roman" w:hAnsi="Times New Roman" w:cs="Times New Roman"/>
-                <w:sz w:val="22"/>
-                <w:szCs w:val="22"/>
-              </w:rPr>
-              <w:t xml:space="preserve">, however, does not always protect them from clever scams.</w:t>
-            </w:r>
-          </w:p>
-        </w:tc>
-      </w:tr>
-    </w:tbl>
-    <w:tbl>
-      <w:tblPr>
-        <w:tblStyle w:val="aff2"/>
-        <w:tblW w:w="0" w:type="auto"/>
-        <w:tblLook w:val="04A0" w:firstRow="1" w:lastRow="0" w:firstColumn="1" w:lastColumn="0" w:noHBand="0" w:noVBand="1"/>
-      </w:tblPr>
-      <w:tblGrid>
-        <w:gridCol w:w="2605"/>
-        <w:gridCol w:w="6745"/>
-      </w:tblGrid>
-      <w:tr>
-        <w:tc>
-          <w:tcPr>
-            <w:tcW w:w="2605" w:type="dxa"/>
-            <w:shd w:val="clear" w:color="auto" w:fill="DEEBF7"/>
-          </w:tcPr>
-          <w:p>
-            <w:pPr/>
-            <w:r>
-              <w:rPr>
-                <w:rFonts w:ascii="Times New Roman" w:hAnsi="Times New Roman" w:cs="Times New Roman"/>
-                <w:sz w:val="22"/>
-                <w:szCs w:val="22"/>
-              </w:rPr>
-              <w:t xml:space="preserve">Sentence 1:</w:t>
-            </w:r>
-          </w:p>
-        </w:tc>
-        <w:tc>
-          <w:tcPr>
-            <w:tcW w:w="6745" w:type="dxa"/>
-            <w:shd w:val="clear" w:color="auto" w:fill="DEEBF7"/>
-          </w:tcPr>
-          <w:p>
-            <w:pPr/>
-            <w:r>
-              <w:rPr>
-                <w:rFonts w:ascii="Times New Roman" w:hAnsi="Times New Roman" w:cs="Times New Roman"/>
-                <w:sz w:val="22"/>
-                <w:szCs w:val="22"/>
-              </w:rPr>
-              <w:t xml:space="preserve">Schools can protect students by teaching online safety early.</w:t>
-            </w:r>
-          </w:p>
-        </w:tc>
-      </w:tr>
-      <w:tr>
-        <w:tc>
-          <w:tcPr>
-            <w:tcW w:w="2605" w:type="dxa"/>
-            <w:shd w:val="clear" w:color="auto" w:fill="DEEBF7"/>
-          </w:tcPr>
-          <w:p>
-            <w:pPr/>
-            <w:r>
-              <w:rPr>
-                <w:rFonts w:ascii="Times New Roman" w:hAnsi="Times New Roman" w:cs="Times New Roman"/>
-                <w:sz w:val="22"/>
-                <w:szCs w:val="22"/>
-              </w:rPr>
-              <w:t xml:space="preserve">Linked sentence:</w:t>
-            </w:r>
-          </w:p>
-        </w:tc>
-        <w:tc>
-          <w:tcPr>
-            <w:tcW w:w="6745" w:type="dxa"/>
-            <w:shd w:val="clear" w:color="auto" w:fill="DEEBF7"/>
-          </w:tcPr>
-          <w:p>
-            <w:pPr/>
-            <w:r>
-              <w:rPr>
-                <w:rFonts w:ascii="Times New Roman" w:hAnsi="Times New Roman" w:cs="Times New Roman"/>
-                <w:sz w:val="22"/>
-                <w:szCs w:val="22"/>
-              </w:rPr>
-              <w:t xml:space="preserve">This </w:t>
-            </w:r>
-            <w:r>
-              <w:rPr>
-                <w:rFonts w:ascii="Times New Roman" w:hAnsi="Times New Roman" w:cs="Times New Roman"/>
-                <w:i/>
-                <w:sz w:val="22"/>
-                <w:szCs w:val="22"/>
-              </w:rPr>
-              <w:t xml:space="preserve">education</w:t>
-            </w:r>
-            <w:r>
-              <w:rPr>
-                <w:rFonts w:ascii="Times New Roman" w:hAnsi="Times New Roman" w:cs="Times New Roman"/>
-                <w:sz w:val="22"/>
-                <w:szCs w:val="22"/>
-              </w:rPr>
-              <w:t xml:space="preserve"> should begin long before students own a phone.</w:t>
-            </w:r>
-          </w:p>
-        </w:tc>
-      </w:tr>
-    </w:tbl>
-    <w:p>
-      <w:pPr>
-        <w:spacing w:line="360" w:lineRule="auto"/>
-        <w:pBdr>
-          <w:top w:val="single" w:sz="4" w:space="4" w:color="auto"/>
-          <w:left w:val="single" w:sz="4" w:space="4" w:color="auto"/>
-          <w:bottom w:val="single" w:sz="4" w:space="4" w:color="auto"/>
-          <w:right w:val="single" w:sz="4" w:space="4" w:color="auto"/>
-        </w:pBdr>
-      </w:pPr>
-      <w:r>
-        <w:rPr>
-          <w:rFonts w:ascii="Times New Roman" w:hAnsi="Times New Roman" w:cs="Times New Roman"/>
-          <w:sz w:val="22"/>
-          <w:szCs w:val="22"/>
-        </w:rPr>
-        <w:t xml:space="preserve">Young people often trust official-looking messages without a second thought, and they seldom check who really sent them. Such misplaced trust is easily exploited: a credible-looking link is all a scammer needs. Such carelessness, in turn, keeps the fraud industry alive.</w:t>
-      </w:r>
-    </w:p>
-    <w:p>
-      <w:pPr>
-        <w:spacing w:line="360" w:lineRule="auto"/>
-        <w:pBdr>
-          <w:top w:val="single" w:sz="4" w:space="4" w:color="auto"/>
-          <w:left w:val="single" w:sz="4" w:space="4" w:color="auto"/>
-          <w:bottom w:val="single" w:sz="4" w:space="4" w:color="auto"/>
-          <w:right w:val="single" w:sz="4" w:space="4" w:color="auto"/>
-        </w:pBdr>
-      </w:pPr>
-      <w:r>
-        <w:rPr>
-          <w:rFonts w:ascii="Times New Roman" w:hAnsi="Times New Roman" w:cs="Times New Roman"/>
-          <w:sz w:val="22"/>
-          <w:szCs w:val="22"/>
-        </w:rPr>
-        <w:t xml:space="preserve">Watch out: avoid the over-used ‘This is because…’ and ‘This shows that…’. A noun bridge (“This reliance on emotion…”) says the same thing in fewer words and earns a higher band.</w:t>
-      </w:r>
-    </w:p>
     <w:p>
       <w:pPr>
         <w:spacing w:line="360" w:lineRule="auto"/>
@@ -1862,7 +1624,7 @@
           <w:sz w:val="22"/>
           <w:szCs w:val="22"/>
         </w:rPr>
-        <w:t xml:space="preserve">Rewrite each simple sentence using nominalisation. The sentences are about technology and communication, so keep the register formal. The last three sets (4, 5 and 6) are more challenging.</w:t>
+        <w:t xml:space="preserve">Rewrite each simple sentence using nominalisation. The sentences are about technology and communication, so keep the register formal. The later sets (4–7) are more challenging.</w:t>
       </w:r>
     </w:p>
     <w:p>
@@ -2641,6 +2403,135 @@
     </w:tbl>
     <w:p>
       <w:pPr>
+        <w:pStyle w:val="31"/>
+        <w:spacing w:line="360" w:lineRule="auto"/>
+      </w:pPr>
+      <w:r>
+        <w:rPr>
+          <w:rFonts w:ascii="Times New Roman" w:hAnsi="Times New Roman" w:cs="Times New Roman"/>
+          <w:b/>
+          <w:sz w:val="22"/>
+          <w:szCs w:val="22"/>
+        </w:rPr>
+        <w:t xml:space="preserve">Example Set 7 (Linking: adjective → noun)</w:t>
+      </w:r>
+    </w:p>
+    <w:tbl>
+      <w:tblPr>
+        <w:tblStyle w:val="aff2"/>
+        <w:tblW w:w="0" w:type="auto"/>
+        <w:tblLook w:val="04A0" w:firstRow="1" w:lastRow="0" w:firstColumn="1" w:lastColumn="0" w:noHBand="0" w:noVBand="1"/>
+      </w:tblPr>
+      <w:tblGrid>
+        <w:gridCol w:w="2605"/>
+        <w:gridCol w:w="6745"/>
+      </w:tblGrid>
+      <w:tr>
+        <w:tc>
+          <w:tcPr>
+            <w:tcW w:w="2605" w:type="dxa"/>
+          </w:tcPr>
+          <w:p>
+            <w:pPr/>
+            <w:r>
+              <w:rPr>
+                <w:rFonts w:ascii="Times New Roman" w:hAnsi="Times New Roman" w:cs="Times New Roman"/>
+                <w:sz w:val="22"/>
+                <w:szCs w:val="22"/>
+              </w:rPr>
+              <w:t xml:space="preserve">Simple sentence:</w:t>
+            </w:r>
+          </w:p>
+        </w:tc>
+        <w:tc>
+          <w:tcPr>
+            <w:tcW w:w="6745" w:type="dxa"/>
+          </w:tcPr>
+          <w:p>
+            <w:pPr/>
+            <w:r>
+              <w:rPr>
+                <w:rFonts w:ascii="Times New Roman" w:hAnsi="Times New Roman" w:cs="Times New Roman"/>
+                <w:sz w:val="22"/>
+                <w:szCs w:val="22"/>
+              </w:rPr>
+              <w:t xml:space="preserve">Young people rarely question what they read online. This is because they are too careless.</w:t>
+            </w:r>
+          </w:p>
+        </w:tc>
+      </w:tr>
+      <w:tr>
+        <w:tc>
+          <w:tcPr>
+            <w:tcW w:w="2605" w:type="dxa"/>
+          </w:tcPr>
+          <w:p>
+            <w:pPr/>
+            <w:r>
+              <w:rPr>
+                <w:rFonts w:ascii="Times New Roman" w:hAnsi="Times New Roman" w:cs="Times New Roman"/>
+                <w:sz w:val="22"/>
+                <w:szCs w:val="22"/>
+              </w:rPr>
+              <w:t xml:space="preserve">Prompt:</w:t>
+            </w:r>
+          </w:p>
+        </w:tc>
+        <w:tc>
+          <w:tcPr>
+            <w:tcW w:w="6745" w:type="dxa"/>
+          </w:tcPr>
+          <w:p>
+            <w:pPr/>
+            <w:r>
+              <w:rPr>
+                <w:rFonts w:ascii="Times New Roman" w:hAnsi="Times New Roman" w:cs="Times New Roman"/>
+                <w:i/>
+                <w:sz w:val="22"/>
+                <w:szCs w:val="22"/>
+              </w:rPr>
+              <w:t xml:space="preserve">Turn the adjective ‘careless’ into a noun and replace ‘This is because’ with a noun bridge opening ‘This…’ or ‘Such…’.</w:t>
+            </w:r>
+          </w:p>
+        </w:tc>
+      </w:tr>
+      <w:tr>
+        <w:tc>
+          <w:tcPr>
+            <w:tcW w:w="2605" w:type="dxa"/>
+          </w:tcPr>
+          <w:p>
+            <w:pPr/>
+            <w:r>
+              <w:rPr>
+                <w:rFonts w:ascii="Times New Roman" w:hAnsi="Times New Roman" w:cs="Times New Roman"/>
+                <w:sz w:val="22"/>
+                <w:szCs w:val="22"/>
+              </w:rPr>
+              <w:t xml:space="preserve"/>
+            </w:r>
+          </w:p>
+        </w:tc>
+        <w:tc>
+          <w:tcPr>
+            <w:tcW w:w="6745" w:type="dxa"/>
+          </w:tcPr>
+          <w:p>
+            <w:pPr/>
+            <w:r>
+              <w:rPr>
+                <w:rFonts w:ascii="Times New Roman" w:hAnsi="Times New Roman" w:cs="Times New Roman"/>
+                <w:sz w:val="22"/>
+                <w:szCs w:val="22"/>
+              </w:rPr>
+              <w:t xml:space="preserve"/>
+            </w:r>
+          </w:p>
+        </w:tc>
+      </w:tr>
+    </w:tbl>
+    <w:p>
+      <w:pPr>
         <w:pStyle w:val="1"/>
         <w:spacing w:line="360" w:lineRule="auto"/>
       </w:pPr>

</xml_diff>

<commit_message>
Round 9: second linking example + how-to steps box + Set 8
- Linking section: 2 example pairs (Such misplaced trust / This
  embarrassment), then a 4-step 'How to do it' box
- Part 3: new Example Set 8 (Linking: verb -> noun, same-form worry)
</commit_message>
<xml_diff>
--- a/Lesson 3 - Nominalisation (Student's).docx
+++ b/Lesson 3 - Nominalisation (Student's).docx
@@ -1588,6 +1588,158 @@
         </w:tc>
       </w:tr>
     </w:tbl>
+    <w:tbl>
+      <w:tblPr>
+        <w:tblStyle w:val="aff2"/>
+        <w:tblW w:w="0" w:type="auto"/>
+        <w:tblLook w:val="04A0" w:firstRow="1" w:lastRow="0" w:firstColumn="1" w:lastColumn="0" w:noHBand="0" w:noVBand="1"/>
+      </w:tblPr>
+      <w:tblGrid>
+        <w:gridCol w:w="2605"/>
+        <w:gridCol w:w="6745"/>
+      </w:tblGrid>
+      <w:tr>
+        <w:tc>
+          <w:tcPr>
+            <w:tcW w:w="2605" w:type="dxa"/>
+            <w:shd w:val="clear" w:color="auto" w:fill="DEEBF7"/>
+          </w:tcPr>
+          <w:p>
+            <w:pPr/>
+            <w:r>
+              <w:rPr>
+                <w:rFonts w:ascii="Times New Roman" w:hAnsi="Times New Roman" w:cs="Times New Roman"/>
+                <w:sz w:val="22"/>
+                <w:szCs w:val="22"/>
+              </w:rPr>
+              <w:t xml:space="preserve">Plain (weak link):</w:t>
+            </w:r>
+          </w:p>
+        </w:tc>
+        <w:tc>
+          <w:tcPr>
+            <w:tcW w:w="6745" w:type="dxa"/>
+            <w:shd w:val="clear" w:color="auto" w:fill="DEEBF7"/>
+          </w:tcPr>
+          <w:p>
+            <w:pPr/>
+            <w:r>
+              <w:rPr>
+                <w:rFonts w:ascii="Times New Roman" w:hAnsi="Times New Roman" w:cs="Times New Roman"/>
+                <w:sz w:val="22"/>
+                <w:szCs w:val="22"/>
+              </w:rPr>
+              <w:t xml:space="preserve">Students rarely report scam messages to their teachers. This is because they feel embarrassed.</w:t>
+            </w:r>
+          </w:p>
+        </w:tc>
+      </w:tr>
+      <w:tr>
+        <w:tc>
+          <w:tcPr>
+            <w:tcW w:w="2605" w:type="dxa"/>
+            <w:shd w:val="clear" w:color="auto" w:fill="DEEBF7"/>
+          </w:tcPr>
+          <w:p>
+            <w:pPr/>
+            <w:r>
+              <w:rPr>
+                <w:rFonts w:ascii="Times New Roman" w:hAnsi="Times New Roman" w:cs="Times New Roman"/>
+                <w:sz w:val="22"/>
+                <w:szCs w:val="22"/>
+              </w:rPr>
+              <w:t xml:space="preserve">Nominalised (This / Such + noun):</w:t>
+            </w:r>
+          </w:p>
+        </w:tc>
+        <w:tc>
+          <w:tcPr>
+            <w:tcW w:w="6745" w:type="dxa"/>
+            <w:shd w:val="clear" w:color="auto" w:fill="DEEBF7"/>
+          </w:tcPr>
+          <w:p>
+            <w:pPr/>
+            <w:r>
+              <w:rPr>
+                <w:rFonts w:ascii="Times New Roman" w:hAnsi="Times New Roman" w:cs="Times New Roman"/>
+                <w:sz w:val="22"/>
+                <w:szCs w:val="22"/>
+              </w:rPr>
+              <w:t xml:space="preserve">Students rarely report scam messages to their teachers. </w:t>
+            </w:r>
+            <w:r>
+              <w:rPr>
+                <w:rFonts w:ascii="Times New Roman" w:hAnsi="Times New Roman" w:cs="Times New Roman"/>
+                <w:i/>
+                <w:sz w:val="22"/>
+                <w:szCs w:val="22"/>
+              </w:rPr>
+              <w:t xml:space="preserve">This embarrassment</w:t>
+            </w:r>
+            <w:r>
+              <w:rPr>
+                <w:rFonts w:ascii="Times New Roman" w:hAnsi="Times New Roman" w:cs="Times New Roman"/>
+                <w:sz w:val="22"/>
+                <w:szCs w:val="22"/>
+              </w:rPr>
+              <w:t xml:space="preserve">, however, plays straight into the fraudsters’ hands.</w:t>
+            </w:r>
+          </w:p>
+        </w:tc>
+      </w:tr>
+    </w:tbl>
+    <w:p>
+      <w:pPr>
+        <w:spacing w:line="360" w:lineRule="auto"/>
+        <w:pBdr>
+          <w:top w:val="single" w:sz="4" w:space="4" w:color="auto"/>
+          <w:left w:val="single" w:sz="4" w:space="4" w:color="auto"/>
+          <w:bottom w:val="single" w:sz="4" w:space="4" w:color="auto"/>
+          <w:right w:val="single" w:sz="4" w:space="4" w:color="auto"/>
+        </w:pBdr>
+      </w:pPr>
+      <w:r>
+        <w:rPr>
+          <w:rFonts w:ascii="Times New Roman" w:hAnsi="Times New Roman" w:cs="Times New Roman"/>
+          <w:b/>
+          <w:sz w:val="22"/>
+          <w:szCs w:val="22"/>
+        </w:rPr>
+        <w:t xml:space="preserve">How to do it:  </w:t>
+      </w:r>
+      <w:r>
+        <w:rPr>
+          <w:rFonts w:ascii="Times New Roman" w:hAnsi="Times New Roman" w:cs="Times New Roman"/>
+          <w:sz w:val="22"/>
+          <w:szCs w:val="22"/>
+        </w:rPr>
+        <w:t xml:space="preserve">  1.  Find the verb or adjective you want to carry over (trust, embarrassed).</w:t>
+      </w:r>
+      <w:r>
+        <w:rPr>
+          <w:rFonts w:ascii="Times New Roman" w:hAnsi="Times New Roman" w:cs="Times New Roman"/>
+          <w:sz w:val="22"/>
+          <w:szCs w:val="22"/>
+        </w:rPr>
+        <w:t xml:space="preserve">  2.  Change it into a noun (trust → trust; embarrassed → embarrassment — the warm-up list can help).</w:t>
+      </w:r>
+      <w:r>
+        <w:rPr>
+          <w:rFonts w:ascii="Times New Roman" w:hAnsi="Times New Roman" w:cs="Times New Roman"/>
+          <w:sz w:val="22"/>
+          <w:szCs w:val="22"/>
+        </w:rPr>
+        <w:t xml:space="preserve">  3.  Open the next sentence with ‘This’ or ‘Such’ + the noun.</w:t>
+      </w:r>
+      <w:r>
+        <w:rPr>
+          <w:rFonts w:ascii="Times New Roman" w:hAnsi="Times New Roman" w:cs="Times New Roman"/>
+          <w:sz w:val="22"/>
+          <w:szCs w:val="22"/>
+        </w:rPr>
+        <w:t xml:space="preserve">  4.  Delete the vague ‘This is because…’ and add your new idea after the noun.</w:t>
+      </w:r>
+    </w:p>
     <w:p>
       <w:pPr>
         <w:spacing w:line="360" w:lineRule="auto"/>
@@ -1624,7 +1776,7 @@
           <w:sz w:val="22"/>
           <w:szCs w:val="22"/>
         </w:rPr>
-        <w:t xml:space="preserve">Rewrite each simple sentence using nominalisation. The sentences are about technology and communication, so keep the register formal. The later sets (4–7) are more challenging.</w:t>
+        <w:t xml:space="preserve">Rewrite each simple sentence using nominalisation. The sentences are about technology and communication, so keep the register formal. The later sets (4–8) are more challenging.</w:t>
       </w:r>
     </w:p>
     <w:p>
@@ -2532,6 +2684,135 @@
     </w:tbl>
     <w:p>
       <w:pPr>
+        <w:pStyle w:val="31"/>
+        <w:spacing w:line="360" w:lineRule="auto"/>
+      </w:pPr>
+      <w:r>
+        <w:rPr>
+          <w:rFonts w:ascii="Times New Roman" w:hAnsi="Times New Roman" w:cs="Times New Roman"/>
+          <w:b/>
+          <w:sz w:val="22"/>
+          <w:szCs w:val="22"/>
+        </w:rPr>
+        <w:t xml:space="preserve">Example Set 8 (Linking: verb → noun)</w:t>
+      </w:r>
+    </w:p>
+    <w:tbl>
+      <w:tblPr>
+        <w:tblStyle w:val="aff2"/>
+        <w:tblW w:w="0" w:type="auto"/>
+        <w:tblLook w:val="04A0" w:firstRow="1" w:lastRow="0" w:firstColumn="1" w:lastColumn="0" w:noHBand="0" w:noVBand="1"/>
+      </w:tblPr>
+      <w:tblGrid>
+        <w:gridCol w:w="2605"/>
+        <w:gridCol w:w="6745"/>
+      </w:tblGrid>
+      <w:tr>
+        <w:tc>
+          <w:tcPr>
+            <w:tcW w:w="2605" w:type="dxa"/>
+          </w:tcPr>
+          <w:p>
+            <w:pPr/>
+            <w:r>
+              <w:rPr>
+                <w:rFonts w:ascii="Times New Roman" w:hAnsi="Times New Roman" w:cs="Times New Roman"/>
+                <w:sz w:val="22"/>
+                <w:szCs w:val="22"/>
+              </w:rPr>
+              <w:t xml:space="preserve">Simple sentence:</w:t>
+            </w:r>
+          </w:p>
+        </w:tc>
+        <w:tc>
+          <w:tcPr>
+            <w:tcW w:w="6745" w:type="dxa"/>
+          </w:tcPr>
+          <w:p>
+            <w:pPr/>
+            <w:r>
+              <w:rPr>
+                <w:rFonts w:ascii="Times New Roman" w:hAnsi="Times New Roman" w:cs="Times New Roman"/>
+                <w:sz w:val="22"/>
+                <w:szCs w:val="22"/>
+              </w:rPr>
+              <w:t xml:space="preserve">Parents check their children’s phones every night. This is because they worry about online dangers.</w:t>
+            </w:r>
+          </w:p>
+        </w:tc>
+      </w:tr>
+      <w:tr>
+        <w:tc>
+          <w:tcPr>
+            <w:tcW w:w="2605" w:type="dxa"/>
+          </w:tcPr>
+          <w:p>
+            <w:pPr/>
+            <w:r>
+              <w:rPr>
+                <w:rFonts w:ascii="Times New Roman" w:hAnsi="Times New Roman" w:cs="Times New Roman"/>
+                <w:sz w:val="22"/>
+                <w:szCs w:val="22"/>
+              </w:rPr>
+              <w:t xml:space="preserve">Prompt:</w:t>
+            </w:r>
+          </w:p>
+        </w:tc>
+        <w:tc>
+          <w:tcPr>
+            <w:tcW w:w="6745" w:type="dxa"/>
+          </w:tcPr>
+          <w:p>
+            <w:pPr/>
+            <w:r>
+              <w:rPr>
+                <w:rFonts w:ascii="Times New Roman" w:hAnsi="Times New Roman" w:cs="Times New Roman"/>
+                <w:i/>
+                <w:sz w:val="22"/>
+                <w:szCs w:val="22"/>
+              </w:rPr>
+              <w:t xml:space="preserve">Turn the verb ‘worry’ into a noun (same form) and replace ‘This is because’ with a noun bridge opening ‘This…’ or ‘Such…’.</w:t>
+            </w:r>
+          </w:p>
+        </w:tc>
+      </w:tr>
+      <w:tr>
+        <w:tc>
+          <w:tcPr>
+            <w:tcW w:w="2605" w:type="dxa"/>
+          </w:tcPr>
+          <w:p>
+            <w:pPr/>
+            <w:r>
+              <w:rPr>
+                <w:rFonts w:ascii="Times New Roman" w:hAnsi="Times New Roman" w:cs="Times New Roman"/>
+                <w:sz w:val="22"/>
+                <w:szCs w:val="22"/>
+              </w:rPr>
+              <w:t xml:space="preserve"/>
+            </w:r>
+          </w:p>
+        </w:tc>
+        <w:tc>
+          <w:tcPr>
+            <w:tcW w:w="6745" w:type="dxa"/>
+          </w:tcPr>
+          <w:p>
+            <w:pPr/>
+            <w:r>
+              <w:rPr>
+                <w:rFonts w:ascii="Times New Roman" w:hAnsi="Times New Roman" w:cs="Times New Roman"/>
+                <w:sz w:val="22"/>
+                <w:szCs w:val="22"/>
+              </w:rPr>
+              <w:t xml:space="preserve"/>
+            </w:r>
+          </w:p>
+        </w:tc>
+      </w:tr>
+    </w:tbl>
+    <w:p>
+      <w:pPr>
         <w:pStyle w:val="1"/>
         <w:spacing w:line="360" w:lineRule="auto"/>
       </w:pPr>

</xml_diff>

<commit_message>
Part 2 as two-column word table (1-20, compact); Part 4: 'one noun from Part 2'
</commit_message>
<xml_diff>
--- a/Lesson 3 - Nominalisation (Student's).docx
+++ b/Lesson 3 - Nominalisation (Student's).docx
@@ -303,39 +303,98 @@
     <w:tbl>
       <w:tblPr>
         <w:tblStyle w:val="TableGrid"/>
-        <w:tblW w:w="0" w:type="auto"/>
+        <w:tblW w:w="9350" w:type="dxa"/>
+        <w:tblLayout w:type="fixed"/>
         <w:tblLook w:val="04A0" w:firstRow="1" w:lastRow="0" w:firstColumn="1" w:lastColumn="0" w:noHBand="0" w:noVBand="1"/>
       </w:tblPr>
       <w:tblGrid>
-        <w:gridCol w:w="2605"/>
-        <w:gridCol w:w="6745"/>
+        <w:gridCol w:w="2150"/>
+        <w:gridCol w:w="2525"/>
+        <w:gridCol w:w="2150"/>
+        <w:gridCol w:w="2525"/>
       </w:tblGrid>
       <w:tr>
         <w:tc>
           <w:tcPr>
-            <w:tcW w:w="2605" w:type="dxa"/>
+            <w:tcW w:w="2150" w:type="dxa"/>
           </w:tcPr>
           <w:p>
+            <w:pPr>
+              <w:spacing w:before="0" w:after="0" w:line="276" w:lineRule="auto"/>
+              <w:rPr>
+                <w:rFonts w:cs="Times New Roman"/>
+                <w:b/>
+              </w:rPr>
+            </w:pPr>
             <w:r>
               <w:rPr>
                 <w:rFonts w:cs="Times New Roman"/>
                 <w:b/>
               </w:rPr>
-              <w:t>Word</w:t>
+              <w:t xml:space="preserve">Word</w:t>
             </w:r>
           </w:p>
         </w:tc>
         <w:tc>
           <w:tcPr>
-            <w:tcW w:w="6745" w:type="dxa"/>
+            <w:tcW w:w="2525" w:type="dxa"/>
           </w:tcPr>
           <w:p>
+            <w:pPr>
+              <w:spacing w:before="0" w:after="0" w:line="276" w:lineRule="auto"/>
+              <w:rPr>
+                <w:rFonts w:cs="Times New Roman"/>
+                <w:b/>
+              </w:rPr>
+            </w:pPr>
             <w:r>
               <w:rPr>
                 <w:rFonts w:cs="Times New Roman"/>
                 <w:b/>
               </w:rPr>
-              <w:t>Noun</w:t>
+              <w:t xml:space="preserve">Noun</w:t>
+            </w:r>
+          </w:p>
+        </w:tc>
+        <w:tc>
+          <w:tcPr>
+            <w:tcW w:w="2150" w:type="dxa"/>
+          </w:tcPr>
+          <w:p>
+            <w:pPr>
+              <w:spacing w:before="0" w:after="0" w:line="276" w:lineRule="auto"/>
+              <w:rPr>
+                <w:rFonts w:cs="Times New Roman"/>
+                <w:b/>
+              </w:rPr>
+            </w:pPr>
+            <w:r>
+              <w:rPr>
+                <w:rFonts w:cs="Times New Roman"/>
+                <w:b/>
+              </w:rPr>
+              <w:t xml:space="preserve">Word</w:t>
+            </w:r>
+          </w:p>
+        </w:tc>
+        <w:tc>
+          <w:tcPr>
+            <w:tcW w:w="2525" w:type="dxa"/>
+          </w:tcPr>
+          <w:p>
+            <w:pPr>
+              <w:spacing w:before="0" w:after="0" w:line="276" w:lineRule="auto"/>
+              <w:rPr>
+                <w:rFonts w:cs="Times New Roman"/>
+                <w:b/>
+              </w:rPr>
+            </w:pPr>
+            <w:r>
+              <w:rPr>
+                <w:rFonts w:cs="Times New Roman"/>
+                <w:b/>
+              </w:rPr>
+              <w:t xml:space="preserve">Noun</w:t>
             </w:r>
           </w:p>
         </w:tc>
@@ -343,563 +402,661 @@
       <w:tr>
         <w:tc>
           <w:tcPr>
-            <w:tcW w:w="2605" w:type="dxa"/>
+            <w:tcW w:w="2150" w:type="dxa"/>
           </w:tcPr>
           <w:p>
             <w:pPr>
-              <w:pStyle w:val="ListParagraph"/>
-              <w:numPr>
-                <w:ilvl w:val="0"/>
-                <w:numId w:val="11"/>
-              </w:numPr>
+              <w:spacing w:before="0" w:after="0" w:line="276" w:lineRule="auto"/>
+              <w:rPr>
+                <w:rFonts w:cs="Times New Roman"/>
+              </w:rPr>
             </w:pPr>
             <w:r>
               <w:rPr>
                 <w:rFonts w:cs="Times New Roman"/>
               </w:rPr>
-              <w:t>decide</w:t>
+              <w:t xml:space="preserve">1. decide</w:t>
             </w:r>
           </w:p>
         </w:tc>
         <w:tc>
           <w:tcPr>
-            <w:tcW w:w="6745" w:type="dxa"/>
+            <w:tcW w:w="2525" w:type="dxa"/>
           </w:tcPr>
-          <w:p/>
+          <w:p>
+            <w:pPr>
+              <w:spacing w:before="0" w:after="0" w:line="276" w:lineRule="auto"/>
+              <w:rPr>
+                <w:rFonts w:cs="Times New Roman"/>
+              </w:rPr>
+            </w:pPr>
+          </w:p>
+        </w:tc>
+        <w:tc>
+          <w:tcPr>
+            <w:tcW w:w="2150" w:type="dxa"/>
+          </w:tcPr>
+          <w:p>
+            <w:pPr>
+              <w:spacing w:before="0" w:after="0" w:line="276" w:lineRule="auto"/>
+              <w:rPr>
+                <w:rFonts w:cs="Times New Roman"/>
+              </w:rPr>
+            </w:pPr>
+            <w:r>
+              <w:rPr>
+                <w:rFonts w:cs="Times New Roman"/>
+              </w:rPr>
+              <w:t xml:space="preserve">11. aware</w:t>
+            </w:r>
+          </w:p>
+        </w:tc>
+        <w:tc>
+          <w:tcPr>
+            <w:tcW w:w="2525" w:type="dxa"/>
+          </w:tcPr>
+          <w:p>
+            <w:pPr>
+              <w:spacing w:before="0" w:after="0" w:line="276" w:lineRule="auto"/>
+              <w:rPr>
+                <w:rFonts w:cs="Times New Roman"/>
+              </w:rPr>
+            </w:pPr>
+          </w:p>
         </w:tc>
       </w:tr>
       <w:tr>
         <w:tc>
           <w:tcPr>
-            <w:tcW w:w="2605" w:type="dxa"/>
+            <w:tcW w:w="2150" w:type="dxa"/>
           </w:tcPr>
           <w:p>
             <w:pPr>
-              <w:pStyle w:val="ListParagraph"/>
-              <w:numPr>
-                <w:ilvl w:val="0"/>
-                <w:numId w:val="11"/>
-              </w:numPr>
+              <w:spacing w:before="0" w:after="0" w:line="276" w:lineRule="auto"/>
+              <w:rPr>
+                <w:rFonts w:cs="Times New Roman"/>
+              </w:rPr>
             </w:pPr>
             <w:r>
               <w:rPr>
                 <w:rFonts w:cs="Times New Roman"/>
               </w:rPr>
-              <w:t>improve</w:t>
+              <w:t xml:space="preserve">2. improve</w:t>
             </w:r>
           </w:p>
         </w:tc>
         <w:tc>
           <w:tcPr>
-            <w:tcW w:w="6745" w:type="dxa"/>
+            <w:tcW w:w="2525" w:type="dxa"/>
           </w:tcPr>
-          <w:p/>
+          <w:p>
+            <w:pPr>
+              <w:spacing w:before="0" w:after="0" w:line="276" w:lineRule="auto"/>
+              <w:rPr>
+                <w:rFonts w:cs="Times New Roman"/>
+              </w:rPr>
+            </w:pPr>
+          </w:p>
+        </w:tc>
+        <w:tc>
+          <w:tcPr>
+            <w:tcW w:w="2150" w:type="dxa"/>
+          </w:tcPr>
+          <w:p>
+            <w:pPr>
+              <w:spacing w:before="0" w:after="0" w:line="276" w:lineRule="auto"/>
+              <w:rPr>
+                <w:rFonts w:cs="Times New Roman"/>
+              </w:rPr>
+            </w:pPr>
+            <w:r>
+              <w:rPr>
+                <w:rFonts w:cs="Times New Roman"/>
+              </w:rPr>
+              <w:t xml:space="preserve">12. important</w:t>
+            </w:r>
+          </w:p>
+        </w:tc>
+        <w:tc>
+          <w:tcPr>
+            <w:tcW w:w="2525" w:type="dxa"/>
+          </w:tcPr>
+          <w:p>
+            <w:pPr>
+              <w:spacing w:before="0" w:after="0" w:line="276" w:lineRule="auto"/>
+              <w:rPr>
+                <w:rFonts w:cs="Times New Roman"/>
+              </w:rPr>
+            </w:pPr>
+          </w:p>
         </w:tc>
       </w:tr>
       <w:tr>
         <w:tc>
           <w:tcPr>
-            <w:tcW w:w="2605" w:type="dxa"/>
+            <w:tcW w:w="2150" w:type="dxa"/>
           </w:tcPr>
           <w:p>
             <w:pPr>
-              <w:pStyle w:val="ListParagraph"/>
-              <w:numPr>
-                <w:ilvl w:val="0"/>
-                <w:numId w:val="11"/>
-              </w:numPr>
+              <w:spacing w:before="0" w:after="0" w:line="276" w:lineRule="auto"/>
+              <w:rPr>
+                <w:rFonts w:cs="Times New Roman"/>
+              </w:rPr>
             </w:pPr>
             <w:r>
               <w:rPr>
                 <w:rFonts w:cs="Times New Roman"/>
               </w:rPr>
-              <w:t>communicate</w:t>
+              <w:t xml:space="preserve">3. communicate</w:t>
             </w:r>
           </w:p>
         </w:tc>
         <w:tc>
           <w:tcPr>
-            <w:tcW w:w="6745" w:type="dxa"/>
+            <w:tcW w:w="2525" w:type="dxa"/>
           </w:tcPr>
-          <w:p/>
+          <w:p>
+            <w:pPr>
+              <w:spacing w:before="0" w:after="0" w:line="276" w:lineRule="auto"/>
+              <w:rPr>
+                <w:rFonts w:cs="Times New Roman"/>
+              </w:rPr>
+            </w:pPr>
+          </w:p>
+        </w:tc>
+        <w:tc>
+          <w:tcPr>
+            <w:tcW w:w="2150" w:type="dxa"/>
+          </w:tcPr>
+          <w:p>
+            <w:pPr>
+              <w:spacing w:before="0" w:after="0" w:line="276" w:lineRule="auto"/>
+              <w:rPr>
+                <w:rFonts w:cs="Times New Roman"/>
+              </w:rPr>
+            </w:pPr>
+            <w:r>
+              <w:rPr>
+                <w:rFonts w:cs="Times New Roman"/>
+              </w:rPr>
+              <w:t xml:space="preserve">13. rely</w:t>
+            </w:r>
+          </w:p>
+        </w:tc>
+        <w:tc>
+          <w:tcPr>
+            <w:tcW w:w="2525" w:type="dxa"/>
+          </w:tcPr>
+          <w:p>
+            <w:pPr>
+              <w:spacing w:before="0" w:after="0" w:line="276" w:lineRule="auto"/>
+              <w:rPr>
+                <w:rFonts w:cs="Times New Roman"/>
+              </w:rPr>
+            </w:pPr>
+          </w:p>
         </w:tc>
       </w:tr>
       <w:tr>
         <w:tc>
           <w:tcPr>
-            <w:tcW w:w="2605" w:type="dxa"/>
+            <w:tcW w:w="2150" w:type="dxa"/>
           </w:tcPr>
           <w:p>
             <w:pPr>
-              <w:pStyle w:val="ListParagraph"/>
-              <w:numPr>
-                <w:ilvl w:val="0"/>
-                <w:numId w:val="11"/>
-              </w:numPr>
+              <w:spacing w:before="0" w:after="0" w:line="276" w:lineRule="auto"/>
+              <w:rPr>
+                <w:rFonts w:cs="Times New Roman"/>
+              </w:rPr>
             </w:pPr>
             <w:r>
               <w:rPr>
                 <w:rFonts w:cs="Times New Roman"/>
               </w:rPr>
-              <w:t>introduce</w:t>
+              <w:t xml:space="preserve">4. introduce</w:t>
             </w:r>
           </w:p>
         </w:tc>
         <w:tc>
           <w:tcPr>
-            <w:tcW w:w="6745" w:type="dxa"/>
+            <w:tcW w:w="2525" w:type="dxa"/>
           </w:tcPr>
-          <w:p/>
+          <w:p>
+            <w:pPr>
+              <w:spacing w:before="0" w:after="0" w:line="276" w:lineRule="auto"/>
+              <w:rPr>
+                <w:rFonts w:cs="Times New Roman"/>
+              </w:rPr>
+            </w:pPr>
+          </w:p>
+        </w:tc>
+        <w:tc>
+          <w:tcPr>
+            <w:tcW w:w="2150" w:type="dxa"/>
+          </w:tcPr>
+          <w:p>
+            <w:pPr>
+              <w:spacing w:before="0" w:after="0" w:line="276" w:lineRule="auto"/>
+              <w:rPr>
+                <w:rFonts w:cs="Times New Roman"/>
+              </w:rPr>
+            </w:pPr>
+            <w:r>
+              <w:rPr>
+                <w:rFonts w:cs="Times New Roman"/>
+              </w:rPr>
+              <w:t xml:space="preserve">14. responsible</w:t>
+            </w:r>
+          </w:p>
+        </w:tc>
+        <w:tc>
+          <w:tcPr>
+            <w:tcW w:w="2525" w:type="dxa"/>
+          </w:tcPr>
+          <w:p>
+            <w:pPr>
+              <w:spacing w:before="0" w:after="0" w:line="276" w:lineRule="auto"/>
+              <w:rPr>
+                <w:rFonts w:cs="Times New Roman"/>
+              </w:rPr>
+            </w:pPr>
+          </w:p>
         </w:tc>
       </w:tr>
       <w:tr>
         <w:tc>
           <w:tcPr>
-            <w:tcW w:w="2605" w:type="dxa"/>
+            <w:tcW w:w="2150" w:type="dxa"/>
           </w:tcPr>
           <w:p>
             <w:pPr>
-              <w:pStyle w:val="ListParagraph"/>
-              <w:numPr>
-                <w:ilvl w:val="0"/>
-                <w:numId w:val="11"/>
-              </w:numPr>
+              <w:spacing w:before="0" w:after="0" w:line="276" w:lineRule="auto"/>
+              <w:rPr>
+                <w:rFonts w:cs="Times New Roman"/>
+              </w:rPr>
             </w:pPr>
             <w:r>
               <w:rPr>
                 <w:rFonts w:cs="Times New Roman"/>
               </w:rPr>
-              <w:t>regulate</w:t>
+              <w:t xml:space="preserve">5. regulate</w:t>
             </w:r>
           </w:p>
         </w:tc>
         <w:tc>
           <w:tcPr>
-            <w:tcW w:w="6745" w:type="dxa"/>
+            <w:tcW w:w="2525" w:type="dxa"/>
           </w:tcPr>
-          <w:p/>
+          <w:p>
+            <w:pPr>
+              <w:spacing w:before="0" w:after="0" w:line="276" w:lineRule="auto"/>
+              <w:rPr>
+                <w:rFonts w:cs="Times New Roman"/>
+              </w:rPr>
+            </w:pPr>
+          </w:p>
+        </w:tc>
+        <w:tc>
+          <w:tcPr>
+            <w:tcW w:w="2150" w:type="dxa"/>
+          </w:tcPr>
+          <w:p>
+            <w:pPr>
+              <w:spacing w:before="0" w:after="0" w:line="276" w:lineRule="auto"/>
+              <w:rPr>
+                <w:rFonts w:cs="Times New Roman"/>
+              </w:rPr>
+            </w:pPr>
+            <w:r>
+              <w:rPr>
+                <w:rFonts w:cs="Times New Roman"/>
+              </w:rPr>
+              <w:t xml:space="preserve">15. choose</w:t>
+            </w:r>
+          </w:p>
+        </w:tc>
+        <w:tc>
+          <w:tcPr>
+            <w:tcW w:w="2525" w:type="dxa"/>
+          </w:tcPr>
+          <w:p>
+            <w:pPr>
+              <w:spacing w:before="0" w:after="0" w:line="276" w:lineRule="auto"/>
+              <w:rPr>
+                <w:rFonts w:cs="Times New Roman"/>
+              </w:rPr>
+            </w:pPr>
+          </w:p>
         </w:tc>
       </w:tr>
       <w:tr>
         <w:tc>
           <w:tcPr>
-            <w:tcW w:w="2605" w:type="dxa"/>
+            <w:tcW w:w="2150" w:type="dxa"/>
           </w:tcPr>
           <w:p>
             <w:pPr>
-              <w:pStyle w:val="ListParagraph"/>
-              <w:numPr>
-                <w:ilvl w:val="0"/>
-                <w:numId w:val="11"/>
-              </w:numPr>
+              <w:spacing w:before="0" w:after="0" w:line="276" w:lineRule="auto"/>
+              <w:rPr>
+                <w:rFonts w:cs="Times New Roman"/>
+              </w:rPr>
             </w:pPr>
             <w:r>
               <w:rPr>
                 <w:rFonts w:cs="Times New Roman"/>
               </w:rPr>
-              <w:t>protect</w:t>
+              <w:t xml:space="preserve">6. protect</w:t>
             </w:r>
           </w:p>
         </w:tc>
         <w:tc>
           <w:tcPr>
-            <w:tcW w:w="6745" w:type="dxa"/>
+            <w:tcW w:w="2525" w:type="dxa"/>
           </w:tcPr>
-          <w:p/>
+          <w:p>
+            <w:pPr>
+              <w:spacing w:before="0" w:after="0" w:line="276" w:lineRule="auto"/>
+              <w:rPr>
+                <w:rFonts w:cs="Times New Roman"/>
+              </w:rPr>
+            </w:pPr>
+          </w:p>
+        </w:tc>
+        <w:tc>
+          <w:tcPr>
+            <w:tcW w:w="2150" w:type="dxa"/>
+          </w:tcPr>
+          <w:p>
+            <w:pPr>
+              <w:spacing w:before="0" w:after="0" w:line="276" w:lineRule="auto"/>
+              <w:rPr>
+                <w:rFonts w:cs="Times New Roman"/>
+              </w:rPr>
+            </w:pPr>
+            <w:r>
+              <w:rPr>
+                <w:rFonts w:cs="Times New Roman"/>
+              </w:rPr>
+              <w:t xml:space="preserve">16. know</w:t>
+            </w:r>
+          </w:p>
+        </w:tc>
+        <w:tc>
+          <w:tcPr>
+            <w:tcW w:w="2525" w:type="dxa"/>
+          </w:tcPr>
+          <w:p>
+            <w:pPr>
+              <w:spacing w:before="0" w:after="0" w:line="276" w:lineRule="auto"/>
+              <w:rPr>
+                <w:rFonts w:cs="Times New Roman"/>
+              </w:rPr>
+            </w:pPr>
+          </w:p>
         </w:tc>
       </w:tr>
       <w:tr>
         <w:tc>
           <w:tcPr>
-            <w:tcW w:w="2605" w:type="dxa"/>
+            <w:tcW w:w="2150" w:type="dxa"/>
           </w:tcPr>
           <w:p>
             <w:pPr>
-              <w:pStyle w:val="ListParagraph"/>
-              <w:numPr>
-                <w:ilvl w:val="0"/>
-                <w:numId w:val="11"/>
-              </w:numPr>
+              <w:spacing w:before="0" w:after="0" w:line="276" w:lineRule="auto"/>
+              <w:rPr>
+                <w:rFonts w:cs="Times New Roman"/>
+              </w:rPr>
             </w:pPr>
             <w:r>
               <w:rPr>
                 <w:rFonts w:cs="Times New Roman"/>
               </w:rPr>
-              <w:t>explain</w:t>
+              <w:t xml:space="preserve">7. explain</w:t>
             </w:r>
           </w:p>
         </w:tc>
         <w:tc>
           <w:tcPr>
-            <w:tcW w:w="6745" w:type="dxa"/>
+            <w:tcW w:w="2525" w:type="dxa"/>
           </w:tcPr>
-          <w:p/>
+          <w:p>
+            <w:pPr>
+              <w:spacing w:before="0" w:after="0" w:line="276" w:lineRule="auto"/>
+              <w:rPr>
+                <w:rFonts w:cs="Times New Roman"/>
+              </w:rPr>
+            </w:pPr>
+          </w:p>
+        </w:tc>
+        <w:tc>
+          <w:tcPr>
+            <w:tcW w:w="2150" w:type="dxa"/>
+          </w:tcPr>
+          <w:p>
+            <w:pPr>
+              <w:spacing w:before="0" w:after="0" w:line="276" w:lineRule="auto"/>
+              <w:rPr>
+                <w:rFonts w:cs="Times New Roman"/>
+              </w:rPr>
+            </w:pPr>
+            <w:r>
+              <w:rPr>
+                <w:rFonts w:cs="Times New Roman"/>
+              </w:rPr>
+              <w:t xml:space="preserve">17. lose</w:t>
+            </w:r>
+          </w:p>
+        </w:tc>
+        <w:tc>
+          <w:tcPr>
+            <w:tcW w:w="2525" w:type="dxa"/>
+          </w:tcPr>
+          <w:p>
+            <w:pPr>
+              <w:spacing w:before="0" w:after="0" w:line="276" w:lineRule="auto"/>
+              <w:rPr>
+                <w:rFonts w:cs="Times New Roman"/>
+              </w:rPr>
+            </w:pPr>
+          </w:p>
         </w:tc>
       </w:tr>
       <w:tr>
         <w:tc>
           <w:tcPr>
-            <w:tcW w:w="2605" w:type="dxa"/>
+            <w:tcW w:w="2150" w:type="dxa"/>
           </w:tcPr>
           <w:p>
             <w:pPr>
-              <w:pStyle w:val="ListParagraph"/>
-              <w:numPr>
-                <w:ilvl w:val="0"/>
-                <w:numId w:val="11"/>
-              </w:numPr>
+              <w:spacing w:before="0" w:after="0" w:line="276" w:lineRule="auto"/>
+              <w:rPr>
+                <w:rFonts w:cs="Times New Roman"/>
+              </w:rPr>
             </w:pPr>
             <w:r>
               <w:rPr>
                 <w:rFonts w:cs="Times New Roman"/>
               </w:rPr>
-              <w:t>solve</w:t>
+              <w:t xml:space="preserve">8. solve</w:t>
             </w:r>
           </w:p>
         </w:tc>
         <w:tc>
           <w:tcPr>
-            <w:tcW w:w="6745" w:type="dxa"/>
+            <w:tcW w:w="2525" w:type="dxa"/>
           </w:tcPr>
-          <w:p/>
+          <w:p>
+            <w:pPr>
+              <w:spacing w:before="0" w:after="0" w:line="276" w:lineRule="auto"/>
+              <w:rPr>
+                <w:rFonts w:cs="Times New Roman"/>
+              </w:rPr>
+            </w:pPr>
+          </w:p>
+        </w:tc>
+        <w:tc>
+          <w:tcPr>
+            <w:tcW w:w="2150" w:type="dxa"/>
+          </w:tcPr>
+          <w:p>
+            <w:pPr>
+              <w:spacing w:before="0" w:after="0" w:line="276" w:lineRule="auto"/>
+              <w:rPr>
+                <w:rFonts w:cs="Times New Roman"/>
+              </w:rPr>
+            </w:pPr>
+            <w:r>
+              <w:rPr>
+                <w:rFonts w:cs="Times New Roman"/>
+              </w:rPr>
+              <w:t xml:space="preserve">18. prove</w:t>
+            </w:r>
+          </w:p>
+        </w:tc>
+        <w:tc>
+          <w:tcPr>
+            <w:tcW w:w="2525" w:type="dxa"/>
+          </w:tcPr>
+          <w:p>
+            <w:pPr>
+              <w:spacing w:before="0" w:after="0" w:line="276" w:lineRule="auto"/>
+              <w:rPr>
+                <w:rFonts w:cs="Times New Roman"/>
+              </w:rPr>
+            </w:pPr>
+          </w:p>
         </w:tc>
       </w:tr>
       <w:tr>
         <w:tc>
           <w:tcPr>
-            <w:tcW w:w="2605" w:type="dxa"/>
+            <w:tcW w:w="2150" w:type="dxa"/>
           </w:tcPr>
           <w:p>
             <w:pPr>
-              <w:pStyle w:val="ListParagraph"/>
-              <w:numPr>
-                <w:ilvl w:val="0"/>
-                <w:numId w:val="11"/>
-              </w:numPr>
+              <w:spacing w:before="0" w:after="0" w:line="276" w:lineRule="auto"/>
+              <w:rPr>
+                <w:rFonts w:cs="Times New Roman"/>
+              </w:rPr>
             </w:pPr>
             <w:r>
               <w:rPr>
                 <w:rFonts w:cs="Times New Roman"/>
               </w:rPr>
-              <w:t>use</w:t>
+              <w:t xml:space="preserve">9. use</w:t>
             </w:r>
           </w:p>
         </w:tc>
         <w:tc>
           <w:tcPr>
-            <w:tcW w:w="6745" w:type="dxa"/>
+            <w:tcW w:w="2525" w:type="dxa"/>
           </w:tcPr>
-          <w:p/>
+          <w:p>
+            <w:pPr>
+              <w:spacing w:before="0" w:after="0" w:line="276" w:lineRule="auto"/>
+              <w:rPr>
+                <w:rFonts w:cs="Times New Roman"/>
+              </w:rPr>
+            </w:pPr>
+          </w:p>
+        </w:tc>
+        <w:tc>
+          <w:tcPr>
+            <w:tcW w:w="2150" w:type="dxa"/>
+          </w:tcPr>
+          <w:p>
+            <w:pPr>
+              <w:spacing w:before="0" w:after="0" w:line="276" w:lineRule="auto"/>
+              <w:rPr>
+                <w:rFonts w:cs="Times New Roman"/>
+              </w:rPr>
+            </w:pPr>
+            <w:r>
+              <w:rPr>
+                <w:rFonts w:cs="Times New Roman"/>
+              </w:rPr>
+              <w:t xml:space="preserve">19. believe</w:t>
+            </w:r>
+          </w:p>
+        </w:tc>
+        <w:tc>
+          <w:tcPr>
+            <w:tcW w:w="2525" w:type="dxa"/>
+          </w:tcPr>
+          <w:p>
+            <w:pPr>
+              <w:spacing w:before="0" w:after="0" w:line="276" w:lineRule="auto"/>
+              <w:rPr>
+                <w:rFonts w:cs="Times New Roman"/>
+              </w:rPr>
+            </w:pPr>
+          </w:p>
         </w:tc>
       </w:tr>
       <w:tr>
         <w:tc>
           <w:tcPr>
-            <w:tcW w:w="2605" w:type="dxa"/>
+            <w:tcW w:w="2150" w:type="dxa"/>
           </w:tcPr>
           <w:p>
             <w:pPr>
-              <w:pStyle w:val="ListParagraph"/>
-              <w:numPr>
-                <w:ilvl w:val="0"/>
-                <w:numId w:val="11"/>
-              </w:numPr>
+              <w:spacing w:before="0" w:after="0" w:line="276" w:lineRule="auto"/>
+              <w:rPr>
+                <w:rFonts w:cs="Times New Roman"/>
+              </w:rPr>
             </w:pPr>
             <w:r>
               <w:rPr>
                 <w:rFonts w:cs="Times New Roman"/>
               </w:rPr>
-              <w:t>develop</w:t>
+              <w:t xml:space="preserve">10. develop</w:t>
             </w:r>
           </w:p>
         </w:tc>
         <w:tc>
           <w:tcPr>
-            <w:tcW w:w="6745" w:type="dxa"/>
-          </w:tcPr>
-          <w:p/>
-        </w:tc>
-      </w:tr>
-      <w:tr>
-        <w:tc>
-          <w:tcPr>
-            <w:tcW w:w="2605" w:type="dxa"/>
+            <w:tcW w:w="2525" w:type="dxa"/>
           </w:tcPr>
           <w:p>
             <w:pPr>
-              <w:pStyle w:val="ListParagraph"/>
-              <w:numPr>
-                <w:ilvl w:val="0"/>
-                <w:numId w:val="11"/>
-              </w:numPr>
+              <w:spacing w:before="0" w:after="0" w:line="276" w:lineRule="auto"/>
+              <w:rPr>
+                <w:rFonts w:cs="Times New Roman"/>
+              </w:rPr>
+            </w:pPr>
+          </w:p>
+        </w:tc>
+        <w:tc>
+          <w:tcPr>
+            <w:tcW w:w="2150" w:type="dxa"/>
+          </w:tcPr>
+          <w:p>
+            <w:pPr>
+              <w:spacing w:before="0" w:after="0" w:line="276" w:lineRule="auto"/>
+              <w:rPr>
+                <w:rFonts w:cs="Times New Roman"/>
+              </w:rPr>
             </w:pPr>
             <w:r>
               <w:rPr>
                 <w:rFonts w:cs="Times New Roman"/>
               </w:rPr>
-              <w:t>aware</w:t>
+              <w:t xml:space="preserve">20. strong</w:t>
             </w:r>
           </w:p>
         </w:tc>
         <w:tc>
           <w:tcPr>
-            <w:tcW w:w="6745" w:type="dxa"/>
-          </w:tcPr>
-          <w:p/>
-        </w:tc>
-      </w:tr>
-      <w:tr>
-        <w:tc>
-          <w:tcPr>
-            <w:tcW w:w="2605" w:type="dxa"/>
+            <w:tcW w:w="2525" w:type="dxa"/>
           </w:tcPr>
           <w:p>
             <w:pPr>
-              <w:pStyle w:val="ListParagraph"/>
-              <w:numPr>
-                <w:ilvl w:val="0"/>
-                <w:numId w:val="11"/>
-              </w:numPr>
-            </w:pPr>
-            <w:r>
+              <w:spacing w:before="0" w:after="0" w:line="276" w:lineRule="auto"/>
               <w:rPr>
                 <w:rFonts w:cs="Times New Roman"/>
               </w:rPr>
-              <w:t>important</w:t>
-            </w:r>
+            </w:pPr>
           </w:p>
-        </w:tc>
-        <w:tc>
-          <w:tcPr>
-            <w:tcW w:w="6745" w:type="dxa"/>
-          </w:tcPr>
-          <w:p/>
-        </w:tc>
-      </w:tr>
-      <w:tr>
-        <w:tc>
-          <w:tcPr>
-            <w:tcW w:w="2605" w:type="dxa"/>
-          </w:tcPr>
-          <w:p>
-            <w:pPr>
-              <w:pStyle w:val="ListParagraph"/>
-              <w:numPr>
-                <w:ilvl w:val="0"/>
-                <w:numId w:val="11"/>
-              </w:numPr>
-            </w:pPr>
-            <w:proofErr w:type="gramStart"/>
-            <w:r>
-              <w:rPr>
-                <w:rFonts w:cs="Times New Roman"/>
-              </w:rPr>
-              <w:t>rely</w:t>
-            </w:r>
-            <w:proofErr w:type="gramEnd"/>
-          </w:p>
-        </w:tc>
-        <w:tc>
-          <w:tcPr>
-            <w:tcW w:w="6745" w:type="dxa"/>
-          </w:tcPr>
-          <w:p/>
-        </w:tc>
-      </w:tr>
-      <w:tr>
-        <w:tc>
-          <w:tcPr>
-            <w:tcW w:w="2605" w:type="dxa"/>
-          </w:tcPr>
-          <w:p>
-            <w:pPr>
-              <w:pStyle w:val="ListParagraph"/>
-              <w:numPr>
-                <w:ilvl w:val="0"/>
-                <w:numId w:val="11"/>
-              </w:numPr>
-            </w:pPr>
-            <w:r>
-              <w:rPr>
-                <w:rFonts w:cs="Times New Roman"/>
-              </w:rPr>
-              <w:t>responsible</w:t>
-            </w:r>
-          </w:p>
-        </w:tc>
-        <w:tc>
-          <w:tcPr>
-            <w:tcW w:w="6745" w:type="dxa"/>
-          </w:tcPr>
-          <w:p/>
-        </w:tc>
-      </w:tr>
-      <w:tr>
-        <w:tc>
-          <w:tcPr>
-            <w:tcW w:w="2605" w:type="dxa"/>
-          </w:tcPr>
-          <w:p>
-            <w:pPr>
-              <w:pStyle w:val="ListParagraph"/>
-              <w:numPr>
-                <w:ilvl w:val="0"/>
-                <w:numId w:val="11"/>
-              </w:numPr>
-            </w:pPr>
-            <w:r>
-              <w:rPr>
-                <w:rFonts w:cs="Times New Roman"/>
-              </w:rPr>
-              <w:t>choose</w:t>
-            </w:r>
-          </w:p>
-        </w:tc>
-        <w:tc>
-          <w:tcPr>
-            <w:tcW w:w="6745" w:type="dxa"/>
-          </w:tcPr>
-          <w:p/>
-        </w:tc>
-      </w:tr>
-      <w:tr>
-        <w:tc>
-          <w:tcPr>
-            <w:tcW w:w="2605" w:type="dxa"/>
-          </w:tcPr>
-          <w:p>
-            <w:pPr>
-              <w:pStyle w:val="ListParagraph"/>
-              <w:numPr>
-                <w:ilvl w:val="0"/>
-                <w:numId w:val="11"/>
-              </w:numPr>
-            </w:pPr>
-            <w:r>
-              <w:rPr>
-                <w:rFonts w:cs="Times New Roman"/>
-              </w:rPr>
-              <w:t>know</w:t>
-            </w:r>
-          </w:p>
-        </w:tc>
-        <w:tc>
-          <w:tcPr>
-            <w:tcW w:w="6745" w:type="dxa"/>
-          </w:tcPr>
-          <w:p/>
-        </w:tc>
-      </w:tr>
-      <w:tr>
-        <w:tc>
-          <w:tcPr>
-            <w:tcW w:w="2605" w:type="dxa"/>
-          </w:tcPr>
-          <w:p>
-            <w:pPr>
-              <w:pStyle w:val="ListParagraph"/>
-              <w:numPr>
-                <w:ilvl w:val="0"/>
-                <w:numId w:val="11"/>
-              </w:numPr>
-            </w:pPr>
-            <w:r>
-              <w:rPr>
-                <w:rFonts w:cs="Times New Roman"/>
-              </w:rPr>
-              <w:t>lose</w:t>
-            </w:r>
-          </w:p>
-        </w:tc>
-        <w:tc>
-          <w:tcPr>
-            <w:tcW w:w="6745" w:type="dxa"/>
-          </w:tcPr>
-          <w:p/>
-        </w:tc>
-      </w:tr>
-      <w:tr>
-        <w:tc>
-          <w:tcPr>
-            <w:tcW w:w="2605" w:type="dxa"/>
-          </w:tcPr>
-          <w:p>
-            <w:pPr>
-              <w:pStyle w:val="ListParagraph"/>
-              <w:numPr>
-                <w:ilvl w:val="0"/>
-                <w:numId w:val="11"/>
-              </w:numPr>
-            </w:pPr>
-            <w:r>
-              <w:rPr>
-                <w:rFonts w:cs="Times New Roman"/>
-              </w:rPr>
-              <w:t>prove</w:t>
-            </w:r>
-          </w:p>
-        </w:tc>
-        <w:tc>
-          <w:tcPr>
-            <w:tcW w:w="6745" w:type="dxa"/>
-          </w:tcPr>
-          <w:p/>
-        </w:tc>
-      </w:tr>
-      <w:tr>
-        <w:tc>
-          <w:tcPr>
-            <w:tcW w:w="2605" w:type="dxa"/>
-          </w:tcPr>
-          <w:p>
-            <w:pPr>
-              <w:pStyle w:val="ListParagraph"/>
-              <w:numPr>
-                <w:ilvl w:val="0"/>
-                <w:numId w:val="11"/>
-              </w:numPr>
-            </w:pPr>
-            <w:r>
-              <w:rPr>
-                <w:rFonts w:cs="Times New Roman"/>
-              </w:rPr>
-              <w:t>believe</w:t>
-            </w:r>
-          </w:p>
-        </w:tc>
-        <w:tc>
-          <w:tcPr>
-            <w:tcW w:w="6745" w:type="dxa"/>
-          </w:tcPr>
-          <w:p/>
-        </w:tc>
-      </w:tr>
-      <w:tr>
-        <w:tc>
-          <w:tcPr>
-            <w:tcW w:w="2605" w:type="dxa"/>
-          </w:tcPr>
-          <w:p>
-            <w:pPr>
-              <w:pStyle w:val="ListParagraph"/>
-              <w:numPr>
-                <w:ilvl w:val="0"/>
-                <w:numId w:val="11"/>
-              </w:numPr>
-            </w:pPr>
-            <w:r>
-              <w:rPr>
-                <w:rFonts w:cs="Times New Roman"/>
-              </w:rPr>
-              <w:t>strong</w:t>
-            </w:r>
-          </w:p>
-        </w:tc>
-        <w:tc>
-          <w:tcPr>
-            <w:tcW w:w="6745" w:type="dxa"/>
-          </w:tcPr>
-          <w:p/>
         </w:tc>
       </w:tr>
     </w:tbl>
@@ -2641,7 +2798,7 @@
           <w:bCs/>
           <w:u w:val="single"/>
         </w:rPr>
-        <w:t>one noun on page 2</w:t>
+        <w:t>one noun from Part 2</w:t>
       </w:r>
       <w:r>
         <w:rPr>

</xml_diff>